<commit_message>
Established Sprint 2 Objective
</commit_message>
<xml_diff>
--- a/Product_Backlog_and_Sprints.docx
+++ b/Product_Backlog_and_Sprints.docx
@@ -1385,6 +1385,286 @@
           </w:p>
         </w:tc>
       </w:tr>
+      <w:tr>
+        <w:trPr>
+          <w:trHeight w:val="288"/>
+        </w:trPr>
+        <w:tc>
+          <w:tcPr>
+            <w:tcW w:w="1020" w:type="dxa"/>
+            <w:shd w:val="clear" w:color="auto" w:fill="FFFF00"/>
+          </w:tcPr>
+          <w:p>
+            <w:r>
+              <w:t>P5-8</w:t>
+            </w:r>
+          </w:p>
+        </w:tc>
+        <w:tc>
+          <w:tcPr>
+            <w:tcW w:w="2125" w:type="dxa"/>
+            <w:shd w:val="clear" w:color="auto" w:fill="FFFF00"/>
+          </w:tcPr>
+          <w:p>
+            <w:r>
+              <w:t>Tangible Needs</w:t>
+            </w:r>
+          </w:p>
+        </w:tc>
+        <w:tc>
+          <w:tcPr>
+            <w:tcW w:w="6015" w:type="dxa"/>
+            <w:shd w:val="clear" w:color="auto" w:fill="FFFF00"/>
+          </w:tcPr>
+          <w:p>
+            <w:r>
+              <w:t xml:space="preserve">If guests leave without selecting required meals. Next login directs straight to meal selection. </w:t>
+            </w:r>
+          </w:p>
+        </w:tc>
+      </w:tr>
+    </w:tbl>
+    <w:p>
+      <w:r>
+        <w:rPr>
+          <w:highlight w:val="yellow"/>
+        </w:rPr>
+        <w:t>Added: 10/23/2026</w:t>
+      </w:r>
+    </w:p>
+    <w:tbl>
+      <w:tblPr>
+        <w:tblStyle w:val="TableGrid"/>
+        <w:tblW w:w="0" w:type="auto"/>
+        <w:tblLook w:val="04A0" w:firstRow="1" w:lastRow="0" w:firstColumn="1" w:lastColumn="0" w:noHBand="0" w:noVBand="1"/>
+      </w:tblPr>
+      <w:tblGrid>
+        <w:gridCol w:w="1020"/>
+        <w:gridCol w:w="2125"/>
+        <w:gridCol w:w="6015"/>
+      </w:tblGrid>
+      <w:tr>
+        <w:trPr>
+          <w:trHeight w:val="288"/>
+        </w:trPr>
+        <w:tc>
+          <w:tcPr>
+            <w:tcW w:w="1020" w:type="dxa"/>
+          </w:tcPr>
+          <w:p>
+            <w:r>
+              <w:t>ID</w:t>
+            </w:r>
+          </w:p>
+        </w:tc>
+        <w:tc>
+          <w:tcPr>
+            <w:tcW w:w="2125" w:type="dxa"/>
+          </w:tcPr>
+          <w:p>
+            <w:r>
+              <w:t>Label</w:t>
+            </w:r>
+          </w:p>
+        </w:tc>
+        <w:tc>
+          <w:tcPr>
+            <w:tcW w:w="6015" w:type="dxa"/>
+          </w:tcPr>
+          <w:p>
+            <w:r>
+              <w:t>Info</w:t>
+            </w:r>
+          </w:p>
+        </w:tc>
+      </w:tr>
+      <w:tr>
+        <w:trPr>
+          <w:trHeight w:val="299"/>
+        </w:trPr>
+        <w:tc>
+          <w:tcPr>
+            <w:tcW w:w="1020" w:type="dxa"/>
+          </w:tcPr>
+          <w:p>
+            <w:r>
+              <w:t>P6</w:t>
+            </w:r>
+          </w:p>
+        </w:tc>
+        <w:tc>
+          <w:tcPr>
+            <w:tcW w:w="2125" w:type="dxa"/>
+          </w:tcPr>
+          <w:p>
+            <w:r>
+              <w:t>User Story</w:t>
+            </w:r>
+          </w:p>
+        </w:tc>
+        <w:tc>
+          <w:tcPr>
+            <w:tcW w:w="6015" w:type="dxa"/>
+          </w:tcPr>
+          <w:p>
+            <w:r>
+              <w:t xml:space="preserve">As a wedding guest, I want to </w:t>
+            </w:r>
+            <w:r>
+              <w:t>view my current RSVP information, so that I can verify what I previously submitted</w:t>
+            </w:r>
+            <w:r>
+              <w:t>.</w:t>
+            </w:r>
+          </w:p>
+        </w:tc>
+      </w:tr>
+      <w:tr>
+        <w:trPr>
+          <w:trHeight w:val="288"/>
+        </w:trPr>
+        <w:tc>
+          <w:tcPr>
+            <w:tcW w:w="1020" w:type="dxa"/>
+          </w:tcPr>
+          <w:p>
+            <w:r>
+              <w:t>P6-1</w:t>
+            </w:r>
+          </w:p>
+        </w:tc>
+        <w:tc>
+          <w:tcPr>
+            <w:tcW w:w="2125" w:type="dxa"/>
+          </w:tcPr>
+          <w:p>
+            <w:r>
+              <w:t xml:space="preserve">Tangible Needs </w:t>
+            </w:r>
+          </w:p>
+        </w:tc>
+        <w:tc>
+          <w:tcPr>
+            <w:tcW w:w="6015" w:type="dxa"/>
+          </w:tcPr>
+          <w:p>
+            <w:r>
+              <w:t>Create a RSVP guest list tab</w:t>
+            </w:r>
+          </w:p>
+        </w:tc>
+      </w:tr>
+      <w:tr>
+        <w:trPr>
+          <w:trHeight w:val="288"/>
+        </w:trPr>
+        <w:tc>
+          <w:tcPr>
+            <w:tcW w:w="1020" w:type="dxa"/>
+          </w:tcPr>
+          <w:p>
+            <w:r>
+              <w:t>P6-2</w:t>
+            </w:r>
+          </w:p>
+        </w:tc>
+        <w:tc>
+          <w:tcPr>
+            <w:tcW w:w="2125" w:type="dxa"/>
+          </w:tcPr>
+          <w:p>
+            <w:r>
+              <w:t xml:space="preserve">Tangible Needs </w:t>
+            </w:r>
+          </w:p>
+        </w:tc>
+        <w:tc>
+          <w:tcPr>
+            <w:tcW w:w="6015" w:type="dxa"/>
+          </w:tcPr>
+          <w:p>
+            <w:r>
+              <w:t>Display current attendance status of associated guest</w:t>
+            </w:r>
+            <w:r>
+              <w:t xml:space="preserve"> invitation</w:t>
+            </w:r>
+            <w:r>
+              <w:t xml:space="preserve"> at top of RSVP guest list tab. </w:t>
+            </w:r>
+          </w:p>
+        </w:tc>
+      </w:tr>
+      <w:tr>
+        <w:trPr>
+          <w:trHeight w:val="299"/>
+        </w:trPr>
+        <w:tc>
+          <w:tcPr>
+            <w:tcW w:w="1020" w:type="dxa"/>
+          </w:tcPr>
+          <w:p>
+            <w:r>
+              <w:t>P6-3</w:t>
+            </w:r>
+          </w:p>
+        </w:tc>
+        <w:tc>
+          <w:tcPr>
+            <w:tcW w:w="2125" w:type="dxa"/>
+          </w:tcPr>
+          <w:p>
+            <w:r>
+              <w:t xml:space="preserve">Tangible Needs </w:t>
+            </w:r>
+          </w:p>
+        </w:tc>
+        <w:tc>
+          <w:tcPr>
+            <w:tcW w:w="6015" w:type="dxa"/>
+          </w:tcPr>
+          <w:p>
+            <w:r>
+              <w:t>Display on dashboard and RSVP guest list tab to complete RSVP if no RSVP exists</w:t>
+            </w:r>
+          </w:p>
+        </w:tc>
+      </w:tr>
+      <w:tr>
+        <w:trPr>
+          <w:trHeight w:val="288"/>
+        </w:trPr>
+        <w:tc>
+          <w:tcPr>
+            <w:tcW w:w="1020" w:type="dxa"/>
+          </w:tcPr>
+          <w:p>
+            <w:r>
+              <w:t>P6-4</w:t>
+            </w:r>
+          </w:p>
+        </w:tc>
+        <w:tc>
+          <w:tcPr>
+            <w:tcW w:w="2125" w:type="dxa"/>
+          </w:tcPr>
+          <w:p>
+            <w:r>
+              <w:t xml:space="preserve">Tangible Needs </w:t>
+            </w:r>
+          </w:p>
+        </w:tc>
+        <w:tc>
+          <w:tcPr>
+            <w:tcW w:w="6015" w:type="dxa"/>
+          </w:tcPr>
+          <w:p>
+            <w:r>
+              <w:t xml:space="preserve">Display on dashboard and RSVP guest list tab options to edit or delete RSVP. </w:t>
+            </w:r>
+          </w:p>
+        </w:tc>
+      </w:tr>
     </w:tbl>
     <w:p/>
     <w:tbl>
@@ -1443,7 +1723,7 @@
           </w:tcPr>
           <w:p>
             <w:r>
-              <w:t>P6</w:t>
+              <w:t>P7</w:t>
             </w:r>
           </w:p>
         </w:tc>
@@ -1463,13 +1743,15 @@
           </w:tcPr>
           <w:p>
             <w:r>
-              <w:t xml:space="preserve">As a wedding guest, I want to </w:t>
-            </w:r>
-            <w:r>
-              <w:t>view my current RSVP information, so that I can verify what I previously submitted</w:t>
-            </w:r>
-            <w:r>
-              <w:t>.</w:t>
+              <w:t xml:space="preserve">As a wedding guest, I want to edit my RSVP so that I can update the attendance of guests associated with my </w:t>
+            </w:r>
+            <w:proofErr w:type="spellStart"/>
+            <w:r>
+              <w:t>invitaiton</w:t>
+            </w:r>
+            <w:proofErr w:type="spellEnd"/>
+            <w:r>
+              <w:t xml:space="preserve"> if plans change. </w:t>
             </w:r>
           </w:p>
         </w:tc>
@@ -1484,7 +1766,7 @@
           </w:tcPr>
           <w:p>
             <w:r>
-              <w:t>P6-1</w:t>
+              <w:t>P7-1</w:t>
             </w:r>
           </w:p>
         </w:tc>
@@ -1504,7 +1786,10 @@
           </w:tcPr>
           <w:p>
             <w:r>
-              <w:t>Create a RSVP guest list tab</w:t>
+              <w:t xml:space="preserve">Clicking </w:t>
+            </w:r>
+            <w:r>
+              <w:t>edit RSVP button loads the guest’s existing RSVP</w:t>
             </w:r>
           </w:p>
         </w:tc>
@@ -1519,7 +1804,7 @@
           </w:tcPr>
           <w:p>
             <w:r>
-              <w:t>P6-2</w:t>
+              <w:t>P7-2</w:t>
             </w:r>
           </w:p>
         </w:tc>
@@ -1539,13 +1824,7 @@
           </w:tcPr>
           <w:p>
             <w:r>
-              <w:t>Display current attendance status of associated guest</w:t>
-            </w:r>
-            <w:r>
-              <w:t xml:space="preserve"> invitation</w:t>
-            </w:r>
-            <w:r>
-              <w:t xml:space="preserve"> at top of RSVP guest list tab. </w:t>
+              <w:t>Allow attending guests to be unchecked to not attending</w:t>
             </w:r>
           </w:p>
         </w:tc>
@@ -1560,7 +1839,7 @@
           </w:tcPr>
           <w:p>
             <w:r>
-              <w:t>P6-3</w:t>
+              <w:t>P7-3</w:t>
             </w:r>
           </w:p>
         </w:tc>
@@ -1580,7 +1859,10 @@
           </w:tcPr>
           <w:p>
             <w:r>
-              <w:t>Display on dashboard and RSVP guest list tab to complete RSVP if no RSVP exists</w:t>
+              <w:t xml:space="preserve">Allow </w:t>
+            </w:r>
+            <w:r>
+              <w:t>non-attending guests to be checked to attending</w:t>
             </w:r>
           </w:p>
         </w:tc>
@@ -1595,7 +1877,8 @@
           </w:tcPr>
           <w:p>
             <w:r>
-              <w:t>P6-4</w:t>
+              <w:lastRenderedPageBreak/>
+              <w:t>P7-4</w:t>
             </w:r>
           </w:p>
         </w:tc>
@@ -1615,7 +1898,153 @@
           </w:tcPr>
           <w:p>
             <w:r>
-              <w:t xml:space="preserve">Display on dashboard and RSVP guest list tab options to edit or delete RSVP. </w:t>
+              <w:t>Remove meal selection when an attending guest changes to not attending.</w:t>
+            </w:r>
+          </w:p>
+        </w:tc>
+      </w:tr>
+      <w:tr>
+        <w:trPr>
+          <w:trHeight w:val="288"/>
+        </w:trPr>
+        <w:tc>
+          <w:tcPr>
+            <w:tcW w:w="1020" w:type="dxa"/>
+          </w:tcPr>
+          <w:p>
+            <w:r>
+              <w:t>P7-5</w:t>
+            </w:r>
+          </w:p>
+        </w:tc>
+        <w:tc>
+          <w:tcPr>
+            <w:tcW w:w="2125" w:type="dxa"/>
+          </w:tcPr>
+          <w:p>
+            <w:r>
+              <w:t xml:space="preserve">Tangible Needs </w:t>
+            </w:r>
+          </w:p>
+        </w:tc>
+        <w:tc>
+          <w:tcPr>
+            <w:tcW w:w="6015" w:type="dxa"/>
+          </w:tcPr>
+          <w:p>
+            <w:r>
+              <w:t xml:space="preserve">Require a meal selection when a guest changes from not attending to attending. </w:t>
+            </w:r>
+          </w:p>
+        </w:tc>
+      </w:tr>
+      <w:tr>
+        <w:trPr>
+          <w:trHeight w:val="288"/>
+        </w:trPr>
+        <w:tc>
+          <w:tcPr>
+            <w:tcW w:w="1020" w:type="dxa"/>
+          </w:tcPr>
+          <w:p>
+            <w:r>
+              <w:t>P7-6</w:t>
+            </w:r>
+          </w:p>
+        </w:tc>
+        <w:tc>
+          <w:tcPr>
+            <w:tcW w:w="2125" w:type="dxa"/>
+          </w:tcPr>
+          <w:p>
+            <w:r>
+              <w:t>Tangible Needs</w:t>
+            </w:r>
+          </w:p>
+        </w:tc>
+        <w:tc>
+          <w:tcPr>
+            <w:tcW w:w="6015" w:type="dxa"/>
+          </w:tcPr>
+          <w:p>
+            <w:r>
+              <w:t>If no one is attending selected, remove all active meal selections.</w:t>
+            </w:r>
+          </w:p>
+        </w:tc>
+      </w:tr>
+      <w:tr>
+        <w:trPr>
+          <w:trHeight w:val="288"/>
+        </w:trPr>
+        <w:tc>
+          <w:tcPr>
+            <w:tcW w:w="1020" w:type="dxa"/>
+          </w:tcPr>
+          <w:p>
+            <w:r>
+              <w:t>P7-7</w:t>
+            </w:r>
+          </w:p>
+        </w:tc>
+        <w:tc>
+          <w:tcPr>
+            <w:tcW w:w="2125" w:type="dxa"/>
+          </w:tcPr>
+          <w:p>
+            <w:r>
+              <w:t>Tangible Needs</w:t>
+            </w:r>
+          </w:p>
+        </w:tc>
+        <w:tc>
+          <w:tcPr>
+            <w:tcW w:w="6015" w:type="dxa"/>
+          </w:tcPr>
+          <w:p>
+            <w:r>
+              <w:t>Save the updated RSVP and erase meals</w:t>
+            </w:r>
+            <w:r>
+              <w:t xml:space="preserve"> only after submission. </w:t>
+            </w:r>
+          </w:p>
+        </w:tc>
+      </w:tr>
+      <w:tr>
+        <w:trPr>
+          <w:trHeight w:val="288"/>
+        </w:trPr>
+        <w:tc>
+          <w:tcPr>
+            <w:tcW w:w="1020" w:type="dxa"/>
+          </w:tcPr>
+          <w:p>
+            <w:r>
+              <w:t>P7-8</w:t>
+            </w:r>
+          </w:p>
+        </w:tc>
+        <w:tc>
+          <w:tcPr>
+            <w:tcW w:w="2125" w:type="dxa"/>
+          </w:tcPr>
+          <w:p>
+            <w:r>
+              <w:t>Tangible Needs</w:t>
+            </w:r>
+          </w:p>
+        </w:tc>
+        <w:tc>
+          <w:tcPr>
+            <w:tcW w:w="6015" w:type="dxa"/>
+          </w:tcPr>
+          <w:p>
+            <w:r>
+              <w:t xml:space="preserve">Display confirmation </w:t>
+            </w:r>
+            <w:r>
+              <w:t>that RSVP was updated.</w:t>
             </w:r>
           </w:p>
         </w:tc>
@@ -1678,7 +2107,7 @@
           </w:tcPr>
           <w:p>
             <w:r>
-              <w:t>P7</w:t>
+              <w:t>P8</w:t>
             </w:r>
           </w:p>
         </w:tc>
@@ -1698,15 +2127,13 @@
           </w:tcPr>
           <w:p>
             <w:r>
-              <w:t xml:space="preserve">As a wedding guest, I want to edit my RSVP so that I can update the attendance of guests associated with my </w:t>
-            </w:r>
-            <w:proofErr w:type="spellStart"/>
-            <w:r>
-              <w:t>invitaiton</w:t>
-            </w:r>
-            <w:proofErr w:type="spellEnd"/>
-            <w:r>
-              <w:t xml:space="preserve"> if plans change. </w:t>
+              <w:t xml:space="preserve">As a wedding guest, I want to edit my meal so that I can update the meal selection of guests associated with my </w:t>
+            </w:r>
+            <w:r>
+              <w:t>Invitation</w:t>
+            </w:r>
+            <w:r>
+              <w:t xml:space="preserve">. </w:t>
             </w:r>
           </w:p>
         </w:tc>
@@ -1721,7 +2148,7 @@
           </w:tcPr>
           <w:p>
             <w:r>
-              <w:t>P7-1</w:t>
+              <w:t>P8-1</w:t>
             </w:r>
           </w:p>
         </w:tc>
@@ -1741,10 +2168,7 @@
           </w:tcPr>
           <w:p>
             <w:r>
-              <w:t xml:space="preserve">Clicking </w:t>
-            </w:r>
-            <w:r>
-              <w:t>edit RSVP button loads the guest’s existing RSVP</w:t>
+              <w:t>Clicking edit Meal button loads the guest’s existing Meal selection</w:t>
             </w:r>
           </w:p>
         </w:tc>
@@ -1759,7 +2183,7 @@
           </w:tcPr>
           <w:p>
             <w:r>
-              <w:t>P7-2</w:t>
+              <w:t>P8-2</w:t>
             </w:r>
           </w:p>
         </w:tc>
@@ -1779,7 +2203,7 @@
           </w:tcPr>
           <w:p>
             <w:r>
-              <w:t>Allow attending guests to be unchecked to not attending</w:t>
+              <w:t>Allow meal selections to be changed for attending guests</w:t>
             </w:r>
           </w:p>
         </w:tc>
@@ -1794,7 +2218,7 @@
           </w:tcPr>
           <w:p>
             <w:r>
-              <w:t>P7-3</w:t>
+              <w:t>P8-3</w:t>
             </w:r>
           </w:p>
         </w:tc>
@@ -1814,10 +2238,7 @@
           </w:tcPr>
           <w:p>
             <w:r>
-              <w:t xml:space="preserve">Allow </w:t>
-            </w:r>
-            <w:r>
-              <w:t>non-attending guests to be checked to attending</w:t>
+              <w:t xml:space="preserve">Save updated meal selections on submission. </w:t>
             </w:r>
           </w:p>
         </w:tc>
@@ -1832,7 +2253,7 @@
           </w:tcPr>
           <w:p>
             <w:r>
-              <w:t>P7-4</w:t>
+              <w:t>P8-4</w:t>
             </w:r>
           </w:p>
         </w:tc>
@@ -1852,154 +2273,7 @@
           </w:tcPr>
           <w:p>
             <w:r>
-              <w:t>Remove meal selection when an attending guest changes to not attending.</w:t>
-            </w:r>
-          </w:p>
-        </w:tc>
-      </w:tr>
-      <w:tr>
-        <w:trPr>
-          <w:trHeight w:val="288"/>
-        </w:trPr>
-        <w:tc>
-          <w:tcPr>
-            <w:tcW w:w="1020" w:type="dxa"/>
-          </w:tcPr>
-          <w:p>
-            <w:r>
-              <w:lastRenderedPageBreak/>
-              <w:t>P7-5</w:t>
-            </w:r>
-          </w:p>
-        </w:tc>
-        <w:tc>
-          <w:tcPr>
-            <w:tcW w:w="2125" w:type="dxa"/>
-          </w:tcPr>
-          <w:p>
-            <w:r>
-              <w:t xml:space="preserve">Tangible Needs </w:t>
-            </w:r>
-          </w:p>
-        </w:tc>
-        <w:tc>
-          <w:tcPr>
-            <w:tcW w:w="6015" w:type="dxa"/>
-          </w:tcPr>
-          <w:p>
-            <w:r>
-              <w:t xml:space="preserve">Require a meal selection when a guest changes from not attending to attending. </w:t>
-            </w:r>
-          </w:p>
-        </w:tc>
-      </w:tr>
-      <w:tr>
-        <w:trPr>
-          <w:trHeight w:val="288"/>
-        </w:trPr>
-        <w:tc>
-          <w:tcPr>
-            <w:tcW w:w="1020" w:type="dxa"/>
-          </w:tcPr>
-          <w:p>
-            <w:r>
-              <w:t>P7-6</w:t>
-            </w:r>
-          </w:p>
-        </w:tc>
-        <w:tc>
-          <w:tcPr>
-            <w:tcW w:w="2125" w:type="dxa"/>
-          </w:tcPr>
-          <w:p>
-            <w:r>
-              <w:t>Tangible Needs</w:t>
-            </w:r>
-          </w:p>
-        </w:tc>
-        <w:tc>
-          <w:tcPr>
-            <w:tcW w:w="6015" w:type="dxa"/>
-          </w:tcPr>
-          <w:p>
-            <w:r>
-              <w:t>If no one is attending selected, remove all active meal selections.</w:t>
-            </w:r>
-          </w:p>
-        </w:tc>
-      </w:tr>
-      <w:tr>
-        <w:trPr>
-          <w:trHeight w:val="288"/>
-        </w:trPr>
-        <w:tc>
-          <w:tcPr>
-            <w:tcW w:w="1020" w:type="dxa"/>
-          </w:tcPr>
-          <w:p>
-            <w:r>
-              <w:t>P7-7</w:t>
-            </w:r>
-          </w:p>
-        </w:tc>
-        <w:tc>
-          <w:tcPr>
-            <w:tcW w:w="2125" w:type="dxa"/>
-          </w:tcPr>
-          <w:p>
-            <w:r>
-              <w:t>Tangible Needs</w:t>
-            </w:r>
-          </w:p>
-        </w:tc>
-        <w:tc>
-          <w:tcPr>
-            <w:tcW w:w="6015" w:type="dxa"/>
-          </w:tcPr>
-          <w:p>
-            <w:r>
-              <w:t>Save the updated RSVP and erase meals</w:t>
-            </w:r>
-            <w:r>
-              <w:t xml:space="preserve"> only after submission. </w:t>
-            </w:r>
-          </w:p>
-        </w:tc>
-      </w:tr>
-      <w:tr>
-        <w:trPr>
-          <w:trHeight w:val="288"/>
-        </w:trPr>
-        <w:tc>
-          <w:tcPr>
-            <w:tcW w:w="1020" w:type="dxa"/>
-          </w:tcPr>
-          <w:p>
-            <w:r>
-              <w:t>P7-8</w:t>
-            </w:r>
-          </w:p>
-        </w:tc>
-        <w:tc>
-          <w:tcPr>
-            <w:tcW w:w="2125" w:type="dxa"/>
-          </w:tcPr>
-          <w:p>
-            <w:r>
-              <w:t>Tangible Needs</w:t>
-            </w:r>
-          </w:p>
-        </w:tc>
-        <w:tc>
-          <w:tcPr>
-            <w:tcW w:w="6015" w:type="dxa"/>
-          </w:tcPr>
-          <w:p>
-            <w:r>
-              <w:t xml:space="preserve">Display confirmation </w:t>
-            </w:r>
-            <w:r>
-              <w:t>that RSVP was updated.</w:t>
+              <w:t>Display confirmation that meals selection was updated.</w:t>
             </w:r>
           </w:p>
         </w:tc>
@@ -2062,7 +2336,7 @@
           </w:tcPr>
           <w:p>
             <w:r>
-              <w:t>P8</w:t>
+              <w:t>P9</w:t>
             </w:r>
           </w:p>
         </w:tc>
@@ -2082,13 +2356,7 @@
           </w:tcPr>
           <w:p>
             <w:r>
-              <w:t xml:space="preserve">As a wedding guest, I want to edit my meal so that I can update the meal selection of guests associated with my </w:t>
-            </w:r>
-            <w:r>
-              <w:t>Invitation</w:t>
-            </w:r>
-            <w:r>
-              <w:t xml:space="preserve">. </w:t>
+              <w:t>As a wedding guest, I want to delete my RSVP, so that I can remove my current response and submit a new one later.</w:t>
             </w:r>
           </w:p>
         </w:tc>
@@ -2103,7 +2371,7 @@
           </w:tcPr>
           <w:p>
             <w:r>
-              <w:t>P8-1</w:t>
+              <w:t>P9-1</w:t>
             </w:r>
           </w:p>
         </w:tc>
@@ -2123,7 +2391,7 @@
           </w:tcPr>
           <w:p>
             <w:r>
-              <w:t>Clicking edit Meal button loads the guest’s existing Meal selection</w:t>
+              <w:t xml:space="preserve">When Delete RSVP button is clicked, ask guest to confirm before deleting the RSVP </w:t>
             </w:r>
           </w:p>
         </w:tc>
@@ -2138,7 +2406,7 @@
           </w:tcPr>
           <w:p>
             <w:r>
-              <w:t>P8-2</w:t>
+              <w:t>P9-2</w:t>
             </w:r>
           </w:p>
         </w:tc>
@@ -2158,7 +2426,7 @@
           </w:tcPr>
           <w:p>
             <w:r>
-              <w:t>Allow meal selections to be changed for attending guests</w:t>
+              <w:t>Delete all attendance data for the invitation</w:t>
             </w:r>
           </w:p>
         </w:tc>
@@ -2173,7 +2441,7 @@
           </w:tcPr>
           <w:p>
             <w:r>
-              <w:t>P8-3</w:t>
+              <w:t>P9-3</w:t>
             </w:r>
           </w:p>
         </w:tc>
@@ -2193,7 +2461,10 @@
           </w:tcPr>
           <w:p>
             <w:r>
-              <w:t xml:space="preserve">Save updated meal selections on submission. </w:t>
+              <w:t xml:space="preserve">Delete associated meal selections </w:t>
+            </w:r>
+            <w:r>
+              <w:t>data.</w:t>
             </w:r>
           </w:p>
         </w:tc>
@@ -2208,7 +2479,7 @@
           </w:tcPr>
           <w:p>
             <w:r>
-              <w:t>P8-4</w:t>
+              <w:t>P9-4</w:t>
             </w:r>
           </w:p>
         </w:tc>
@@ -2228,7 +2499,42 @@
           </w:tcPr>
           <w:p>
             <w:r>
-              <w:t>Display confirmation that meals selection was updated.</w:t>
+              <w:t xml:space="preserve">Return to dashboard to the “Complete RSVP” prompt after delete. </w:t>
+            </w:r>
+          </w:p>
+        </w:tc>
+      </w:tr>
+      <w:tr>
+        <w:trPr>
+          <w:trHeight w:val="288"/>
+        </w:trPr>
+        <w:tc>
+          <w:tcPr>
+            <w:tcW w:w="1020" w:type="dxa"/>
+          </w:tcPr>
+          <w:p>
+            <w:r>
+              <w:t>P9-5</w:t>
+            </w:r>
+          </w:p>
+        </w:tc>
+        <w:tc>
+          <w:tcPr>
+            <w:tcW w:w="2125" w:type="dxa"/>
+          </w:tcPr>
+          <w:p>
+            <w:r>
+              <w:t xml:space="preserve">Tangible Needs </w:t>
+            </w:r>
+          </w:p>
+        </w:tc>
+        <w:tc>
+          <w:tcPr>
+            <w:tcW w:w="6015" w:type="dxa"/>
+          </w:tcPr>
+          <w:p>
+            <w:r>
+              <w:t xml:space="preserve">Display confirmation that all information was deleted. </w:t>
             </w:r>
           </w:p>
         </w:tc>
@@ -2291,7 +2597,7 @@
           </w:tcPr>
           <w:p>
             <w:r>
-              <w:t>P9</w:t>
+              <w:t>P10</w:t>
             </w:r>
           </w:p>
         </w:tc>
@@ -2311,7 +2617,10 @@
           </w:tcPr>
           <w:p>
             <w:r>
-              <w:t>As a wedding guest, I want to delete my RSVP, so that I can remove my current response and submit a new one later.</w:t>
+              <w:t xml:space="preserve">As a wedding guest, I want to view the RSVP list, so that I can </w:t>
+            </w:r>
+            <w:r>
+              <w:t>see the attendance status of all invited guests.</w:t>
             </w:r>
           </w:p>
         </w:tc>
@@ -2326,7 +2635,13 @@
           </w:tcPr>
           <w:p>
             <w:r>
-              <w:t>P9-1</w:t>
+              <w:t>P</w:t>
+            </w:r>
+            <w:r>
+              <w:t>10</w:t>
+            </w:r>
+            <w:r>
+              <w:t>-1</w:t>
             </w:r>
           </w:p>
         </w:tc>
@@ -2346,7 +2661,7 @@
           </w:tcPr>
           <w:p>
             <w:r>
-              <w:t xml:space="preserve">When Delete RSVP button is clicked, ask guest to confirm before deleting the RSVP </w:t>
+              <w:t>Create an RSVP list tab</w:t>
             </w:r>
           </w:p>
         </w:tc>
@@ -2361,7 +2676,13 @@
           </w:tcPr>
           <w:p>
             <w:r>
-              <w:t>P9-2</w:t>
+              <w:t>P</w:t>
+            </w:r>
+            <w:r>
+              <w:t>10</w:t>
+            </w:r>
+            <w:r>
+              <w:t>-2</w:t>
             </w:r>
           </w:p>
         </w:tc>
@@ -2381,7 +2702,7 @@
           </w:tcPr>
           <w:p>
             <w:r>
-              <w:t>Delete all attendance data for the invitation</w:t>
+              <w:t>Display all invited guests in the RSVP list</w:t>
             </w:r>
           </w:p>
         </w:tc>
@@ -2396,7 +2717,10 @@
           </w:tcPr>
           <w:p>
             <w:r>
-              <w:t>P9-3</w:t>
+              <w:t>P10</w:t>
+            </w:r>
+            <w:r>
+              <w:t>-3</w:t>
             </w:r>
           </w:p>
         </w:tc>
@@ -2416,10 +2740,7 @@
           </w:tcPr>
           <w:p>
             <w:r>
-              <w:t xml:space="preserve">Delete associated meal selections </w:t>
-            </w:r>
-            <w:r>
-              <w:t>data.</w:t>
+              <w:t>Display each guest’s current RSVP status</w:t>
             </w:r>
           </w:p>
         </w:tc>
@@ -2434,7 +2755,13 @@
           </w:tcPr>
           <w:p>
             <w:r>
-              <w:t>P9-4</w:t>
+              <w:t>P</w:t>
+            </w:r>
+            <w:r>
+              <w:t>10</w:t>
+            </w:r>
+            <w:r>
+              <w:t>-4</w:t>
             </w:r>
           </w:p>
         </w:tc>
@@ -2454,7 +2781,13 @@
           </w:tcPr>
           <w:p>
             <w:r>
-              <w:t xml:space="preserve">Return to dashboard to the “Complete RSVP” prompt after delete. </w:t>
+              <w:t>Clearly Identify guest who are attending,</w:t>
+            </w:r>
+            <w:r>
+              <w:t xml:space="preserve"> </w:t>
+            </w:r>
+            <w:r>
+              <w:t>not attending, and not responded.</w:t>
             </w:r>
           </w:p>
         </w:tc>
@@ -2469,7 +2802,14 @@
           </w:tcPr>
           <w:p>
             <w:r>
-              <w:t>P9-5</w:t>
+              <w:lastRenderedPageBreak/>
+              <w:t>P</w:t>
+            </w:r>
+            <w:r>
+              <w:t>10</w:t>
+            </w:r>
+            <w:r>
+              <w:t>-5</w:t>
             </w:r>
           </w:p>
         </w:tc>
@@ -2489,24 +2829,11 @@
           </w:tcPr>
           <w:p>
             <w:r>
-              <w:t xml:space="preserve">Display confirmation that all information was deleted. </w:t>
-            </w:r>
-          </w:p>
-        </w:tc>
-      </w:tr>
-    </w:tbl>
-    <w:p/>
-    <w:tbl>
-      <w:tblPr>
-        <w:tblStyle w:val="TableGrid"/>
-        <w:tblW w:w="0" w:type="auto"/>
-        <w:tblLook w:val="04A0" w:firstRow="1" w:lastRow="0" w:firstColumn="1" w:lastColumn="0" w:noHBand="0" w:noVBand="1"/>
-      </w:tblPr>
-      <w:tblGrid>
-        <w:gridCol w:w="1020"/>
-        <w:gridCol w:w="2125"/>
-        <w:gridCol w:w="6015"/>
-      </w:tblGrid>
+              <w:t xml:space="preserve">Update the RSVP list when RSVP information changes. </w:t>
+            </w:r>
+          </w:p>
+        </w:tc>
+      </w:tr>
       <w:tr>
         <w:trPr>
           <w:trHeight w:val="288"/>
@@ -2517,288 +2844,6 @@
           </w:tcPr>
           <w:p>
             <w:r>
-              <w:t>ID</w:t>
-            </w:r>
-          </w:p>
-        </w:tc>
-        <w:tc>
-          <w:tcPr>
-            <w:tcW w:w="2125" w:type="dxa"/>
-          </w:tcPr>
-          <w:p>
-            <w:r>
-              <w:t>Label</w:t>
-            </w:r>
-          </w:p>
-        </w:tc>
-        <w:tc>
-          <w:tcPr>
-            <w:tcW w:w="6015" w:type="dxa"/>
-          </w:tcPr>
-          <w:p>
-            <w:r>
-              <w:t>Info</w:t>
-            </w:r>
-          </w:p>
-        </w:tc>
-      </w:tr>
-      <w:tr>
-        <w:trPr>
-          <w:trHeight w:val="299"/>
-        </w:trPr>
-        <w:tc>
-          <w:tcPr>
-            <w:tcW w:w="1020" w:type="dxa"/>
-          </w:tcPr>
-          <w:p>
-            <w:r>
-              <w:t>P10</w:t>
-            </w:r>
-          </w:p>
-        </w:tc>
-        <w:tc>
-          <w:tcPr>
-            <w:tcW w:w="2125" w:type="dxa"/>
-          </w:tcPr>
-          <w:p>
-            <w:r>
-              <w:t>User Story</w:t>
-            </w:r>
-          </w:p>
-        </w:tc>
-        <w:tc>
-          <w:tcPr>
-            <w:tcW w:w="6015" w:type="dxa"/>
-          </w:tcPr>
-          <w:p>
-            <w:r>
-              <w:t xml:space="preserve">As a wedding guest, I want to view the RSVP list, so that I can </w:t>
-            </w:r>
-            <w:r>
-              <w:t>see the attendance status of all invited guests.</w:t>
-            </w:r>
-          </w:p>
-        </w:tc>
-      </w:tr>
-      <w:tr>
-        <w:trPr>
-          <w:trHeight w:val="288"/>
-        </w:trPr>
-        <w:tc>
-          <w:tcPr>
-            <w:tcW w:w="1020" w:type="dxa"/>
-          </w:tcPr>
-          <w:p>
-            <w:r>
-              <w:t>P</w:t>
-            </w:r>
-            <w:r>
-              <w:t>10</w:t>
-            </w:r>
-            <w:r>
-              <w:t>-1</w:t>
-            </w:r>
-          </w:p>
-        </w:tc>
-        <w:tc>
-          <w:tcPr>
-            <w:tcW w:w="2125" w:type="dxa"/>
-          </w:tcPr>
-          <w:p>
-            <w:r>
-              <w:t xml:space="preserve">Tangible Needs </w:t>
-            </w:r>
-          </w:p>
-        </w:tc>
-        <w:tc>
-          <w:tcPr>
-            <w:tcW w:w="6015" w:type="dxa"/>
-          </w:tcPr>
-          <w:p>
-            <w:r>
-              <w:t>Create an RSVP list tab</w:t>
-            </w:r>
-          </w:p>
-        </w:tc>
-      </w:tr>
-      <w:tr>
-        <w:trPr>
-          <w:trHeight w:val="288"/>
-        </w:trPr>
-        <w:tc>
-          <w:tcPr>
-            <w:tcW w:w="1020" w:type="dxa"/>
-          </w:tcPr>
-          <w:p>
-            <w:r>
-              <w:t>P</w:t>
-            </w:r>
-            <w:r>
-              <w:t>10</w:t>
-            </w:r>
-            <w:r>
-              <w:t>-2</w:t>
-            </w:r>
-          </w:p>
-        </w:tc>
-        <w:tc>
-          <w:tcPr>
-            <w:tcW w:w="2125" w:type="dxa"/>
-          </w:tcPr>
-          <w:p>
-            <w:r>
-              <w:t xml:space="preserve">Tangible Needs </w:t>
-            </w:r>
-          </w:p>
-        </w:tc>
-        <w:tc>
-          <w:tcPr>
-            <w:tcW w:w="6015" w:type="dxa"/>
-          </w:tcPr>
-          <w:p>
-            <w:r>
-              <w:t>Display all invited guests in the RSVP list</w:t>
-            </w:r>
-          </w:p>
-        </w:tc>
-      </w:tr>
-      <w:tr>
-        <w:trPr>
-          <w:trHeight w:val="299"/>
-        </w:trPr>
-        <w:tc>
-          <w:tcPr>
-            <w:tcW w:w="1020" w:type="dxa"/>
-          </w:tcPr>
-          <w:p>
-            <w:r>
-              <w:t>P10</w:t>
-            </w:r>
-            <w:r>
-              <w:t>-3</w:t>
-            </w:r>
-          </w:p>
-        </w:tc>
-        <w:tc>
-          <w:tcPr>
-            <w:tcW w:w="2125" w:type="dxa"/>
-          </w:tcPr>
-          <w:p>
-            <w:r>
-              <w:t xml:space="preserve">Tangible Needs </w:t>
-            </w:r>
-          </w:p>
-        </w:tc>
-        <w:tc>
-          <w:tcPr>
-            <w:tcW w:w="6015" w:type="dxa"/>
-          </w:tcPr>
-          <w:p>
-            <w:r>
-              <w:t>Display each guest’s current RSVP status</w:t>
-            </w:r>
-          </w:p>
-        </w:tc>
-      </w:tr>
-      <w:tr>
-        <w:trPr>
-          <w:trHeight w:val="288"/>
-        </w:trPr>
-        <w:tc>
-          <w:tcPr>
-            <w:tcW w:w="1020" w:type="dxa"/>
-          </w:tcPr>
-          <w:p>
-            <w:r>
-              <w:t>P</w:t>
-            </w:r>
-            <w:r>
-              <w:t>10</w:t>
-            </w:r>
-            <w:r>
-              <w:t>-4</w:t>
-            </w:r>
-          </w:p>
-        </w:tc>
-        <w:tc>
-          <w:tcPr>
-            <w:tcW w:w="2125" w:type="dxa"/>
-          </w:tcPr>
-          <w:p>
-            <w:r>
-              <w:t xml:space="preserve">Tangible Needs </w:t>
-            </w:r>
-          </w:p>
-        </w:tc>
-        <w:tc>
-          <w:tcPr>
-            <w:tcW w:w="6015" w:type="dxa"/>
-          </w:tcPr>
-          <w:p>
-            <w:r>
-              <w:t>Clearly Identify guest who are attending,</w:t>
-            </w:r>
-            <w:r>
-              <w:t xml:space="preserve"> </w:t>
-            </w:r>
-            <w:r>
-              <w:t>not attending, and not responded.</w:t>
-            </w:r>
-          </w:p>
-        </w:tc>
-      </w:tr>
-      <w:tr>
-        <w:trPr>
-          <w:trHeight w:val="288"/>
-        </w:trPr>
-        <w:tc>
-          <w:tcPr>
-            <w:tcW w:w="1020" w:type="dxa"/>
-          </w:tcPr>
-          <w:p>
-            <w:r>
-              <w:t>P</w:t>
-            </w:r>
-            <w:r>
-              <w:t>10</w:t>
-            </w:r>
-            <w:r>
-              <w:t>-5</w:t>
-            </w:r>
-          </w:p>
-        </w:tc>
-        <w:tc>
-          <w:tcPr>
-            <w:tcW w:w="2125" w:type="dxa"/>
-          </w:tcPr>
-          <w:p>
-            <w:r>
-              <w:t xml:space="preserve">Tangible Needs </w:t>
-            </w:r>
-          </w:p>
-        </w:tc>
-        <w:tc>
-          <w:tcPr>
-            <w:tcW w:w="6015" w:type="dxa"/>
-          </w:tcPr>
-          <w:p>
-            <w:r>
-              <w:t xml:space="preserve">Update the RSVP list when RSVP information changes. </w:t>
-            </w:r>
-          </w:p>
-        </w:tc>
-      </w:tr>
-      <w:tr>
-        <w:trPr>
-          <w:trHeight w:val="288"/>
-        </w:trPr>
-        <w:tc>
-          <w:tcPr>
-            <w:tcW w:w="1020" w:type="dxa"/>
-          </w:tcPr>
-          <w:p>
-            <w:r>
-              <w:lastRenderedPageBreak/>
               <w:t>P</w:t>
             </w:r>
             <w:r>
@@ -3521,7 +3566,6 @@
     <w:p/>
     <w:p>
       <w:r>
-        <w:lastRenderedPageBreak/>
         <w:t>SPRINT 1</w:t>
       </w:r>
     </w:p>
@@ -3537,7 +3581,7 @@
     </w:p>
     <w:tbl>
       <w:tblPr>
-        <w:tblStyle w:val="TableGrid"/>
+        <w:tblStyle w:val="PlainTable1"/>
         <w:tblW w:w="0" w:type="auto"/>
         <w:tblLook w:val="04A0" w:firstRow="1" w:lastRow="0" w:firstColumn="1" w:lastColumn="0" w:noHBand="0" w:noVBand="1"/>
       </w:tblPr>
@@ -3548,11 +3592,21 @@
         <w:gridCol w:w="3595"/>
       </w:tblGrid>
       <w:tr>
-        <w:tc>
-          <w:tcPr>
+        <w:trPr>
+          <w:cnfStyle w:val="100000000000" w:firstRow="1" w:lastRow="0" w:firstColumn="0" w:lastColumn="0" w:oddVBand="0" w:evenVBand="0" w:oddHBand="0" w:evenHBand="0" w:firstRowFirstColumn="0" w:firstRowLastColumn="0" w:lastRowFirstColumn="0" w:lastRowLastColumn="0"/>
+        </w:trPr>
+        <w:tc>
+          <w:tcPr>
+            <w:cnfStyle w:val="001000000000" w:firstRow="0" w:lastRow="0" w:firstColumn="1" w:lastColumn="0" w:oddVBand="0" w:evenVBand="0" w:oddHBand="0" w:evenHBand="0" w:firstRowFirstColumn="0" w:firstRowLastColumn="0" w:lastRowFirstColumn="0" w:lastRowLastColumn="0"/>
             <w:tcW w:w="895" w:type="dxa"/>
           </w:tcPr>
           <w:p>
+            <w:pPr>
+              <w:rPr>
+                <w:b w:val="0"/>
+                <w:bCs w:val="0"/>
+              </w:rPr>
+            </w:pPr>
             <w:r>
               <w:t>ID</w:t>
             </w:r>
@@ -3563,6 +3617,13 @@
             <w:tcW w:w="900" w:type="dxa"/>
           </w:tcPr>
           <w:p>
+            <w:pPr>
+              <w:cnfStyle w:val="100000000000" w:firstRow="1" w:lastRow="0" w:firstColumn="0" w:lastColumn="0" w:oddVBand="0" w:evenVBand="0" w:oddHBand="0" w:evenHBand="0" w:firstRowFirstColumn="0" w:firstRowLastColumn="0" w:lastRowFirstColumn="0" w:lastRowLastColumn="0"/>
+              <w:rPr>
+                <w:b w:val="0"/>
+                <w:bCs w:val="0"/>
+              </w:rPr>
+            </w:pPr>
             <w:r>
               <w:t>PB ID</w:t>
             </w:r>
@@ -3573,6 +3634,13 @@
             <w:tcW w:w="3960" w:type="dxa"/>
           </w:tcPr>
           <w:p>
+            <w:pPr>
+              <w:cnfStyle w:val="100000000000" w:firstRow="1" w:lastRow="0" w:firstColumn="0" w:lastColumn="0" w:oddVBand="0" w:evenVBand="0" w:oddHBand="0" w:evenHBand="0" w:firstRowFirstColumn="0" w:firstRowLastColumn="0" w:lastRowFirstColumn="0" w:lastRowLastColumn="0"/>
+              <w:rPr>
+                <w:b w:val="0"/>
+                <w:bCs w:val="0"/>
+              </w:rPr>
+            </w:pPr>
             <w:r>
               <w:t>Tangible Sprint Work</w:t>
             </w:r>
@@ -3583,6 +3651,13 @@
             <w:tcW w:w="3595" w:type="dxa"/>
           </w:tcPr>
           <w:p>
+            <w:pPr>
+              <w:cnfStyle w:val="100000000000" w:firstRow="1" w:lastRow="0" w:firstColumn="0" w:lastColumn="0" w:oddVBand="0" w:evenVBand="0" w:oddHBand="0" w:evenHBand="0" w:firstRowFirstColumn="0" w:firstRowLastColumn="0" w:lastRowFirstColumn="0" w:lastRowLastColumn="0"/>
+              <w:rPr>
+                <w:b w:val="0"/>
+                <w:bCs w:val="0"/>
+              </w:rPr>
+            </w:pPr>
             <w:r>
               <w:t>Expected Result</w:t>
             </w:r>
@@ -3590,8 +3665,12 @@
         </w:tc>
       </w:tr>
       <w:tr>
-        <w:tc>
-          <w:tcPr>
+        <w:trPr>
+          <w:cnfStyle w:val="000000100000" w:firstRow="0" w:lastRow="0" w:firstColumn="0" w:lastColumn="0" w:oddVBand="0" w:evenVBand="0" w:oddHBand="1" w:evenHBand="0" w:firstRowFirstColumn="0" w:firstRowLastColumn="0" w:lastRowFirstColumn="0" w:lastRowLastColumn="0"/>
+        </w:trPr>
+        <w:tc>
+          <w:tcPr>
+            <w:cnfStyle w:val="001000000000" w:firstRow="0" w:lastRow="0" w:firstColumn="1" w:lastColumn="0" w:oddVBand="0" w:evenVBand="0" w:oddHBand="0" w:evenHBand="0" w:firstRowFirstColumn="0" w:firstRowLastColumn="0" w:lastRowFirstColumn="0" w:lastRowLastColumn="0"/>
             <w:tcW w:w="895" w:type="dxa"/>
           </w:tcPr>
           <w:p>
@@ -3605,6 +3684,9 @@
             <w:tcW w:w="900" w:type="dxa"/>
           </w:tcPr>
           <w:p>
+            <w:pPr>
+              <w:cnfStyle w:val="000000100000" w:firstRow="0" w:lastRow="0" w:firstColumn="0" w:lastColumn="0" w:oddVBand="0" w:evenVBand="0" w:oddHBand="1" w:evenHBand="0" w:firstRowFirstColumn="0" w:firstRowLastColumn="0" w:lastRowFirstColumn="0" w:lastRowLastColumn="0"/>
+            </w:pPr>
             <w:r>
               <w:t>P1-1</w:t>
             </w:r>
@@ -3615,6 +3697,9 @@
             <w:tcW w:w="3960" w:type="dxa"/>
           </w:tcPr>
           <w:p>
+            <w:pPr>
+              <w:cnfStyle w:val="000000100000" w:firstRow="0" w:lastRow="0" w:firstColumn="0" w:lastColumn="0" w:oddVBand="0" w:evenVBand="0" w:oddHBand="1" w:evenHBand="0" w:firstRowFirstColumn="0" w:firstRowLastColumn="0" w:lastRowFirstColumn="0" w:lastRowLastColumn="0"/>
+            </w:pPr>
             <w:r>
               <w:t>Create email login input screen</w:t>
             </w:r>
@@ -3625,6 +3710,9 @@
             <w:tcW w:w="3595" w:type="dxa"/>
           </w:tcPr>
           <w:p>
+            <w:pPr>
+              <w:cnfStyle w:val="000000100000" w:firstRow="0" w:lastRow="0" w:firstColumn="0" w:lastColumn="0" w:oddVBand="0" w:evenVBand="0" w:oddHBand="1" w:evenHBand="0" w:firstRowFirstColumn="0" w:firstRowLastColumn="0" w:lastRowFirstColumn="0" w:lastRowLastColumn="0"/>
+            </w:pPr>
             <w:proofErr w:type="gramStart"/>
             <w:r>
               <w:t>Guest has</w:t>
@@ -3642,6 +3730,7 @@
       <w:tr>
         <w:tc>
           <w:tcPr>
+            <w:cnfStyle w:val="001000000000" w:firstRow="0" w:lastRow="0" w:firstColumn="1" w:lastColumn="0" w:oddVBand="0" w:evenVBand="0" w:oddHBand="0" w:evenHBand="0" w:firstRowFirstColumn="0" w:firstRowLastColumn="0" w:lastRowFirstColumn="0" w:lastRowLastColumn="0"/>
             <w:tcW w:w="895" w:type="dxa"/>
           </w:tcPr>
           <w:p>
@@ -3655,6 +3744,9 @@
             <w:tcW w:w="900" w:type="dxa"/>
           </w:tcPr>
           <w:p>
+            <w:pPr>
+              <w:cnfStyle w:val="000000000000" w:firstRow="0" w:lastRow="0" w:firstColumn="0" w:lastColumn="0" w:oddVBand="0" w:evenVBand="0" w:oddHBand="0" w:evenHBand="0" w:firstRowFirstColumn="0" w:firstRowLastColumn="0" w:lastRowFirstColumn="0" w:lastRowLastColumn="0"/>
+            </w:pPr>
             <w:r>
               <w:t>P1-2</w:t>
             </w:r>
@@ -3665,6 +3757,9 @@
             <w:tcW w:w="3960" w:type="dxa"/>
           </w:tcPr>
           <w:p>
+            <w:pPr>
+              <w:cnfStyle w:val="000000000000" w:firstRow="0" w:lastRow="0" w:firstColumn="0" w:lastColumn="0" w:oddVBand="0" w:evenVBand="0" w:oddHBand="0" w:evenHBand="0" w:firstRowFirstColumn="0" w:firstRowLastColumn="0" w:lastRowFirstColumn="0" w:lastRowLastColumn="0"/>
+            </w:pPr>
             <w:r>
               <w:t>Validate entered email</w:t>
             </w:r>
@@ -3675,6 +3770,9 @@
             <w:tcW w:w="3595" w:type="dxa"/>
           </w:tcPr>
           <w:p>
+            <w:pPr>
+              <w:cnfStyle w:val="000000000000" w:firstRow="0" w:lastRow="0" w:firstColumn="0" w:lastColumn="0" w:oddVBand="0" w:evenVBand="0" w:oddHBand="0" w:evenHBand="0" w:firstRowFirstColumn="0" w:firstRowLastColumn="0" w:lastRowFirstColumn="0" w:lastRowLastColumn="0"/>
+            </w:pPr>
             <w:r>
               <w:t>Blank or invalid input cannot proceed</w:t>
             </w:r>
@@ -3682,8 +3780,12 @@
         </w:tc>
       </w:tr>
       <w:tr>
-        <w:tc>
-          <w:tcPr>
+        <w:trPr>
+          <w:cnfStyle w:val="000000100000" w:firstRow="0" w:lastRow="0" w:firstColumn="0" w:lastColumn="0" w:oddVBand="0" w:evenVBand="0" w:oddHBand="1" w:evenHBand="0" w:firstRowFirstColumn="0" w:firstRowLastColumn="0" w:lastRowFirstColumn="0" w:lastRowLastColumn="0"/>
+        </w:trPr>
+        <w:tc>
+          <w:tcPr>
+            <w:cnfStyle w:val="001000000000" w:firstRow="0" w:lastRow="0" w:firstColumn="1" w:lastColumn="0" w:oddVBand="0" w:evenVBand="0" w:oddHBand="0" w:evenHBand="0" w:firstRowFirstColumn="0" w:firstRowLastColumn="0" w:lastRowFirstColumn="0" w:lastRowLastColumn="0"/>
             <w:tcW w:w="895" w:type="dxa"/>
           </w:tcPr>
           <w:p>
@@ -3697,6 +3799,9 @@
             <w:tcW w:w="900" w:type="dxa"/>
           </w:tcPr>
           <w:p>
+            <w:pPr>
+              <w:cnfStyle w:val="000000100000" w:firstRow="0" w:lastRow="0" w:firstColumn="0" w:lastColumn="0" w:oddVBand="0" w:evenVBand="0" w:oddHBand="1" w:evenHBand="0" w:firstRowFirstColumn="0" w:firstRowLastColumn="0" w:lastRowFirstColumn="0" w:lastRowLastColumn="0"/>
+            </w:pPr>
             <w:r>
               <w:t>P1-3</w:t>
             </w:r>
@@ -3707,6 +3812,9 @@
             <w:tcW w:w="3960" w:type="dxa"/>
           </w:tcPr>
           <w:p>
+            <w:pPr>
+              <w:cnfStyle w:val="000000100000" w:firstRow="0" w:lastRow="0" w:firstColumn="0" w:lastColumn="0" w:oddVBand="0" w:evenVBand="0" w:oddHBand="1" w:evenHBand="0" w:firstRowFirstColumn="0" w:firstRowLastColumn="0" w:lastRowFirstColumn="0" w:lastRowLastColumn="0"/>
+            </w:pPr>
             <w:r>
               <w:t xml:space="preserve">Check entered email </w:t>
             </w:r>
@@ -3720,6 +3828,9 @@
             <w:tcW w:w="3595" w:type="dxa"/>
           </w:tcPr>
           <w:p>
+            <w:pPr>
+              <w:cnfStyle w:val="000000100000" w:firstRow="0" w:lastRow="0" w:firstColumn="0" w:lastColumn="0" w:oddVBand="0" w:evenVBand="0" w:oddHBand="1" w:evenHBand="0" w:firstRowFirstColumn="0" w:firstRowLastColumn="0" w:lastRowFirstColumn="0" w:lastRowLastColumn="0"/>
+            </w:pPr>
             <w:r>
               <w:t xml:space="preserve">System </w:t>
             </w:r>
@@ -3732,6 +3843,7 @@
       <w:tr>
         <w:tc>
           <w:tcPr>
+            <w:cnfStyle w:val="001000000000" w:firstRow="0" w:lastRow="0" w:firstColumn="1" w:lastColumn="0" w:oddVBand="0" w:evenVBand="0" w:oddHBand="0" w:evenHBand="0" w:firstRowFirstColumn="0" w:firstRowLastColumn="0" w:lastRowFirstColumn="0" w:lastRowLastColumn="0"/>
             <w:tcW w:w="895" w:type="dxa"/>
           </w:tcPr>
           <w:p>
@@ -3745,6 +3857,9 @@
             <w:tcW w:w="900" w:type="dxa"/>
           </w:tcPr>
           <w:p>
+            <w:pPr>
+              <w:cnfStyle w:val="000000000000" w:firstRow="0" w:lastRow="0" w:firstColumn="0" w:lastColumn="0" w:oddVBand="0" w:evenVBand="0" w:oddHBand="0" w:evenHBand="0" w:firstRowFirstColumn="0" w:firstRowLastColumn="0" w:lastRowFirstColumn="0" w:lastRowLastColumn="0"/>
+            </w:pPr>
             <w:r>
               <w:t>P1-4</w:t>
             </w:r>
@@ -3755,6 +3870,9 @@
             <w:tcW w:w="3960" w:type="dxa"/>
           </w:tcPr>
           <w:p>
+            <w:pPr>
+              <w:cnfStyle w:val="000000000000" w:firstRow="0" w:lastRow="0" w:firstColumn="0" w:lastColumn="0" w:oddVBand="0" w:evenVBand="0" w:oddHBand="0" w:evenHBand="0" w:firstRowFirstColumn="0" w:firstRowLastColumn="0" w:lastRowFirstColumn="0" w:lastRowLastColumn="0"/>
+            </w:pPr>
             <w:r>
               <w:t>Display error</w:t>
             </w:r>
@@ -3768,6 +3886,9 @@
             <w:tcW w:w="3595" w:type="dxa"/>
           </w:tcPr>
           <w:p>
+            <w:pPr>
+              <w:cnfStyle w:val="000000000000" w:firstRow="0" w:lastRow="0" w:firstColumn="0" w:lastColumn="0" w:oddVBand="0" w:evenVBand="0" w:oddHBand="0" w:evenHBand="0" w:firstRowFirstColumn="0" w:firstRowLastColumn="0" w:lastRowFirstColumn="0" w:lastRowLastColumn="0"/>
+            </w:pPr>
             <w:r>
               <w:t xml:space="preserve">Invalid email receives </w:t>
             </w:r>
@@ -3778,8 +3899,12 @@
         </w:tc>
       </w:tr>
       <w:tr>
-        <w:tc>
-          <w:tcPr>
+        <w:trPr>
+          <w:cnfStyle w:val="000000100000" w:firstRow="0" w:lastRow="0" w:firstColumn="0" w:lastColumn="0" w:oddVBand="0" w:evenVBand="0" w:oddHBand="1" w:evenHBand="0" w:firstRowFirstColumn="0" w:firstRowLastColumn="0" w:lastRowFirstColumn="0" w:lastRowLastColumn="0"/>
+        </w:trPr>
+        <w:tc>
+          <w:tcPr>
+            <w:cnfStyle w:val="001000000000" w:firstRow="0" w:lastRow="0" w:firstColumn="1" w:lastColumn="0" w:oddVBand="0" w:evenVBand="0" w:oddHBand="0" w:evenHBand="0" w:firstRowFirstColumn="0" w:firstRowLastColumn="0" w:lastRowFirstColumn="0" w:lastRowLastColumn="0"/>
             <w:tcW w:w="895" w:type="dxa"/>
           </w:tcPr>
           <w:p>
@@ -3793,6 +3918,9 @@
             <w:tcW w:w="900" w:type="dxa"/>
           </w:tcPr>
           <w:p>
+            <w:pPr>
+              <w:cnfStyle w:val="000000100000" w:firstRow="0" w:lastRow="0" w:firstColumn="0" w:lastColumn="0" w:oddVBand="0" w:evenVBand="0" w:oddHBand="1" w:evenHBand="0" w:firstRowFirstColumn="0" w:firstRowLastColumn="0" w:lastRowFirstColumn="0" w:lastRowLastColumn="0"/>
+            </w:pPr>
             <w:r>
               <w:t>P1-5</w:t>
             </w:r>
@@ -3803,6 +3931,9 @@
             <w:tcW w:w="3960" w:type="dxa"/>
           </w:tcPr>
           <w:p>
+            <w:pPr>
+              <w:cnfStyle w:val="000000100000" w:firstRow="0" w:lastRow="0" w:firstColumn="0" w:lastColumn="0" w:oddVBand="0" w:evenVBand="0" w:oddHBand="1" w:evenHBand="0" w:firstRowFirstColumn="0" w:firstRowLastColumn="0" w:lastRowFirstColumn="0" w:lastRowLastColumn="0"/>
+            </w:pPr>
             <w:r>
               <w:t xml:space="preserve">Direct </w:t>
             </w:r>
@@ -3824,6 +3955,9 @@
             <w:tcW w:w="3595" w:type="dxa"/>
           </w:tcPr>
           <w:p>
+            <w:pPr>
+              <w:cnfStyle w:val="000000100000" w:firstRow="0" w:lastRow="0" w:firstColumn="0" w:lastColumn="0" w:oddVBand="0" w:evenVBand="0" w:oddHBand="1" w:evenHBand="0" w:firstRowFirstColumn="0" w:firstRowLastColumn="0" w:lastRowFirstColumn="0" w:lastRowLastColumn="0"/>
+            </w:pPr>
             <w:r>
               <w:t xml:space="preserve">Valid guest </w:t>
             </w:r>
@@ -3836,6 +3970,7 @@
       <w:tr>
         <w:tc>
           <w:tcPr>
+            <w:cnfStyle w:val="001000000000" w:firstRow="0" w:lastRow="0" w:firstColumn="1" w:lastColumn="0" w:oddVBand="0" w:evenVBand="0" w:oddHBand="0" w:evenHBand="0" w:firstRowFirstColumn="0" w:firstRowLastColumn="0" w:lastRowFirstColumn="0" w:lastRowLastColumn="0"/>
             <w:tcW w:w="895" w:type="dxa"/>
           </w:tcPr>
           <w:p>
@@ -3849,6 +3984,9 @@
             <w:tcW w:w="900" w:type="dxa"/>
           </w:tcPr>
           <w:p>
+            <w:pPr>
+              <w:cnfStyle w:val="000000000000" w:firstRow="0" w:lastRow="0" w:firstColumn="0" w:lastColumn="0" w:oddVBand="0" w:evenVBand="0" w:oddHBand="0" w:evenHBand="0" w:firstRowFirstColumn="0" w:firstRowLastColumn="0" w:lastRowFirstColumn="0" w:lastRowLastColumn="0"/>
+            </w:pPr>
             <w:r>
               <w:t>P2-1</w:t>
             </w:r>
@@ -3859,6 +3997,9 @@
             <w:tcW w:w="3960" w:type="dxa"/>
           </w:tcPr>
           <w:p>
+            <w:pPr>
+              <w:cnfStyle w:val="000000000000" w:firstRow="0" w:lastRow="0" w:firstColumn="0" w:lastColumn="0" w:oddVBand="0" w:evenVBand="0" w:oddHBand="0" w:evenHBand="0" w:firstRowFirstColumn="0" w:firstRowLastColumn="0" w:lastRowFirstColumn="0" w:lastRowLastColumn="0"/>
+            </w:pPr>
             <w:r>
               <w:t>Retrieve guest names ass</w:t>
             </w:r>
@@ -3872,6 +4013,9 @@
             <w:tcW w:w="3595" w:type="dxa"/>
           </w:tcPr>
           <w:p>
+            <w:pPr>
+              <w:cnfStyle w:val="000000000000" w:firstRow="0" w:lastRow="0" w:firstColumn="0" w:lastColumn="0" w:oddVBand="0" w:evenVBand="0" w:oddHBand="0" w:evenHBand="0" w:firstRowFirstColumn="0" w:firstRowLastColumn="0" w:lastRowFirstColumn="0" w:lastRowLastColumn="0"/>
+            </w:pPr>
             <w:r>
               <w:t>Correct invitation group is loaded</w:t>
             </w:r>
@@ -3879,8 +4023,12 @@
         </w:tc>
       </w:tr>
       <w:tr>
-        <w:tc>
-          <w:tcPr>
+        <w:trPr>
+          <w:cnfStyle w:val="000000100000" w:firstRow="0" w:lastRow="0" w:firstColumn="0" w:lastColumn="0" w:oddVBand="0" w:evenVBand="0" w:oddHBand="1" w:evenHBand="0" w:firstRowFirstColumn="0" w:firstRowLastColumn="0" w:lastRowFirstColumn="0" w:lastRowLastColumn="0"/>
+        </w:trPr>
+        <w:tc>
+          <w:tcPr>
+            <w:cnfStyle w:val="001000000000" w:firstRow="0" w:lastRow="0" w:firstColumn="1" w:lastColumn="0" w:oddVBand="0" w:evenVBand="0" w:oddHBand="0" w:evenHBand="0" w:firstRowFirstColumn="0" w:firstRowLastColumn="0" w:lastRowFirstColumn="0" w:lastRowLastColumn="0"/>
             <w:tcW w:w="895" w:type="dxa"/>
           </w:tcPr>
           <w:p>
@@ -3894,6 +4042,9 @@
             <w:tcW w:w="900" w:type="dxa"/>
           </w:tcPr>
           <w:p>
+            <w:pPr>
+              <w:cnfStyle w:val="000000100000" w:firstRow="0" w:lastRow="0" w:firstColumn="0" w:lastColumn="0" w:oddVBand="0" w:evenVBand="0" w:oddHBand="1" w:evenHBand="0" w:firstRowFirstColumn="0" w:firstRowLastColumn="0" w:lastRowFirstColumn="0" w:lastRowLastColumn="0"/>
+            </w:pPr>
             <w:r>
               <w:t>P2-2</w:t>
             </w:r>
@@ -3904,6 +4055,9 @@
             <w:tcW w:w="3960" w:type="dxa"/>
           </w:tcPr>
           <w:p>
+            <w:pPr>
+              <w:cnfStyle w:val="000000100000" w:firstRow="0" w:lastRow="0" w:firstColumn="0" w:lastColumn="0" w:oddVBand="0" w:evenVBand="0" w:oddHBand="1" w:evenHBand="0" w:firstRowFirstColumn="0" w:firstRowLastColumn="0" w:lastRowFirstColumn="0" w:lastRowLastColumn="0"/>
+            </w:pPr>
             <w:r>
               <w:t>Display each associated guest name</w:t>
             </w:r>
@@ -3914,6 +4068,9 @@
             <w:tcW w:w="3595" w:type="dxa"/>
           </w:tcPr>
           <w:p>
+            <w:pPr>
+              <w:cnfStyle w:val="000000100000" w:firstRow="0" w:lastRow="0" w:firstColumn="0" w:lastColumn="0" w:oddVBand="0" w:evenVBand="0" w:oddHBand="1" w:evenHBand="0" w:firstRowFirstColumn="0" w:firstRowLastColumn="0" w:lastRowFirstColumn="0" w:lastRowLastColumn="0"/>
+            </w:pPr>
             <w:proofErr w:type="gramStart"/>
             <w:r>
               <w:t>Guest</w:t>
@@ -3928,6 +4085,7 @@
       <w:tr>
         <w:tc>
           <w:tcPr>
+            <w:cnfStyle w:val="001000000000" w:firstRow="0" w:lastRow="0" w:firstColumn="1" w:lastColumn="0" w:oddVBand="0" w:evenVBand="0" w:oddHBand="0" w:evenHBand="0" w:firstRowFirstColumn="0" w:firstRowLastColumn="0" w:lastRowFirstColumn="0" w:lastRowLastColumn="0"/>
             <w:tcW w:w="895" w:type="dxa"/>
           </w:tcPr>
           <w:p>
@@ -3941,6 +4099,9 @@
             <w:tcW w:w="900" w:type="dxa"/>
           </w:tcPr>
           <w:p>
+            <w:pPr>
+              <w:cnfStyle w:val="000000000000" w:firstRow="0" w:lastRow="0" w:firstColumn="0" w:lastColumn="0" w:oddVBand="0" w:evenVBand="0" w:oddHBand="0" w:evenHBand="0" w:firstRowFirstColumn="0" w:firstRowLastColumn="0" w:lastRowFirstColumn="0" w:lastRowLastColumn="0"/>
+            </w:pPr>
             <w:r>
               <w:t>P2-3</w:t>
             </w:r>
@@ -3951,6 +4112,9 @@
             <w:tcW w:w="3960" w:type="dxa"/>
           </w:tcPr>
           <w:p>
+            <w:pPr>
+              <w:cnfStyle w:val="000000000000" w:firstRow="0" w:lastRow="0" w:firstColumn="0" w:lastColumn="0" w:oddVBand="0" w:evenVBand="0" w:oddHBand="0" w:evenHBand="0" w:firstRowFirstColumn="0" w:firstRowLastColumn="0" w:lastRowFirstColumn="0" w:lastRowLastColumn="0"/>
+            </w:pPr>
             <w:r>
               <w:t>Add selectable checkbox for each associated guest</w:t>
             </w:r>
@@ -3961,6 +4125,9 @@
             <w:tcW w:w="3595" w:type="dxa"/>
           </w:tcPr>
           <w:p>
+            <w:pPr>
+              <w:cnfStyle w:val="000000000000" w:firstRow="0" w:lastRow="0" w:firstColumn="0" w:lastColumn="0" w:oddVBand="0" w:evenVBand="0" w:oddHBand="0" w:evenHBand="0" w:firstRowFirstColumn="0" w:firstRowLastColumn="0" w:lastRowFirstColumn="0" w:lastRowLastColumn="0"/>
+            </w:pPr>
             <w:r>
               <w:t xml:space="preserve">Individual </w:t>
             </w:r>
@@ -3990,8 +4157,12 @@
         </w:tc>
       </w:tr>
       <w:tr>
-        <w:tc>
-          <w:tcPr>
+        <w:trPr>
+          <w:cnfStyle w:val="000000100000" w:firstRow="0" w:lastRow="0" w:firstColumn="0" w:lastColumn="0" w:oddVBand="0" w:evenVBand="0" w:oddHBand="1" w:evenHBand="0" w:firstRowFirstColumn="0" w:firstRowLastColumn="0" w:lastRowFirstColumn="0" w:lastRowLastColumn="0"/>
+        </w:trPr>
+        <w:tc>
+          <w:tcPr>
+            <w:cnfStyle w:val="001000000000" w:firstRow="0" w:lastRow="0" w:firstColumn="1" w:lastColumn="0" w:oddVBand="0" w:evenVBand="0" w:oddHBand="0" w:evenHBand="0" w:firstRowFirstColumn="0" w:firstRowLastColumn="0" w:lastRowFirstColumn="0" w:lastRowLastColumn="0"/>
             <w:tcW w:w="895" w:type="dxa"/>
           </w:tcPr>
           <w:p>
@@ -4005,6 +4176,9 @@
             <w:tcW w:w="900" w:type="dxa"/>
           </w:tcPr>
           <w:p>
+            <w:pPr>
+              <w:cnfStyle w:val="000000100000" w:firstRow="0" w:lastRow="0" w:firstColumn="0" w:lastColumn="0" w:oddVBand="0" w:evenVBand="0" w:oddHBand="1" w:evenHBand="0" w:firstRowFirstColumn="0" w:firstRowLastColumn="0" w:lastRowFirstColumn="0" w:lastRowLastColumn="0"/>
+            </w:pPr>
             <w:r>
               <w:t>P2-4</w:t>
             </w:r>
@@ -4015,6 +4189,9 @@
             <w:tcW w:w="3960" w:type="dxa"/>
           </w:tcPr>
           <w:p>
+            <w:pPr>
+              <w:cnfStyle w:val="000000100000" w:firstRow="0" w:lastRow="0" w:firstColumn="0" w:lastColumn="0" w:oddVBand="0" w:evenVBand="0" w:oddHBand="1" w:evenHBand="0" w:firstRowFirstColumn="0" w:firstRowLastColumn="0" w:lastRowFirstColumn="0" w:lastRowLastColumn="0"/>
+            </w:pPr>
             <w:r>
               <w:t>Add “No one is attending” checkbox</w:t>
             </w:r>
@@ -4025,6 +4202,9 @@
             <w:tcW w:w="3595" w:type="dxa"/>
           </w:tcPr>
           <w:p>
+            <w:pPr>
+              <w:cnfStyle w:val="000000100000" w:firstRow="0" w:lastRow="0" w:firstColumn="0" w:lastColumn="0" w:oddVBand="0" w:evenVBand="0" w:oddHBand="1" w:evenHBand="0" w:firstRowFirstColumn="0" w:firstRowLastColumn="0" w:lastRowFirstColumn="0" w:lastRowLastColumn="0"/>
+            </w:pPr>
             <w:r>
               <w:t>Whole</w:t>
             </w:r>
@@ -4037,6 +4217,7 @@
       <w:tr>
         <w:tc>
           <w:tcPr>
+            <w:cnfStyle w:val="001000000000" w:firstRow="0" w:lastRow="0" w:firstColumn="1" w:lastColumn="0" w:oddVBand="0" w:evenVBand="0" w:oddHBand="0" w:evenHBand="0" w:firstRowFirstColumn="0" w:firstRowLastColumn="0" w:lastRowFirstColumn="0" w:lastRowLastColumn="0"/>
             <w:tcW w:w="895" w:type="dxa"/>
           </w:tcPr>
           <w:p>
@@ -4050,6 +4231,9 @@
             <w:tcW w:w="900" w:type="dxa"/>
           </w:tcPr>
           <w:p>
+            <w:pPr>
+              <w:cnfStyle w:val="000000000000" w:firstRow="0" w:lastRow="0" w:firstColumn="0" w:lastColumn="0" w:oddVBand="0" w:evenVBand="0" w:oddHBand="0" w:evenHBand="0" w:firstRowFirstColumn="0" w:firstRowLastColumn="0" w:lastRowFirstColumn="0" w:lastRowLastColumn="0"/>
+            </w:pPr>
             <w:r>
               <w:t>P3-1</w:t>
             </w:r>
@@ -4060,6 +4244,9 @@
             <w:tcW w:w="3960" w:type="dxa"/>
           </w:tcPr>
           <w:p>
+            <w:pPr>
+              <w:cnfStyle w:val="000000000000" w:firstRow="0" w:lastRow="0" w:firstColumn="0" w:lastColumn="0" w:oddVBand="0" w:evenVBand="0" w:oddHBand="0" w:evenHBand="0" w:firstRowFirstColumn="0" w:firstRowLastColumn="0" w:lastRowFirstColumn="0" w:lastRowLastColumn="0"/>
+            </w:pPr>
             <w:r>
               <w:t xml:space="preserve">Require minimal </w:t>
             </w:r>
@@ -4073,6 +4260,9 @@
             <w:tcW w:w="3595" w:type="dxa"/>
           </w:tcPr>
           <w:p>
+            <w:pPr>
+              <w:cnfStyle w:val="000000000000" w:firstRow="0" w:lastRow="0" w:firstColumn="0" w:lastColumn="0" w:oddVBand="0" w:evenVBand="0" w:oddHBand="0" w:evenHBand="0" w:firstRowFirstColumn="0" w:firstRowLastColumn="0" w:lastRowFirstColumn="0" w:lastRowLastColumn="0"/>
+            </w:pPr>
             <w:r>
               <w:t>RSVP cannot be submitted with nothing selected</w:t>
             </w:r>
@@ -4080,8 +4270,12 @@
         </w:tc>
       </w:tr>
       <w:tr>
-        <w:tc>
-          <w:tcPr>
+        <w:trPr>
+          <w:cnfStyle w:val="000000100000" w:firstRow="0" w:lastRow="0" w:firstColumn="0" w:lastColumn="0" w:oddVBand="0" w:evenVBand="0" w:oddHBand="1" w:evenHBand="0" w:firstRowFirstColumn="0" w:firstRowLastColumn="0" w:lastRowFirstColumn="0" w:lastRowLastColumn="0"/>
+        </w:trPr>
+        <w:tc>
+          <w:tcPr>
+            <w:cnfStyle w:val="001000000000" w:firstRow="0" w:lastRow="0" w:firstColumn="1" w:lastColumn="0" w:oddVBand="0" w:evenVBand="0" w:oddHBand="0" w:evenHBand="0" w:firstRowFirstColumn="0" w:firstRowLastColumn="0" w:lastRowFirstColumn="0" w:lastRowLastColumn="0"/>
             <w:tcW w:w="895" w:type="dxa"/>
           </w:tcPr>
           <w:p>
@@ -4095,6 +4289,9 @@
             <w:tcW w:w="900" w:type="dxa"/>
           </w:tcPr>
           <w:p>
+            <w:pPr>
+              <w:cnfStyle w:val="000000100000" w:firstRow="0" w:lastRow="0" w:firstColumn="0" w:lastColumn="0" w:oddVBand="0" w:evenVBand="0" w:oddHBand="1" w:evenHBand="0" w:firstRowFirstColumn="0" w:firstRowLastColumn="0" w:lastRowFirstColumn="0" w:lastRowLastColumn="0"/>
+            </w:pPr>
             <w:r>
               <w:t>P3-2</w:t>
             </w:r>
@@ -4105,6 +4302,9 @@
             <w:tcW w:w="3960" w:type="dxa"/>
           </w:tcPr>
           <w:p>
+            <w:pPr>
+              <w:cnfStyle w:val="000000100000" w:firstRow="0" w:lastRow="0" w:firstColumn="0" w:lastColumn="0" w:oddVBand="0" w:evenVBand="0" w:oddHBand="1" w:evenHBand="0" w:firstRowFirstColumn="0" w:firstRowLastColumn="0" w:lastRowFirstColumn="0" w:lastRowLastColumn="0"/>
+            </w:pPr>
             <w:r>
               <w:t>Allow multiple associated guests to be selected</w:t>
             </w:r>
@@ -4115,6 +4315,9 @@
             <w:tcW w:w="3595" w:type="dxa"/>
           </w:tcPr>
           <w:p>
+            <w:pPr>
+              <w:cnfStyle w:val="000000100000" w:firstRow="0" w:lastRow="0" w:firstColumn="0" w:lastColumn="0" w:oddVBand="0" w:evenVBand="0" w:oddHBand="1" w:evenHBand="0" w:firstRowFirstColumn="0" w:firstRowLastColumn="0" w:lastRowFirstColumn="0" w:lastRowLastColumn="0"/>
+            </w:pPr>
             <w:r>
               <w:t>More than one person can attend</w:t>
             </w:r>
@@ -4124,6 +4327,7 @@
       <w:tr>
         <w:tc>
           <w:tcPr>
+            <w:cnfStyle w:val="001000000000" w:firstRow="0" w:lastRow="0" w:firstColumn="1" w:lastColumn="0" w:oddVBand="0" w:evenVBand="0" w:oddHBand="0" w:evenHBand="0" w:firstRowFirstColumn="0" w:firstRowLastColumn="0" w:lastRowFirstColumn="0" w:lastRowLastColumn="0"/>
             <w:tcW w:w="895" w:type="dxa"/>
           </w:tcPr>
           <w:p>
@@ -4137,6 +4341,9 @@
             <w:tcW w:w="900" w:type="dxa"/>
           </w:tcPr>
           <w:p>
+            <w:pPr>
+              <w:cnfStyle w:val="000000000000" w:firstRow="0" w:lastRow="0" w:firstColumn="0" w:lastColumn="0" w:oddVBand="0" w:evenVBand="0" w:oddHBand="0" w:evenHBand="0" w:firstRowFirstColumn="0" w:firstRowLastColumn="0" w:lastRowFirstColumn="0" w:lastRowLastColumn="0"/>
+            </w:pPr>
             <w:r>
               <w:t>P3-3</w:t>
             </w:r>
@@ -4147,6 +4354,9 @@
             <w:tcW w:w="3960" w:type="dxa"/>
           </w:tcPr>
           <w:p>
+            <w:pPr>
+              <w:cnfStyle w:val="000000000000" w:firstRow="0" w:lastRow="0" w:firstColumn="0" w:lastColumn="0" w:oddVBand="0" w:evenVBand="0" w:oddHBand="0" w:evenHBand="0" w:firstRowFirstColumn="0" w:firstRowLastColumn="0" w:lastRowFirstColumn="0" w:lastRowLastColumn="0"/>
+            </w:pPr>
             <w:r>
               <w:t>Save selected guests as attending</w:t>
             </w:r>
@@ -4157,6 +4367,9 @@
             <w:tcW w:w="3595" w:type="dxa"/>
           </w:tcPr>
           <w:p>
+            <w:pPr>
+              <w:cnfStyle w:val="000000000000" w:firstRow="0" w:lastRow="0" w:firstColumn="0" w:lastColumn="0" w:oddVBand="0" w:evenVBand="0" w:oddHBand="0" w:evenHBand="0" w:firstRowFirstColumn="0" w:firstRowLastColumn="0" w:lastRowFirstColumn="0" w:lastRowLastColumn="0"/>
+            </w:pPr>
             <w:r>
               <w:t>Attendance data is stored</w:t>
             </w:r>
@@ -4170,8 +4383,12 @@
         </w:tc>
       </w:tr>
       <w:tr>
-        <w:tc>
-          <w:tcPr>
+        <w:trPr>
+          <w:cnfStyle w:val="000000100000" w:firstRow="0" w:lastRow="0" w:firstColumn="0" w:lastColumn="0" w:oddVBand="0" w:evenVBand="0" w:oddHBand="1" w:evenHBand="0" w:firstRowFirstColumn="0" w:firstRowLastColumn="0" w:lastRowFirstColumn="0" w:lastRowLastColumn="0"/>
+        </w:trPr>
+        <w:tc>
+          <w:tcPr>
+            <w:cnfStyle w:val="001000000000" w:firstRow="0" w:lastRow="0" w:firstColumn="1" w:lastColumn="0" w:oddVBand="0" w:evenVBand="0" w:oddHBand="0" w:evenHBand="0" w:firstRowFirstColumn="0" w:firstRowLastColumn="0" w:lastRowFirstColumn="0" w:lastRowLastColumn="0"/>
             <w:tcW w:w="895" w:type="dxa"/>
           </w:tcPr>
           <w:p>
@@ -4185,6 +4402,9 @@
             <w:tcW w:w="900" w:type="dxa"/>
           </w:tcPr>
           <w:p>
+            <w:pPr>
+              <w:cnfStyle w:val="000000100000" w:firstRow="0" w:lastRow="0" w:firstColumn="0" w:lastColumn="0" w:oddVBand="0" w:evenVBand="0" w:oddHBand="1" w:evenHBand="0" w:firstRowFirstColumn="0" w:firstRowLastColumn="0" w:lastRowFirstColumn="0" w:lastRowLastColumn="0"/>
+            </w:pPr>
             <w:r>
               <w:t>P3-4</w:t>
             </w:r>
@@ -4195,6 +4415,9 @@
             <w:tcW w:w="3960" w:type="dxa"/>
           </w:tcPr>
           <w:p>
+            <w:pPr>
+              <w:cnfStyle w:val="000000100000" w:firstRow="0" w:lastRow="0" w:firstColumn="0" w:lastColumn="0" w:oddVBand="0" w:evenVBand="0" w:oddHBand="1" w:evenHBand="0" w:firstRowFirstColumn="0" w:firstRowLastColumn="0" w:lastRowFirstColumn="0" w:lastRowLastColumn="0"/>
+            </w:pPr>
             <w:r>
               <w:t xml:space="preserve">Save non- selected </w:t>
             </w:r>
@@ -4213,6 +4436,9 @@
             <w:tcW w:w="3595" w:type="dxa"/>
           </w:tcPr>
           <w:p>
+            <w:pPr>
+              <w:cnfStyle w:val="000000100000" w:firstRow="0" w:lastRow="0" w:firstColumn="0" w:lastColumn="0" w:oddVBand="0" w:evenVBand="0" w:oddHBand="1" w:evenHBand="0" w:firstRowFirstColumn="0" w:firstRowLastColumn="0" w:lastRowFirstColumn="0" w:lastRowLastColumn="0"/>
+            </w:pPr>
             <w:proofErr w:type="spellStart"/>
             <w:proofErr w:type="gramStart"/>
             <w:r>
@@ -4229,6 +4455,7 @@
       <w:tr>
         <w:tc>
           <w:tcPr>
+            <w:cnfStyle w:val="001000000000" w:firstRow="0" w:lastRow="0" w:firstColumn="1" w:lastColumn="0" w:oddVBand="0" w:evenVBand="0" w:oddHBand="0" w:evenHBand="0" w:firstRowFirstColumn="0" w:firstRowLastColumn="0" w:lastRowFirstColumn="0" w:lastRowLastColumn="0"/>
             <w:tcW w:w="895" w:type="dxa"/>
           </w:tcPr>
           <w:p>
@@ -4242,6 +4469,9 @@
             <w:tcW w:w="900" w:type="dxa"/>
           </w:tcPr>
           <w:p>
+            <w:pPr>
+              <w:cnfStyle w:val="000000000000" w:firstRow="0" w:lastRow="0" w:firstColumn="0" w:lastColumn="0" w:oddVBand="0" w:evenVBand="0" w:oddHBand="0" w:evenHBand="0" w:firstRowFirstColumn="0" w:firstRowLastColumn="0" w:lastRowFirstColumn="0" w:lastRowLastColumn="0"/>
+            </w:pPr>
             <w:r>
               <w:t>P3-5</w:t>
             </w:r>
@@ -4252,6 +4482,9 @@
             <w:tcW w:w="3960" w:type="dxa"/>
           </w:tcPr>
           <w:p>
+            <w:pPr>
+              <w:cnfStyle w:val="000000000000" w:firstRow="0" w:lastRow="0" w:firstColumn="0" w:lastColumn="0" w:oddVBand="0" w:evenVBand="0" w:oddHBand="0" w:evenHBand="0" w:firstRowFirstColumn="0" w:firstRowLastColumn="0" w:lastRowFirstColumn="0" w:lastRowLastColumn="0"/>
+            </w:pPr>
             <w:r>
               <w:t>Display RSVP submission confirmation</w:t>
             </w:r>
@@ -4262,6 +4495,9 @@
             <w:tcW w:w="3595" w:type="dxa"/>
           </w:tcPr>
           <w:p>
+            <w:pPr>
+              <w:cnfStyle w:val="000000000000" w:firstRow="0" w:lastRow="0" w:firstColumn="0" w:lastColumn="0" w:oddVBand="0" w:evenVBand="0" w:oddHBand="0" w:evenHBand="0" w:firstRowFirstColumn="0" w:firstRowLastColumn="0" w:lastRowFirstColumn="0" w:lastRowLastColumn="0"/>
+            </w:pPr>
             <w:r>
               <w:t xml:space="preserve">Successful </w:t>
             </w:r>
@@ -4272,8 +4508,12 @@
         </w:tc>
       </w:tr>
       <w:tr>
-        <w:tc>
-          <w:tcPr>
+        <w:trPr>
+          <w:cnfStyle w:val="000000100000" w:firstRow="0" w:lastRow="0" w:firstColumn="0" w:lastColumn="0" w:oddVBand="0" w:evenVBand="0" w:oddHBand="1" w:evenHBand="0" w:firstRowFirstColumn="0" w:firstRowLastColumn="0" w:lastRowFirstColumn="0" w:lastRowLastColumn="0"/>
+        </w:trPr>
+        <w:tc>
+          <w:tcPr>
+            <w:cnfStyle w:val="001000000000" w:firstRow="0" w:lastRow="0" w:firstColumn="1" w:lastColumn="0" w:oddVBand="0" w:evenVBand="0" w:oddHBand="0" w:evenHBand="0" w:firstRowFirstColumn="0" w:firstRowLastColumn="0" w:lastRowFirstColumn="0" w:lastRowLastColumn="0"/>
             <w:tcW w:w="895" w:type="dxa"/>
           </w:tcPr>
           <w:p>
@@ -4287,6 +4527,9 @@
             <w:tcW w:w="900" w:type="dxa"/>
           </w:tcPr>
           <w:p>
+            <w:pPr>
+              <w:cnfStyle w:val="000000100000" w:firstRow="0" w:lastRow="0" w:firstColumn="0" w:lastColumn="0" w:oddVBand="0" w:evenVBand="0" w:oddHBand="1" w:evenHBand="0" w:firstRowFirstColumn="0" w:firstRowLastColumn="0" w:lastRowFirstColumn="0" w:lastRowLastColumn="0"/>
+            </w:pPr>
             <w:r>
               <w:t>P4-1</w:t>
             </w:r>
@@ -4297,6 +4540,9 @@
             <w:tcW w:w="3960" w:type="dxa"/>
           </w:tcPr>
           <w:p>
+            <w:pPr>
+              <w:cnfStyle w:val="000000100000" w:firstRow="0" w:lastRow="0" w:firstColumn="0" w:lastColumn="0" w:oddVBand="0" w:evenVBand="0" w:oddHBand="1" w:evenHBand="0" w:firstRowFirstColumn="0" w:firstRowLastColumn="0" w:lastRowFirstColumn="0" w:lastRowLastColumn="0"/>
+            </w:pPr>
             <w:r>
               <w:t xml:space="preserve">No one is attending automatically unchecks individual guests. </w:t>
             </w:r>
@@ -4307,6 +4553,9 @@
             <w:tcW w:w="3595" w:type="dxa"/>
           </w:tcPr>
           <w:p>
+            <w:pPr>
+              <w:cnfStyle w:val="000000100000" w:firstRow="0" w:lastRow="0" w:firstColumn="0" w:lastColumn="0" w:oddVBand="0" w:evenVBand="0" w:oddHBand="1" w:evenHBand="0" w:firstRowFirstColumn="0" w:firstRowLastColumn="0" w:lastRowFirstColumn="0" w:lastRowLastColumn="0"/>
+            </w:pPr>
             <w:r>
               <w:t xml:space="preserve">Conflicting selections are prevented through </w:t>
             </w:r>
@@ -4322,6 +4571,7 @@
       <w:tr>
         <w:tc>
           <w:tcPr>
+            <w:cnfStyle w:val="001000000000" w:firstRow="0" w:lastRow="0" w:firstColumn="1" w:lastColumn="0" w:oddVBand="0" w:evenVBand="0" w:oddHBand="0" w:evenHBand="0" w:firstRowFirstColumn="0" w:firstRowLastColumn="0" w:lastRowFirstColumn="0" w:lastRowLastColumn="0"/>
             <w:tcW w:w="895" w:type="dxa"/>
           </w:tcPr>
           <w:p>
@@ -4335,6 +4585,9 @@
             <w:tcW w:w="900" w:type="dxa"/>
           </w:tcPr>
           <w:p>
+            <w:pPr>
+              <w:cnfStyle w:val="000000000000" w:firstRow="0" w:lastRow="0" w:firstColumn="0" w:lastColumn="0" w:oddVBand="0" w:evenVBand="0" w:oddHBand="0" w:evenHBand="0" w:firstRowFirstColumn="0" w:firstRowLastColumn="0" w:lastRowFirstColumn="0" w:lastRowLastColumn="0"/>
+            </w:pPr>
             <w:r>
               <w:t>P4-2</w:t>
             </w:r>
@@ -4345,6 +4598,9 @@
             <w:tcW w:w="3960" w:type="dxa"/>
           </w:tcPr>
           <w:p>
+            <w:pPr>
+              <w:cnfStyle w:val="000000000000" w:firstRow="0" w:lastRow="0" w:firstColumn="0" w:lastColumn="0" w:oddVBand="0" w:evenVBand="0" w:oddHBand="0" w:evenHBand="0" w:firstRowFirstColumn="0" w:firstRowLastColumn="0" w:lastRowFirstColumn="0" w:lastRowLastColumn="0"/>
+            </w:pPr>
             <w:r>
               <w:t xml:space="preserve">Disable individual checkbox’s when </w:t>
             </w:r>
@@ -4367,6 +4623,9 @@
             <w:tcW w:w="3595" w:type="dxa"/>
           </w:tcPr>
           <w:p>
+            <w:pPr>
+              <w:cnfStyle w:val="000000000000" w:firstRow="0" w:lastRow="0" w:firstColumn="0" w:lastColumn="0" w:oddVBand="0" w:evenVBand="0" w:oddHBand="0" w:evenHBand="0" w:firstRowFirstColumn="0" w:firstRowLastColumn="0" w:lastRowFirstColumn="0" w:lastRowLastColumn="0"/>
+            </w:pPr>
             <w:r>
               <w:t>Individual guests cannot be selected.</w:t>
             </w:r>
@@ -4374,8 +4633,12 @@
         </w:tc>
       </w:tr>
       <w:tr>
-        <w:tc>
-          <w:tcPr>
+        <w:trPr>
+          <w:cnfStyle w:val="000000100000" w:firstRow="0" w:lastRow="0" w:firstColumn="0" w:lastColumn="0" w:oddVBand="0" w:evenVBand="0" w:oddHBand="1" w:evenHBand="0" w:firstRowFirstColumn="0" w:firstRowLastColumn="0" w:lastRowFirstColumn="0" w:lastRowLastColumn="0"/>
+        </w:trPr>
+        <w:tc>
+          <w:tcPr>
+            <w:cnfStyle w:val="001000000000" w:firstRow="0" w:lastRow="0" w:firstColumn="1" w:lastColumn="0" w:oddVBand="0" w:evenVBand="0" w:oddHBand="0" w:evenHBand="0" w:firstRowFirstColumn="0" w:firstRowLastColumn="0" w:lastRowFirstColumn="0" w:lastRowLastColumn="0"/>
             <w:tcW w:w="895" w:type="dxa"/>
           </w:tcPr>
           <w:p>
@@ -4389,6 +4652,9 @@
             <w:tcW w:w="900" w:type="dxa"/>
           </w:tcPr>
           <w:p>
+            <w:pPr>
+              <w:cnfStyle w:val="000000100000" w:firstRow="0" w:lastRow="0" w:firstColumn="0" w:lastColumn="0" w:oddVBand="0" w:evenVBand="0" w:oddHBand="1" w:evenHBand="0" w:firstRowFirstColumn="0" w:firstRowLastColumn="0" w:lastRowFirstColumn="0" w:lastRowLastColumn="0"/>
+            </w:pPr>
             <w:r>
               <w:t>P4-3</w:t>
             </w:r>
@@ -4399,6 +4665,9 @@
             <w:tcW w:w="3960" w:type="dxa"/>
           </w:tcPr>
           <w:p>
+            <w:pPr>
+              <w:cnfStyle w:val="000000100000" w:firstRow="0" w:lastRow="0" w:firstColumn="0" w:lastColumn="0" w:oddVBand="0" w:evenVBand="0" w:oddHBand="1" w:evenHBand="0" w:firstRowFirstColumn="0" w:firstRowLastColumn="0" w:lastRowFirstColumn="0" w:lastRowLastColumn="0"/>
+            </w:pPr>
             <w:r>
               <w:t>Re enable individual checkboxes when no one attending is unchecked</w:t>
             </w:r>
@@ -4409,15 +4678,27 @@
             <w:tcW w:w="3595" w:type="dxa"/>
           </w:tcPr>
           <w:p>
-            <w:r>
-              <w:t xml:space="preserve">Allow user to make RSVP selections freely again. </w:t>
-            </w:r>
-          </w:p>
-        </w:tc>
-      </w:tr>
-      <w:tr>
-        <w:tc>
-          <w:tcPr>
+            <w:pPr>
+              <w:cnfStyle w:val="000000100000" w:firstRow="0" w:lastRow="0" w:firstColumn="0" w:lastColumn="0" w:oddVBand="0" w:evenVBand="0" w:oddHBand="1" w:evenHBand="0" w:firstRowFirstColumn="0" w:firstRowLastColumn="0" w:lastRowFirstColumn="0" w:lastRowLastColumn="0"/>
+            </w:pPr>
+            <w:r>
+              <w:t xml:space="preserve">Allow </w:t>
+            </w:r>
+            <w:proofErr w:type="gramStart"/>
+            <w:r>
+              <w:t>user</w:t>
+            </w:r>
+            <w:proofErr w:type="gramEnd"/>
+            <w:r>
+              <w:t xml:space="preserve"> to make RSVP selections freely again. </w:t>
+            </w:r>
+          </w:p>
+        </w:tc>
+      </w:tr>
+      <w:tr>
+        <w:tc>
+          <w:tcPr>
+            <w:cnfStyle w:val="001000000000" w:firstRow="0" w:lastRow="0" w:firstColumn="1" w:lastColumn="0" w:oddVBand="0" w:evenVBand="0" w:oddHBand="0" w:evenHBand="0" w:firstRowFirstColumn="0" w:firstRowLastColumn="0" w:lastRowFirstColumn="0" w:lastRowLastColumn="0"/>
             <w:tcW w:w="895" w:type="dxa"/>
           </w:tcPr>
           <w:p>
@@ -4432,6 +4713,9 @@
             <w:tcW w:w="900" w:type="dxa"/>
           </w:tcPr>
           <w:p>
+            <w:pPr>
+              <w:cnfStyle w:val="000000000000" w:firstRow="0" w:lastRow="0" w:firstColumn="0" w:lastColumn="0" w:oddVBand="0" w:evenVBand="0" w:oddHBand="0" w:evenHBand="0" w:firstRowFirstColumn="0" w:firstRowLastColumn="0" w:lastRowFirstColumn="0" w:lastRowLastColumn="0"/>
+            </w:pPr>
             <w:r>
               <w:t>P4-4</w:t>
             </w:r>
@@ -4442,6 +4726,9 @@
             <w:tcW w:w="3960" w:type="dxa"/>
           </w:tcPr>
           <w:p>
+            <w:pPr>
+              <w:cnfStyle w:val="000000000000" w:firstRow="0" w:lastRow="0" w:firstColumn="0" w:lastColumn="0" w:oddVBand="0" w:evenVBand="0" w:oddHBand="0" w:evenHBand="0" w:firstRowFirstColumn="0" w:firstRowLastColumn="0" w:lastRowFirstColumn="0" w:lastRowLastColumn="0"/>
+            </w:pPr>
             <w:r>
               <w:t>Sa</w:t>
             </w:r>
@@ -4458,6 +4745,9 @@
             <w:tcW w:w="3595" w:type="dxa"/>
           </w:tcPr>
           <w:p>
+            <w:pPr>
+              <w:cnfStyle w:val="000000000000" w:firstRow="0" w:lastRow="0" w:firstColumn="0" w:lastColumn="0" w:oddVBand="0" w:evenVBand="0" w:oddHBand="0" w:evenHBand="0" w:firstRowFirstColumn="0" w:firstRowLastColumn="0" w:lastRowFirstColumn="0" w:lastRowLastColumn="0"/>
+            </w:pPr>
             <w:r>
               <w:t xml:space="preserve">Entire invitation for all </w:t>
             </w:r>
@@ -4476,8 +4766,12 @@
         </w:tc>
       </w:tr>
       <w:tr>
-        <w:tc>
-          <w:tcPr>
+        <w:trPr>
+          <w:cnfStyle w:val="000000100000" w:firstRow="0" w:lastRow="0" w:firstColumn="0" w:lastColumn="0" w:oddVBand="0" w:evenVBand="0" w:oddHBand="1" w:evenHBand="0" w:firstRowFirstColumn="0" w:firstRowLastColumn="0" w:lastRowFirstColumn="0" w:lastRowLastColumn="0"/>
+        </w:trPr>
+        <w:tc>
+          <w:tcPr>
+            <w:cnfStyle w:val="001000000000" w:firstRow="0" w:lastRow="0" w:firstColumn="1" w:lastColumn="0" w:oddVBand="0" w:evenVBand="0" w:oddHBand="0" w:evenHBand="0" w:firstRowFirstColumn="0" w:firstRowLastColumn="0" w:lastRowFirstColumn="0" w:lastRowLastColumn="0"/>
             <w:tcW w:w="895" w:type="dxa"/>
           </w:tcPr>
           <w:p>
@@ -4491,6 +4785,9 @@
             <w:tcW w:w="900" w:type="dxa"/>
           </w:tcPr>
           <w:p>
+            <w:pPr>
+              <w:cnfStyle w:val="000000100000" w:firstRow="0" w:lastRow="0" w:firstColumn="0" w:lastColumn="0" w:oddVBand="0" w:evenVBand="0" w:oddHBand="1" w:evenHBand="0" w:firstRowFirstColumn="0" w:firstRowLastColumn="0" w:lastRowFirstColumn="0" w:lastRowLastColumn="0"/>
+            </w:pPr>
             <w:r>
               <w:t>P4-5</w:t>
             </w:r>
@@ -4501,6 +4798,9 @@
             <w:tcW w:w="3960" w:type="dxa"/>
           </w:tcPr>
           <w:p>
+            <w:pPr>
+              <w:cnfStyle w:val="000000100000" w:firstRow="0" w:lastRow="0" w:firstColumn="0" w:lastColumn="0" w:oddVBand="0" w:evenVBand="0" w:oddHBand="1" w:evenHBand="0" w:firstRowFirstColumn="0" w:firstRowLastColumn="0" w:lastRowFirstColumn="0" w:lastRowLastColumn="0"/>
+            </w:pPr>
             <w:r>
               <w:t>Return user to dashboard after declining</w:t>
             </w:r>
@@ -4511,6 +4811,9 @@
             <w:tcW w:w="3595" w:type="dxa"/>
           </w:tcPr>
           <w:p>
+            <w:pPr>
+              <w:cnfStyle w:val="000000100000" w:firstRow="0" w:lastRow="0" w:firstColumn="0" w:lastColumn="0" w:oddVBand="0" w:evenVBand="0" w:oddHBand="1" w:evenHBand="0" w:firstRowFirstColumn="0" w:firstRowLastColumn="0" w:lastRowFirstColumn="0" w:lastRowLastColumn="0"/>
+            </w:pPr>
             <w:r>
               <w:t xml:space="preserve">Decline workflow ends correctly </w:t>
             </w:r>
@@ -4520,6 +4823,7 @@
       <w:tr>
         <w:tc>
           <w:tcPr>
+            <w:cnfStyle w:val="001000000000" w:firstRow="0" w:lastRow="0" w:firstColumn="1" w:lastColumn="0" w:oddVBand="0" w:evenVBand="0" w:oddHBand="0" w:evenHBand="0" w:firstRowFirstColumn="0" w:firstRowLastColumn="0" w:lastRowFirstColumn="0" w:lastRowLastColumn="0"/>
             <w:tcW w:w="895" w:type="dxa"/>
           </w:tcPr>
           <w:p>
@@ -4533,6 +4837,9 @@
             <w:tcW w:w="900" w:type="dxa"/>
           </w:tcPr>
           <w:p>
+            <w:pPr>
+              <w:cnfStyle w:val="000000000000" w:firstRow="0" w:lastRow="0" w:firstColumn="0" w:lastColumn="0" w:oddVBand="0" w:evenVBand="0" w:oddHBand="0" w:evenHBand="0" w:firstRowFirstColumn="0" w:firstRowLastColumn="0" w:lastRowFirstColumn="0" w:lastRowLastColumn="0"/>
+            </w:pPr>
             <w:r>
               <w:t>P1-P4</w:t>
             </w:r>
@@ -4543,6 +4850,9 @@
             <w:tcW w:w="3960" w:type="dxa"/>
           </w:tcPr>
           <w:p>
+            <w:pPr>
+              <w:cnfStyle w:val="000000000000" w:firstRow="0" w:lastRow="0" w:firstColumn="0" w:lastColumn="0" w:oddVBand="0" w:evenVBand="0" w:oddHBand="0" w:evenHBand="0" w:firstRowFirstColumn="0" w:firstRowLastColumn="0" w:lastRowFirstColumn="0" w:lastRowLastColumn="0"/>
+            </w:pPr>
             <w:r>
               <w:t>Test complete Sprint 1 workflow</w:t>
             </w:r>
@@ -4553,6 +4863,9 @@
             <w:tcW w:w="3595" w:type="dxa"/>
           </w:tcPr>
           <w:p>
+            <w:pPr>
+              <w:cnfStyle w:val="000000000000" w:firstRow="0" w:lastRow="0" w:firstColumn="0" w:lastColumn="0" w:oddVBand="0" w:evenVBand="0" w:oddHBand="0" w:evenHBand="0" w:firstRowFirstColumn="0" w:firstRowLastColumn="0" w:lastRowFirstColumn="0" w:lastRowLastColumn="0"/>
+            </w:pPr>
             <w:r>
               <w:t>Login</w:t>
             </w:r>
@@ -4565,6 +4878,1890 @@
     </w:tbl>
     <w:p/>
     <w:p/>
+    <w:p>
+      <w:r>
+        <w:t>SPRINT 2</w:t>
+      </w:r>
+    </w:p>
+    <w:p>
+      <w:r>
+        <w:t>SPRINT GOAL: Allow a wedding guest to select meals for their party, view updated RSVP statuses and meal selections within their respectable tabs.</w:t>
+      </w:r>
+    </w:p>
+    <w:p/>
+    <w:tbl>
+      <w:tblPr>
+        <w:tblStyle w:val="PlainTable1"/>
+        <w:tblW w:w="0" w:type="auto"/>
+        <w:tblLook w:val="04A0" w:firstRow="1" w:lastRow="0" w:firstColumn="1" w:lastColumn="0" w:noHBand="0" w:noVBand="1"/>
+      </w:tblPr>
+      <w:tblGrid>
+        <w:gridCol w:w="895"/>
+        <w:gridCol w:w="900"/>
+        <w:gridCol w:w="3420"/>
+        <w:gridCol w:w="4135"/>
+      </w:tblGrid>
+      <w:tr>
+        <w:trPr>
+          <w:cnfStyle w:val="100000000000" w:firstRow="1" w:lastRow="0" w:firstColumn="0" w:lastColumn="0" w:oddVBand="0" w:evenVBand="0" w:oddHBand="0" w:evenHBand="0" w:firstRowFirstColumn="0" w:firstRowLastColumn="0" w:lastRowFirstColumn="0" w:lastRowLastColumn="0"/>
+        </w:trPr>
+        <w:tc>
+          <w:tcPr>
+            <w:cnfStyle w:val="001000000000" w:firstRow="0" w:lastRow="0" w:firstColumn="1" w:lastColumn="0" w:oddVBand="0" w:evenVBand="0" w:oddHBand="0" w:evenHBand="0" w:firstRowFirstColumn="0" w:firstRowLastColumn="0" w:lastRowFirstColumn="0" w:lastRowLastColumn="0"/>
+            <w:tcW w:w="895" w:type="dxa"/>
+          </w:tcPr>
+          <w:p>
+            <w:pPr>
+              <w:rPr>
+                <w:b w:val="0"/>
+                <w:bCs w:val="0"/>
+              </w:rPr>
+            </w:pPr>
+            <w:r>
+              <w:t>ID</w:t>
+            </w:r>
+          </w:p>
+        </w:tc>
+        <w:tc>
+          <w:tcPr>
+            <w:tcW w:w="900" w:type="dxa"/>
+          </w:tcPr>
+          <w:p>
+            <w:pPr>
+              <w:cnfStyle w:val="100000000000" w:firstRow="1" w:lastRow="0" w:firstColumn="0" w:lastColumn="0" w:oddVBand="0" w:evenVBand="0" w:oddHBand="0" w:evenHBand="0" w:firstRowFirstColumn="0" w:firstRowLastColumn="0" w:lastRowFirstColumn="0" w:lastRowLastColumn="0"/>
+              <w:rPr>
+                <w:b w:val="0"/>
+                <w:bCs w:val="0"/>
+              </w:rPr>
+            </w:pPr>
+            <w:r>
+              <w:t>PB ID</w:t>
+            </w:r>
+          </w:p>
+        </w:tc>
+        <w:tc>
+          <w:tcPr>
+            <w:tcW w:w="3420" w:type="dxa"/>
+          </w:tcPr>
+          <w:p>
+            <w:pPr>
+              <w:cnfStyle w:val="100000000000" w:firstRow="1" w:lastRow="0" w:firstColumn="0" w:lastColumn="0" w:oddVBand="0" w:evenVBand="0" w:oddHBand="0" w:evenHBand="0" w:firstRowFirstColumn="0" w:firstRowLastColumn="0" w:lastRowFirstColumn="0" w:lastRowLastColumn="0"/>
+              <w:rPr>
+                <w:b w:val="0"/>
+                <w:bCs w:val="0"/>
+              </w:rPr>
+            </w:pPr>
+            <w:r>
+              <w:t>Development Task</w:t>
+            </w:r>
+          </w:p>
+        </w:tc>
+        <w:tc>
+          <w:tcPr>
+            <w:tcW w:w="4135" w:type="dxa"/>
+          </w:tcPr>
+          <w:p>
+            <w:pPr>
+              <w:cnfStyle w:val="100000000000" w:firstRow="1" w:lastRow="0" w:firstColumn="0" w:lastColumn="0" w:oddVBand="0" w:evenVBand="0" w:oddHBand="0" w:evenHBand="0" w:firstRowFirstColumn="0" w:firstRowLastColumn="0" w:lastRowFirstColumn="0" w:lastRowLastColumn="0"/>
+              <w:rPr>
+                <w:b w:val="0"/>
+                <w:bCs w:val="0"/>
+              </w:rPr>
+            </w:pPr>
+            <w:r>
+              <w:t>Acceptance Criteria</w:t>
+            </w:r>
+          </w:p>
+        </w:tc>
+      </w:tr>
+      <w:tr>
+        <w:trPr>
+          <w:cnfStyle w:val="000000100000" w:firstRow="0" w:lastRow="0" w:firstColumn="0" w:lastColumn="0" w:oddVBand="0" w:evenVBand="0" w:oddHBand="1" w:evenHBand="0" w:firstRowFirstColumn="0" w:firstRowLastColumn="0" w:lastRowFirstColumn="0" w:lastRowLastColumn="0"/>
+        </w:trPr>
+        <w:tc>
+          <w:tcPr>
+            <w:cnfStyle w:val="001000000000" w:firstRow="0" w:lastRow="0" w:firstColumn="1" w:lastColumn="0" w:oddVBand="0" w:evenVBand="0" w:oddHBand="0" w:evenHBand="0" w:firstRowFirstColumn="0" w:firstRowLastColumn="0" w:lastRowFirstColumn="0" w:lastRowLastColumn="0"/>
+            <w:tcW w:w="895" w:type="dxa"/>
+          </w:tcPr>
+          <w:p>
+            <w:r>
+              <w:t>S2-1</w:t>
+            </w:r>
+          </w:p>
+        </w:tc>
+        <w:tc>
+          <w:tcPr>
+            <w:tcW w:w="900" w:type="dxa"/>
+          </w:tcPr>
+          <w:p>
+            <w:pPr>
+              <w:cnfStyle w:val="000000100000" w:firstRow="0" w:lastRow="0" w:firstColumn="0" w:lastColumn="0" w:oddVBand="0" w:evenVBand="0" w:oddHBand="1" w:evenHBand="0" w:firstRowFirstColumn="0" w:firstRowLastColumn="0" w:lastRowFirstColumn="0" w:lastRowLastColumn="0"/>
+            </w:pPr>
+            <w:r>
+              <w:t>P5-1</w:t>
+            </w:r>
+          </w:p>
+        </w:tc>
+        <w:tc>
+          <w:tcPr>
+            <w:tcW w:w="3420" w:type="dxa"/>
+          </w:tcPr>
+          <w:p>
+            <w:pPr>
+              <w:cnfStyle w:val="000000100000" w:firstRow="0" w:lastRow="0" w:firstColumn="0" w:lastColumn="0" w:oddVBand="0" w:evenVBand="0" w:oddHBand="1" w:evenHBand="0" w:firstRowFirstColumn="0" w:firstRowLastColumn="0" w:lastRowFirstColumn="0" w:lastRowLastColumn="0"/>
+            </w:pPr>
+            <w:r>
+              <w:t>Create Meal Selection HTML form and Flask route.</w:t>
+            </w:r>
+          </w:p>
+        </w:tc>
+        <w:tc>
+          <w:tcPr>
+            <w:tcW w:w="4135" w:type="dxa"/>
+          </w:tcPr>
+          <w:p>
+            <w:pPr>
+              <w:cnfStyle w:val="000000100000" w:firstRow="0" w:lastRow="0" w:firstColumn="0" w:lastColumn="0" w:oddVBand="0" w:evenVBand="0" w:oddHBand="1" w:evenHBand="0" w:firstRowFirstColumn="0" w:firstRowLastColumn="0" w:lastRowFirstColumn="0" w:lastRowLastColumn="0"/>
+            </w:pPr>
+            <w:r>
+              <w:t>Meal Selection Form is available after RSVP submission.</w:t>
+            </w:r>
+          </w:p>
+        </w:tc>
+      </w:tr>
+      <w:tr>
+        <w:tc>
+          <w:tcPr>
+            <w:cnfStyle w:val="001000000000" w:firstRow="0" w:lastRow="0" w:firstColumn="1" w:lastColumn="0" w:oddVBand="0" w:evenVBand="0" w:oddHBand="0" w:evenHBand="0" w:firstRowFirstColumn="0" w:firstRowLastColumn="0" w:lastRowFirstColumn="0" w:lastRowLastColumn="0"/>
+            <w:tcW w:w="895" w:type="dxa"/>
+          </w:tcPr>
+          <w:p>
+            <w:r>
+              <w:t>S2-2</w:t>
+            </w:r>
+          </w:p>
+        </w:tc>
+        <w:tc>
+          <w:tcPr>
+            <w:tcW w:w="900" w:type="dxa"/>
+          </w:tcPr>
+          <w:p>
+            <w:pPr>
+              <w:cnfStyle w:val="000000000000" w:firstRow="0" w:lastRow="0" w:firstColumn="0" w:lastColumn="0" w:oddVBand="0" w:evenVBand="0" w:oddHBand="0" w:evenHBand="0" w:firstRowFirstColumn="0" w:firstRowLastColumn="0" w:lastRowFirstColumn="0" w:lastRowLastColumn="0"/>
+            </w:pPr>
+            <w:r>
+              <w:t>P5-1</w:t>
+            </w:r>
+          </w:p>
+        </w:tc>
+        <w:tc>
+          <w:tcPr>
+            <w:tcW w:w="3420" w:type="dxa"/>
+          </w:tcPr>
+          <w:p>
+            <w:pPr>
+              <w:cnfStyle w:val="000000000000" w:firstRow="0" w:lastRow="0" w:firstColumn="0" w:lastColumn="0" w:oddVBand="0" w:evenVBand="0" w:oddHBand="0" w:evenHBand="0" w:firstRowFirstColumn="0" w:firstRowLastColumn="0" w:lastRowFirstColumn="0" w:lastRowLastColumn="0"/>
+            </w:pPr>
+            <w:r>
+              <w:t>Redirect attending invitations to Meal Selection Form.</w:t>
+            </w:r>
+          </w:p>
+        </w:tc>
+        <w:tc>
+          <w:tcPr>
+            <w:tcW w:w="4135" w:type="dxa"/>
+          </w:tcPr>
+          <w:p>
+            <w:pPr>
+              <w:cnfStyle w:val="000000000000" w:firstRow="0" w:lastRow="0" w:firstColumn="0" w:lastColumn="0" w:oddVBand="0" w:evenVBand="0" w:oddHBand="0" w:evenHBand="0" w:firstRowFirstColumn="0" w:firstRowLastColumn="0" w:lastRowFirstColumn="0" w:lastRowLastColumn="0"/>
+            </w:pPr>
+            <w:r>
+              <w:t xml:space="preserve">At least one attending guest </w:t>
+            </w:r>
+            <w:r>
+              <w:t>shows</w:t>
+            </w:r>
+            <w:r>
+              <w:t xml:space="preserve"> meal form. No one attending returns to dashboard.</w:t>
+            </w:r>
+          </w:p>
+        </w:tc>
+      </w:tr>
+      <w:tr>
+        <w:trPr>
+          <w:cnfStyle w:val="000000100000" w:firstRow="0" w:lastRow="0" w:firstColumn="0" w:lastColumn="0" w:oddVBand="0" w:evenVBand="0" w:oddHBand="1" w:evenHBand="0" w:firstRowFirstColumn="0" w:firstRowLastColumn="0" w:lastRowFirstColumn="0" w:lastRowLastColumn="0"/>
+        </w:trPr>
+        <w:tc>
+          <w:tcPr>
+            <w:cnfStyle w:val="001000000000" w:firstRow="0" w:lastRow="0" w:firstColumn="1" w:lastColumn="0" w:oddVBand="0" w:evenVBand="0" w:oddHBand="0" w:evenHBand="0" w:firstRowFirstColumn="0" w:firstRowLastColumn="0" w:lastRowFirstColumn="0" w:lastRowLastColumn="0"/>
+            <w:tcW w:w="895" w:type="dxa"/>
+          </w:tcPr>
+          <w:p>
+            <w:r>
+              <w:t>S2-3</w:t>
+            </w:r>
+          </w:p>
+        </w:tc>
+        <w:tc>
+          <w:tcPr>
+            <w:tcW w:w="900" w:type="dxa"/>
+          </w:tcPr>
+          <w:p>
+            <w:pPr>
+              <w:cnfStyle w:val="000000100000" w:firstRow="0" w:lastRow="0" w:firstColumn="0" w:lastColumn="0" w:oddVBand="0" w:evenVBand="0" w:oddHBand="1" w:evenHBand="0" w:firstRowFirstColumn="0" w:firstRowLastColumn="0" w:lastRowFirstColumn="0" w:lastRowLastColumn="0"/>
+            </w:pPr>
+            <w:r>
+              <w:t>P5-2</w:t>
+            </w:r>
+          </w:p>
+        </w:tc>
+        <w:tc>
+          <w:tcPr>
+            <w:tcW w:w="3420" w:type="dxa"/>
+          </w:tcPr>
+          <w:p>
+            <w:pPr>
+              <w:cnfStyle w:val="000000100000" w:firstRow="0" w:lastRow="0" w:firstColumn="0" w:lastColumn="0" w:oddVBand="0" w:evenVBand="0" w:oddHBand="1" w:evenHBand="0" w:firstRowFirstColumn="0" w:firstRowLastColumn="0" w:lastRowFirstColumn="0" w:lastRowLastColumn="0"/>
+            </w:pPr>
+            <w:r>
+              <w:t>Retrieve attending guests associated with current invitation.</w:t>
+            </w:r>
+          </w:p>
+        </w:tc>
+        <w:tc>
+          <w:tcPr>
+            <w:tcW w:w="4135" w:type="dxa"/>
+          </w:tcPr>
+          <w:p>
+            <w:pPr>
+              <w:cnfStyle w:val="000000100000" w:firstRow="0" w:lastRow="0" w:firstColumn="0" w:lastColumn="0" w:oddVBand="0" w:evenVBand="0" w:oddHBand="1" w:evenHBand="0" w:firstRowFirstColumn="0" w:firstRowLastColumn="0" w:lastRowFirstColumn="0" w:lastRowLastColumn="0"/>
+            </w:pPr>
+            <w:r>
+              <w:t>Only attending guests from the correct invitation are displayed.</w:t>
+            </w:r>
+          </w:p>
+        </w:tc>
+      </w:tr>
+      <w:tr>
+        <w:tc>
+          <w:tcPr>
+            <w:cnfStyle w:val="001000000000" w:firstRow="0" w:lastRow="0" w:firstColumn="1" w:lastColumn="0" w:oddVBand="0" w:evenVBand="0" w:oddHBand="0" w:evenHBand="0" w:firstRowFirstColumn="0" w:firstRowLastColumn="0" w:lastRowFirstColumn="0" w:lastRowLastColumn="0"/>
+            <w:tcW w:w="895" w:type="dxa"/>
+          </w:tcPr>
+          <w:p>
+            <w:r>
+              <w:t>S2-4</w:t>
+            </w:r>
+          </w:p>
+        </w:tc>
+        <w:tc>
+          <w:tcPr>
+            <w:tcW w:w="900" w:type="dxa"/>
+          </w:tcPr>
+          <w:p>
+            <w:pPr>
+              <w:cnfStyle w:val="000000000000" w:firstRow="0" w:lastRow="0" w:firstColumn="0" w:lastColumn="0" w:oddVBand="0" w:evenVBand="0" w:oddHBand="0" w:evenHBand="0" w:firstRowFirstColumn="0" w:firstRowLastColumn="0" w:lastRowFirstColumn="0" w:lastRowLastColumn="0"/>
+            </w:pPr>
+            <w:r>
+              <w:t>P5-3</w:t>
+            </w:r>
+          </w:p>
+        </w:tc>
+        <w:tc>
+          <w:tcPr>
+            <w:tcW w:w="3420" w:type="dxa"/>
+          </w:tcPr>
+          <w:p>
+            <w:pPr>
+              <w:cnfStyle w:val="000000000000" w:firstRow="0" w:lastRow="0" w:firstColumn="0" w:lastColumn="0" w:oddVBand="0" w:evenVBand="0" w:oddHBand="0" w:evenHBand="0" w:firstRowFirstColumn="0" w:firstRowLastColumn="0" w:lastRowFirstColumn="0" w:lastRowLastColumn="0"/>
+            </w:pPr>
+            <w:r>
+              <w:t>Display available meal choices for each guest.</w:t>
+            </w:r>
+          </w:p>
+        </w:tc>
+        <w:tc>
+          <w:tcPr>
+            <w:tcW w:w="4135" w:type="dxa"/>
+          </w:tcPr>
+          <w:p>
+            <w:pPr>
+              <w:cnfStyle w:val="000000000000" w:firstRow="0" w:lastRow="0" w:firstColumn="0" w:lastColumn="0" w:oddVBand="0" w:evenVBand="0" w:oddHBand="0" w:evenHBand="0" w:firstRowFirstColumn="0" w:firstRowLastColumn="0" w:lastRowFirstColumn="0" w:lastRowLastColumn="0"/>
+            </w:pPr>
+            <w:r>
+              <w:t>Every attending guest has meal options.</w:t>
+            </w:r>
+          </w:p>
+        </w:tc>
+      </w:tr>
+      <w:tr>
+        <w:trPr>
+          <w:cnfStyle w:val="000000100000" w:firstRow="0" w:lastRow="0" w:firstColumn="0" w:lastColumn="0" w:oddVBand="0" w:evenVBand="0" w:oddHBand="1" w:evenHBand="0" w:firstRowFirstColumn="0" w:firstRowLastColumn="0" w:lastRowFirstColumn="0" w:lastRowLastColumn="0"/>
+        </w:trPr>
+        <w:tc>
+          <w:tcPr>
+            <w:cnfStyle w:val="001000000000" w:firstRow="0" w:lastRow="0" w:firstColumn="1" w:lastColumn="0" w:oddVBand="0" w:evenVBand="0" w:oddHBand="0" w:evenHBand="0" w:firstRowFirstColumn="0" w:firstRowLastColumn="0" w:lastRowFirstColumn="0" w:lastRowLastColumn="0"/>
+            <w:tcW w:w="895" w:type="dxa"/>
+          </w:tcPr>
+          <w:p>
+            <w:r>
+              <w:t>S2-5</w:t>
+            </w:r>
+          </w:p>
+        </w:tc>
+        <w:tc>
+          <w:tcPr>
+            <w:tcW w:w="900" w:type="dxa"/>
+          </w:tcPr>
+          <w:p>
+            <w:pPr>
+              <w:cnfStyle w:val="000000100000" w:firstRow="0" w:lastRow="0" w:firstColumn="0" w:lastColumn="0" w:oddVBand="0" w:evenVBand="0" w:oddHBand="1" w:evenHBand="0" w:firstRowFirstColumn="0" w:firstRowLastColumn="0" w:lastRowFirstColumn="0" w:lastRowLastColumn="0"/>
+            </w:pPr>
+            <w:r>
+              <w:t>P5-4</w:t>
+            </w:r>
+          </w:p>
+        </w:tc>
+        <w:tc>
+          <w:tcPr>
+            <w:tcW w:w="3420" w:type="dxa"/>
+          </w:tcPr>
+          <w:p>
+            <w:pPr>
+              <w:cnfStyle w:val="000000100000" w:firstRow="0" w:lastRow="0" w:firstColumn="0" w:lastColumn="0" w:oddVBand="0" w:evenVBand="0" w:oddHBand="1" w:evenHBand="0" w:firstRowFirstColumn="0" w:firstRowLastColumn="0" w:lastRowFirstColumn="0" w:lastRowLastColumn="0"/>
+            </w:pPr>
+            <w:proofErr w:type="gramStart"/>
+            <w:r>
+              <w:t>Require</w:t>
+            </w:r>
+            <w:proofErr w:type="gramEnd"/>
+            <w:r>
+              <w:t xml:space="preserve"> a meal selection for every attending guest.</w:t>
+            </w:r>
+          </w:p>
+        </w:tc>
+        <w:tc>
+          <w:tcPr>
+            <w:tcW w:w="4135" w:type="dxa"/>
+          </w:tcPr>
+          <w:p>
+            <w:pPr>
+              <w:cnfStyle w:val="000000100000" w:firstRow="0" w:lastRow="0" w:firstColumn="0" w:lastColumn="0" w:oddVBand="0" w:evenVBand="0" w:oddHBand="1" w:evenHBand="0" w:firstRowFirstColumn="0" w:firstRowLastColumn="0" w:lastRowFirstColumn="0" w:lastRowLastColumn="0"/>
+            </w:pPr>
+            <w:r>
+              <w:t>Submit</w:t>
+            </w:r>
+            <w:r>
+              <w:t xml:space="preserve"> is prevented if any attending guest has no meal selected.</w:t>
+            </w:r>
+          </w:p>
+        </w:tc>
+      </w:tr>
+      <w:tr>
+        <w:tc>
+          <w:tcPr>
+            <w:cnfStyle w:val="001000000000" w:firstRow="0" w:lastRow="0" w:firstColumn="1" w:lastColumn="0" w:oddVBand="0" w:evenVBand="0" w:oddHBand="0" w:evenHBand="0" w:firstRowFirstColumn="0" w:firstRowLastColumn="0" w:lastRowFirstColumn="0" w:lastRowLastColumn="0"/>
+            <w:tcW w:w="895" w:type="dxa"/>
+          </w:tcPr>
+          <w:p>
+            <w:r>
+              <w:t>S2-6</w:t>
+            </w:r>
+          </w:p>
+        </w:tc>
+        <w:tc>
+          <w:tcPr>
+            <w:tcW w:w="900" w:type="dxa"/>
+          </w:tcPr>
+          <w:p>
+            <w:pPr>
+              <w:cnfStyle w:val="000000000000" w:firstRow="0" w:lastRow="0" w:firstColumn="0" w:lastColumn="0" w:oddVBand="0" w:evenVBand="0" w:oddHBand="0" w:evenHBand="0" w:firstRowFirstColumn="0" w:firstRowLastColumn="0" w:lastRowFirstColumn="0" w:lastRowLastColumn="0"/>
+            </w:pPr>
+            <w:r>
+              <w:t>P5-5</w:t>
+            </w:r>
+          </w:p>
+        </w:tc>
+        <w:tc>
+          <w:tcPr>
+            <w:tcW w:w="3420" w:type="dxa"/>
+          </w:tcPr>
+          <w:p>
+            <w:pPr>
+              <w:cnfStyle w:val="000000000000" w:firstRow="0" w:lastRow="0" w:firstColumn="0" w:lastColumn="0" w:oddVBand="0" w:evenVBand="0" w:oddHBand="0" w:evenHBand="0" w:firstRowFirstColumn="0" w:firstRowLastColumn="0" w:lastRowFirstColumn="0" w:lastRowLastColumn="0"/>
+            </w:pPr>
+            <w:r>
+              <w:t xml:space="preserve">Save each guest's selected meal into </w:t>
+            </w:r>
+            <w:r>
+              <w:t>database</w:t>
+            </w:r>
+            <w:r>
+              <w:t>.</w:t>
+            </w:r>
+          </w:p>
+        </w:tc>
+        <w:tc>
+          <w:tcPr>
+            <w:tcW w:w="4135" w:type="dxa"/>
+          </w:tcPr>
+          <w:p>
+            <w:pPr>
+              <w:cnfStyle w:val="000000000000" w:firstRow="0" w:lastRow="0" w:firstColumn="0" w:lastColumn="0" w:oddVBand="0" w:evenVBand="0" w:oddHBand="0" w:evenHBand="0" w:firstRowFirstColumn="0" w:firstRowLastColumn="0" w:lastRowFirstColumn="0" w:lastRowLastColumn="0"/>
+            </w:pPr>
+            <w:r>
+              <w:t xml:space="preserve">Meal selections are saved to correct guests and </w:t>
+            </w:r>
+            <w:r>
+              <w:t xml:space="preserve">correlate </w:t>
+            </w:r>
+            <w:r>
+              <w:t>after login.</w:t>
+            </w:r>
+          </w:p>
+        </w:tc>
+      </w:tr>
+      <w:tr>
+        <w:trPr>
+          <w:cnfStyle w:val="000000100000" w:firstRow="0" w:lastRow="0" w:firstColumn="0" w:lastColumn="0" w:oddVBand="0" w:evenVBand="0" w:oddHBand="1" w:evenHBand="0" w:firstRowFirstColumn="0" w:firstRowLastColumn="0" w:lastRowFirstColumn="0" w:lastRowLastColumn="0"/>
+        </w:trPr>
+        <w:tc>
+          <w:tcPr>
+            <w:cnfStyle w:val="001000000000" w:firstRow="0" w:lastRow="0" w:firstColumn="1" w:lastColumn="0" w:oddVBand="0" w:evenVBand="0" w:oddHBand="0" w:evenHBand="0" w:firstRowFirstColumn="0" w:firstRowLastColumn="0" w:lastRowFirstColumn="0" w:lastRowLastColumn="0"/>
+            <w:tcW w:w="895" w:type="dxa"/>
+          </w:tcPr>
+          <w:p>
+            <w:r>
+              <w:t>S2-7</w:t>
+            </w:r>
+          </w:p>
+        </w:tc>
+        <w:tc>
+          <w:tcPr>
+            <w:tcW w:w="900" w:type="dxa"/>
+          </w:tcPr>
+          <w:p>
+            <w:pPr>
+              <w:cnfStyle w:val="000000100000" w:firstRow="0" w:lastRow="0" w:firstColumn="0" w:lastColumn="0" w:oddVBand="0" w:evenVBand="0" w:oddHBand="1" w:evenHBand="0" w:firstRowFirstColumn="0" w:firstRowLastColumn="0" w:lastRowFirstColumn="0" w:lastRowLastColumn="0"/>
+            </w:pPr>
+            <w:r>
+              <w:t>P5-6</w:t>
+            </w:r>
+          </w:p>
+        </w:tc>
+        <w:tc>
+          <w:tcPr>
+            <w:tcW w:w="3420" w:type="dxa"/>
+          </w:tcPr>
+          <w:p>
+            <w:pPr>
+              <w:cnfStyle w:val="000000100000" w:firstRow="0" w:lastRow="0" w:firstColumn="0" w:lastColumn="0" w:oddVBand="0" w:evenVBand="0" w:oddHBand="1" w:evenHBand="0" w:firstRowFirstColumn="0" w:firstRowLastColumn="0" w:lastRowFirstColumn="0" w:lastRowLastColumn="0"/>
+            </w:pPr>
+            <w:r>
+              <w:t xml:space="preserve">Prevent meal assignments for </w:t>
+            </w:r>
+            <w:proofErr w:type="spellStart"/>
+            <w:r>
+              <w:t>non attending</w:t>
+            </w:r>
+            <w:proofErr w:type="spellEnd"/>
+            <w:r>
+              <w:t xml:space="preserve"> guests.</w:t>
+            </w:r>
+          </w:p>
+        </w:tc>
+        <w:tc>
+          <w:tcPr>
+            <w:tcW w:w="4135" w:type="dxa"/>
+          </w:tcPr>
+          <w:p>
+            <w:pPr>
+              <w:cnfStyle w:val="000000100000" w:firstRow="0" w:lastRow="0" w:firstColumn="0" w:lastColumn="0" w:oddVBand="0" w:evenVBand="0" w:oddHBand="1" w:evenHBand="0" w:firstRowFirstColumn="0" w:firstRowLastColumn="0" w:lastRowFirstColumn="0" w:lastRowLastColumn="0"/>
+            </w:pPr>
+            <w:r>
+              <w:t>Non attending guests cannot receive meal selections.</w:t>
+            </w:r>
+          </w:p>
+        </w:tc>
+      </w:tr>
+      <w:tr>
+        <w:tc>
+          <w:tcPr>
+            <w:cnfStyle w:val="001000000000" w:firstRow="0" w:lastRow="0" w:firstColumn="1" w:lastColumn="0" w:oddVBand="0" w:evenVBand="0" w:oddHBand="0" w:evenHBand="0" w:firstRowFirstColumn="0" w:firstRowLastColumn="0" w:lastRowFirstColumn="0" w:lastRowLastColumn="0"/>
+            <w:tcW w:w="895" w:type="dxa"/>
+          </w:tcPr>
+          <w:p>
+            <w:r>
+              <w:t>S2-8</w:t>
+            </w:r>
+          </w:p>
+        </w:tc>
+        <w:tc>
+          <w:tcPr>
+            <w:tcW w:w="900" w:type="dxa"/>
+          </w:tcPr>
+          <w:p>
+            <w:pPr>
+              <w:cnfStyle w:val="000000000000" w:firstRow="0" w:lastRow="0" w:firstColumn="0" w:lastColumn="0" w:oddVBand="0" w:evenVBand="0" w:oddHBand="0" w:evenHBand="0" w:firstRowFirstColumn="0" w:firstRowLastColumn="0" w:lastRowFirstColumn="0" w:lastRowLastColumn="0"/>
+            </w:pPr>
+            <w:r>
+              <w:t>P5-7</w:t>
+            </w:r>
+          </w:p>
+        </w:tc>
+        <w:tc>
+          <w:tcPr>
+            <w:tcW w:w="3420" w:type="dxa"/>
+          </w:tcPr>
+          <w:p>
+            <w:pPr>
+              <w:cnfStyle w:val="000000000000" w:firstRow="0" w:lastRow="0" w:firstColumn="0" w:lastColumn="0" w:oddVBand="0" w:evenVBand="0" w:oddHBand="0" w:evenHBand="0" w:firstRowFirstColumn="0" w:firstRowLastColumn="0" w:lastRowFirstColumn="0" w:lastRowLastColumn="0"/>
+            </w:pPr>
+            <w:r>
+              <w:t>Display meal submission confirmation and return to dashboard.</w:t>
+            </w:r>
+          </w:p>
+        </w:tc>
+        <w:tc>
+          <w:tcPr>
+            <w:tcW w:w="4135" w:type="dxa"/>
+          </w:tcPr>
+          <w:p>
+            <w:pPr>
+              <w:cnfStyle w:val="000000000000" w:firstRow="0" w:lastRow="0" w:firstColumn="0" w:lastColumn="0" w:oddVBand="0" w:evenVBand="0" w:oddHBand="0" w:evenHBand="0" w:firstRowFirstColumn="0" w:firstRowLastColumn="0" w:lastRowFirstColumn="0" w:lastRowLastColumn="0"/>
+            </w:pPr>
+            <w:r>
+              <w:t>Successful confirmation displays after meals are saved.</w:t>
+            </w:r>
+          </w:p>
+        </w:tc>
+      </w:tr>
+      <w:tr>
+        <w:trPr>
+          <w:cnfStyle w:val="000000100000" w:firstRow="0" w:lastRow="0" w:firstColumn="0" w:lastColumn="0" w:oddVBand="0" w:evenVBand="0" w:oddHBand="1" w:evenHBand="0" w:firstRowFirstColumn="0" w:firstRowLastColumn="0" w:lastRowFirstColumn="0" w:lastRowLastColumn="0"/>
+        </w:trPr>
+        <w:tc>
+          <w:tcPr>
+            <w:cnfStyle w:val="001000000000" w:firstRow="0" w:lastRow="0" w:firstColumn="1" w:lastColumn="0" w:oddVBand="0" w:evenVBand="0" w:oddHBand="0" w:evenHBand="0" w:firstRowFirstColumn="0" w:firstRowLastColumn="0" w:lastRowFirstColumn="0" w:lastRowLastColumn="0"/>
+            <w:tcW w:w="895" w:type="dxa"/>
+          </w:tcPr>
+          <w:p>
+            <w:r>
+              <w:t>S2-9</w:t>
+            </w:r>
+          </w:p>
+        </w:tc>
+        <w:tc>
+          <w:tcPr>
+            <w:tcW w:w="900" w:type="dxa"/>
+          </w:tcPr>
+          <w:p>
+            <w:pPr>
+              <w:cnfStyle w:val="000000100000" w:firstRow="0" w:lastRow="0" w:firstColumn="0" w:lastColumn="0" w:oddVBand="0" w:evenVBand="0" w:oddHBand="1" w:evenHBand="0" w:firstRowFirstColumn="0" w:firstRowLastColumn="0" w:lastRowFirstColumn="0" w:lastRowLastColumn="0"/>
+            </w:pPr>
+            <w:r>
+              <w:t>P5-8</w:t>
+            </w:r>
+          </w:p>
+        </w:tc>
+        <w:tc>
+          <w:tcPr>
+            <w:tcW w:w="3420" w:type="dxa"/>
+          </w:tcPr>
+          <w:p>
+            <w:pPr>
+              <w:cnfStyle w:val="000000100000" w:firstRow="0" w:lastRow="0" w:firstColumn="0" w:lastColumn="0" w:oddVBand="0" w:evenVBand="0" w:oddHBand="1" w:evenHBand="0" w:firstRowFirstColumn="0" w:firstRowLastColumn="0" w:lastRowFirstColumn="0" w:lastRowLastColumn="0"/>
+            </w:pPr>
+            <w:r>
+              <w:t>Check for incomplete meal selections during login.</w:t>
+            </w:r>
+          </w:p>
+        </w:tc>
+        <w:tc>
+          <w:tcPr>
+            <w:tcW w:w="4135" w:type="dxa"/>
+          </w:tcPr>
+          <w:p>
+            <w:pPr>
+              <w:cnfStyle w:val="000000100000" w:firstRow="0" w:lastRow="0" w:firstColumn="0" w:lastColumn="0" w:oddVBand="0" w:evenVBand="0" w:oddHBand="1" w:evenHBand="0" w:firstRowFirstColumn="0" w:firstRowLastColumn="0" w:lastRowFirstColumn="0" w:lastRowLastColumn="0"/>
+            </w:pPr>
+            <w:r>
+              <w:t>Users with incomplete meals are directed back to Meal Selection Form.</w:t>
+            </w:r>
+          </w:p>
+        </w:tc>
+      </w:tr>
+      <w:tr>
+        <w:tc>
+          <w:tcPr>
+            <w:cnfStyle w:val="001000000000" w:firstRow="0" w:lastRow="0" w:firstColumn="1" w:lastColumn="0" w:oddVBand="0" w:evenVBand="0" w:oddHBand="0" w:evenHBand="0" w:firstRowFirstColumn="0" w:firstRowLastColumn="0" w:lastRowFirstColumn="0" w:lastRowLastColumn="0"/>
+            <w:tcW w:w="895" w:type="dxa"/>
+          </w:tcPr>
+          <w:p>
+            <w:r>
+              <w:t>S2-10</w:t>
+            </w:r>
+          </w:p>
+        </w:tc>
+        <w:tc>
+          <w:tcPr>
+            <w:tcW w:w="900" w:type="dxa"/>
+          </w:tcPr>
+          <w:p>
+            <w:pPr>
+              <w:cnfStyle w:val="000000000000" w:firstRow="0" w:lastRow="0" w:firstColumn="0" w:lastColumn="0" w:oddVBand="0" w:evenVBand="0" w:oddHBand="0" w:evenHBand="0" w:firstRowFirstColumn="0" w:firstRowLastColumn="0" w:lastRowFirstColumn="0" w:lastRowLastColumn="0"/>
+            </w:pPr>
+            <w:r>
+              <w:t>P6-1, P10-1</w:t>
+            </w:r>
+          </w:p>
+        </w:tc>
+        <w:tc>
+          <w:tcPr>
+            <w:tcW w:w="3420" w:type="dxa"/>
+          </w:tcPr>
+          <w:p>
+            <w:pPr>
+              <w:cnfStyle w:val="000000000000" w:firstRow="0" w:lastRow="0" w:firstColumn="0" w:lastColumn="0" w:oddVBand="0" w:evenVBand="0" w:oddHBand="0" w:evenHBand="0" w:firstRowFirstColumn="0" w:firstRowLastColumn="0" w:lastRowFirstColumn="0" w:lastRowLastColumn="0"/>
+            </w:pPr>
+            <w:r>
+              <w:t>Create RSVP Guest List page, Flask route, and dashboard navigation.</w:t>
+            </w:r>
+          </w:p>
+        </w:tc>
+        <w:tc>
+          <w:tcPr>
+            <w:tcW w:w="4135" w:type="dxa"/>
+          </w:tcPr>
+          <w:p>
+            <w:pPr>
+              <w:cnfStyle w:val="000000000000" w:firstRow="0" w:lastRow="0" w:firstColumn="0" w:lastColumn="0" w:oddVBand="0" w:evenVBand="0" w:oddHBand="0" w:evenHBand="0" w:firstRowFirstColumn="0" w:firstRowLastColumn="0" w:lastRowFirstColumn="0" w:lastRowLastColumn="0"/>
+            </w:pPr>
+            <w:r>
+              <w:t xml:space="preserve">RSVP Guest List is </w:t>
+            </w:r>
+            <w:r>
+              <w:t xml:space="preserve">available </w:t>
+            </w:r>
+            <w:r>
+              <w:t>from dashboard.</w:t>
+            </w:r>
+          </w:p>
+        </w:tc>
+      </w:tr>
+      <w:tr>
+        <w:trPr>
+          <w:cnfStyle w:val="000000100000" w:firstRow="0" w:lastRow="0" w:firstColumn="0" w:lastColumn="0" w:oddVBand="0" w:evenVBand="0" w:oddHBand="1" w:evenHBand="0" w:firstRowFirstColumn="0" w:firstRowLastColumn="0" w:lastRowFirstColumn="0" w:lastRowLastColumn="0"/>
+        </w:trPr>
+        <w:tc>
+          <w:tcPr>
+            <w:cnfStyle w:val="001000000000" w:firstRow="0" w:lastRow="0" w:firstColumn="1" w:lastColumn="0" w:oddVBand="0" w:evenVBand="0" w:oddHBand="0" w:evenHBand="0" w:firstRowFirstColumn="0" w:firstRowLastColumn="0" w:lastRowFirstColumn="0" w:lastRowLastColumn="0"/>
+            <w:tcW w:w="895" w:type="dxa"/>
+          </w:tcPr>
+          <w:p>
+            <w:r>
+              <w:lastRenderedPageBreak/>
+              <w:t>S2-11</w:t>
+            </w:r>
+          </w:p>
+        </w:tc>
+        <w:tc>
+          <w:tcPr>
+            <w:tcW w:w="900" w:type="dxa"/>
+          </w:tcPr>
+          <w:p>
+            <w:pPr>
+              <w:cnfStyle w:val="000000100000" w:firstRow="0" w:lastRow="0" w:firstColumn="0" w:lastColumn="0" w:oddVBand="0" w:evenVBand="0" w:oddHBand="1" w:evenHBand="0" w:firstRowFirstColumn="0" w:firstRowLastColumn="0" w:lastRowFirstColumn="0" w:lastRowLastColumn="0"/>
+            </w:pPr>
+            <w:r>
+              <w:t>P6-2</w:t>
+            </w:r>
+          </w:p>
+          <w:p>
+            <w:pPr>
+              <w:cnfStyle w:val="000000100000" w:firstRow="0" w:lastRow="0" w:firstColumn="0" w:lastColumn="0" w:oddVBand="0" w:evenVBand="0" w:oddHBand="1" w:evenHBand="0" w:firstRowFirstColumn="0" w:firstRowLastColumn="0" w:lastRowFirstColumn="0" w:lastRowLastColumn="0"/>
+            </w:pPr>
+          </w:p>
+        </w:tc>
+        <w:tc>
+          <w:tcPr>
+            <w:tcW w:w="3420" w:type="dxa"/>
+          </w:tcPr>
+          <w:p>
+            <w:pPr>
+              <w:cnfStyle w:val="000000100000" w:firstRow="0" w:lastRow="0" w:firstColumn="0" w:lastColumn="0" w:oddVBand="0" w:evenVBand="0" w:oddHBand="1" w:evenHBand="0" w:firstRowFirstColumn="0" w:firstRowLastColumn="0" w:lastRowFirstColumn="0" w:lastRowLastColumn="0"/>
+            </w:pPr>
+            <w:r>
+              <w:t>Retrieve and display current user's invitation at top of RSVP Guest List.</w:t>
+            </w:r>
+          </w:p>
+        </w:tc>
+        <w:tc>
+          <w:tcPr>
+            <w:tcW w:w="4135" w:type="dxa"/>
+          </w:tcPr>
+          <w:p>
+            <w:pPr>
+              <w:cnfStyle w:val="000000100000" w:firstRow="0" w:lastRow="0" w:firstColumn="0" w:lastColumn="0" w:oddVBand="0" w:evenVBand="0" w:oddHBand="1" w:evenHBand="0" w:firstRowFirstColumn="0" w:firstRowLastColumn="0" w:lastRowFirstColumn="0" w:lastRowLastColumn="0"/>
+            </w:pPr>
+            <w:r>
+              <w:t xml:space="preserve">Correct invitation and RSVP statuses always display </w:t>
+            </w:r>
+            <w:r>
+              <w:t>at top</w:t>
+            </w:r>
+            <w:r>
+              <w:t xml:space="preserve"> for current user.</w:t>
+            </w:r>
+          </w:p>
+        </w:tc>
+      </w:tr>
+      <w:tr>
+        <w:tc>
+          <w:tcPr>
+            <w:cnfStyle w:val="001000000000" w:firstRow="0" w:lastRow="0" w:firstColumn="1" w:lastColumn="0" w:oddVBand="0" w:evenVBand="0" w:oddHBand="0" w:evenHBand="0" w:firstRowFirstColumn="0" w:firstRowLastColumn="0" w:lastRowFirstColumn="0" w:lastRowLastColumn="0"/>
+            <w:tcW w:w="895" w:type="dxa"/>
+          </w:tcPr>
+          <w:p>
+            <w:r>
+              <w:t>S2-12</w:t>
+            </w:r>
+          </w:p>
+        </w:tc>
+        <w:tc>
+          <w:tcPr>
+            <w:tcW w:w="900" w:type="dxa"/>
+          </w:tcPr>
+          <w:p>
+            <w:pPr>
+              <w:cnfStyle w:val="000000000000" w:firstRow="0" w:lastRow="0" w:firstColumn="0" w:lastColumn="0" w:oddVBand="0" w:evenVBand="0" w:oddHBand="0" w:evenHBand="0" w:firstRowFirstColumn="0" w:firstRowLastColumn="0" w:lastRowFirstColumn="0" w:lastRowLastColumn="0"/>
+            </w:pPr>
+            <w:r>
+              <w:t>P10-2</w:t>
+            </w:r>
+          </w:p>
+        </w:tc>
+        <w:tc>
+          <w:tcPr>
+            <w:tcW w:w="3420" w:type="dxa"/>
+          </w:tcPr>
+          <w:p>
+            <w:pPr>
+              <w:cnfStyle w:val="000000000000" w:firstRow="0" w:lastRow="0" w:firstColumn="0" w:lastColumn="0" w:oddVBand="0" w:evenVBand="0" w:oddHBand="0" w:evenHBand="0" w:firstRowFirstColumn="0" w:firstRowLastColumn="0" w:lastRowFirstColumn="0" w:lastRowLastColumn="0"/>
+            </w:pPr>
+            <w:r>
+              <w:t>Retrieve all invited guest names from database.</w:t>
+            </w:r>
+          </w:p>
+        </w:tc>
+        <w:tc>
+          <w:tcPr>
+            <w:tcW w:w="4135" w:type="dxa"/>
+          </w:tcPr>
+          <w:p>
+            <w:pPr>
+              <w:cnfStyle w:val="000000000000" w:firstRow="0" w:lastRow="0" w:firstColumn="0" w:lastColumn="0" w:oddVBand="0" w:evenVBand="0" w:oddHBand="0" w:evenHBand="0" w:firstRowFirstColumn="0" w:firstRowLastColumn="0" w:lastRowFirstColumn="0" w:lastRowLastColumn="0"/>
+            </w:pPr>
+            <w:r>
+              <w:t>All invited guests display without duplicates.</w:t>
+            </w:r>
+          </w:p>
+        </w:tc>
+      </w:tr>
+      <w:tr>
+        <w:trPr>
+          <w:cnfStyle w:val="000000100000" w:firstRow="0" w:lastRow="0" w:firstColumn="0" w:lastColumn="0" w:oddVBand="0" w:evenVBand="0" w:oddHBand="1" w:evenHBand="0" w:firstRowFirstColumn="0" w:firstRowLastColumn="0" w:lastRowFirstColumn="0" w:lastRowLastColumn="0"/>
+        </w:trPr>
+        <w:tc>
+          <w:tcPr>
+            <w:cnfStyle w:val="001000000000" w:firstRow="0" w:lastRow="0" w:firstColumn="1" w:lastColumn="0" w:oddVBand="0" w:evenVBand="0" w:oddHBand="0" w:evenHBand="0" w:firstRowFirstColumn="0" w:firstRowLastColumn="0" w:lastRowFirstColumn="0" w:lastRowLastColumn="0"/>
+            <w:tcW w:w="895" w:type="dxa"/>
+          </w:tcPr>
+          <w:p>
+            <w:r>
+              <w:t>S2-13</w:t>
+            </w:r>
+          </w:p>
+        </w:tc>
+        <w:tc>
+          <w:tcPr>
+            <w:tcW w:w="900" w:type="dxa"/>
+          </w:tcPr>
+          <w:p>
+            <w:pPr>
+              <w:cnfStyle w:val="000000100000" w:firstRow="0" w:lastRow="0" w:firstColumn="0" w:lastColumn="0" w:oddVBand="0" w:evenVBand="0" w:oddHBand="1" w:evenHBand="0" w:firstRowFirstColumn="0" w:firstRowLastColumn="0" w:lastRowFirstColumn="0" w:lastRowLastColumn="0"/>
+            </w:pPr>
+            <w:r>
+              <w:t>P10-3</w:t>
+            </w:r>
+          </w:p>
+        </w:tc>
+        <w:tc>
+          <w:tcPr>
+            <w:tcW w:w="3420" w:type="dxa"/>
+          </w:tcPr>
+          <w:p>
+            <w:pPr>
+              <w:cnfStyle w:val="000000100000" w:firstRow="0" w:lastRow="0" w:firstColumn="0" w:lastColumn="0" w:oddVBand="0" w:evenVBand="0" w:oddHBand="1" w:evenHBand="0" w:firstRowFirstColumn="0" w:firstRowLastColumn="0" w:lastRowFirstColumn="0" w:lastRowLastColumn="0"/>
+            </w:pPr>
+            <w:r>
+              <w:t>Retrieve and display RSVP status for every invited guest.</w:t>
+            </w:r>
+          </w:p>
+        </w:tc>
+        <w:tc>
+          <w:tcPr>
+            <w:tcW w:w="4135" w:type="dxa"/>
+          </w:tcPr>
+          <w:p>
+            <w:pPr>
+              <w:cnfStyle w:val="000000100000" w:firstRow="0" w:lastRow="0" w:firstColumn="0" w:lastColumn="0" w:oddVBand="0" w:evenVBand="0" w:oddHBand="1" w:evenHBand="0" w:firstRowFirstColumn="0" w:firstRowLastColumn="0" w:lastRowFirstColumn="0" w:lastRowLastColumn="0"/>
+            </w:pPr>
+            <w:r>
+              <w:t>Every invited guest displays their current RSVP status.</w:t>
+            </w:r>
+          </w:p>
+        </w:tc>
+      </w:tr>
+      <w:tr>
+        <w:tc>
+          <w:tcPr>
+            <w:cnfStyle w:val="001000000000" w:firstRow="0" w:lastRow="0" w:firstColumn="1" w:lastColumn="0" w:oddVBand="0" w:evenVBand="0" w:oddHBand="0" w:evenHBand="0" w:firstRowFirstColumn="0" w:firstRowLastColumn="0" w:lastRowFirstColumn="0" w:lastRowLastColumn="0"/>
+            <w:tcW w:w="895" w:type="dxa"/>
+          </w:tcPr>
+          <w:p>
+            <w:r>
+              <w:t>S2-14</w:t>
+            </w:r>
+          </w:p>
+        </w:tc>
+        <w:tc>
+          <w:tcPr>
+            <w:tcW w:w="900" w:type="dxa"/>
+          </w:tcPr>
+          <w:p>
+            <w:pPr>
+              <w:cnfStyle w:val="000000000000" w:firstRow="0" w:lastRow="0" w:firstColumn="0" w:lastColumn="0" w:oddVBand="0" w:evenVBand="0" w:oddHBand="0" w:evenHBand="0" w:firstRowFirstColumn="0" w:firstRowLastColumn="0" w:lastRowFirstColumn="0" w:lastRowLastColumn="0"/>
+            </w:pPr>
+            <w:r>
+              <w:t>P10-4</w:t>
+            </w:r>
+          </w:p>
+        </w:tc>
+        <w:tc>
+          <w:tcPr>
+            <w:tcW w:w="3420" w:type="dxa"/>
+          </w:tcPr>
+          <w:p>
+            <w:pPr>
+              <w:cnfStyle w:val="000000000000" w:firstRow="0" w:lastRow="0" w:firstColumn="0" w:lastColumn="0" w:oddVBand="0" w:evenVBand="0" w:oddHBand="0" w:evenHBand="0" w:firstRowFirstColumn="0" w:firstRowLastColumn="0" w:lastRowFirstColumn="0" w:lastRowLastColumn="0"/>
+            </w:pPr>
+            <w:r>
+              <w:t>Identify Attending, Not Attending, and Not Responded statuses.</w:t>
+            </w:r>
+          </w:p>
+        </w:tc>
+        <w:tc>
+          <w:tcPr>
+            <w:tcW w:w="4135" w:type="dxa"/>
+          </w:tcPr>
+          <w:p>
+            <w:pPr>
+              <w:cnfStyle w:val="000000000000" w:firstRow="0" w:lastRow="0" w:firstColumn="0" w:lastColumn="0" w:oddVBand="0" w:evenVBand="0" w:oddHBand="0" w:evenHBand="0" w:firstRowFirstColumn="0" w:firstRowLastColumn="0" w:lastRowFirstColumn="0" w:lastRowLastColumn="0"/>
+            </w:pPr>
+            <w:r>
+              <w:t>All three RSVP statuses are clearly distinguishable.</w:t>
+            </w:r>
+          </w:p>
+        </w:tc>
+      </w:tr>
+      <w:tr>
+        <w:trPr>
+          <w:cnfStyle w:val="000000100000" w:firstRow="0" w:lastRow="0" w:firstColumn="0" w:lastColumn="0" w:oddVBand="0" w:evenVBand="0" w:oddHBand="1" w:evenHBand="0" w:firstRowFirstColumn="0" w:firstRowLastColumn="0" w:lastRowFirstColumn="0" w:lastRowLastColumn="0"/>
+        </w:trPr>
+        <w:tc>
+          <w:tcPr>
+            <w:cnfStyle w:val="001000000000" w:firstRow="0" w:lastRow="0" w:firstColumn="1" w:lastColumn="0" w:oddVBand="0" w:evenVBand="0" w:oddHBand="0" w:evenHBand="0" w:firstRowFirstColumn="0" w:firstRowLastColumn="0" w:lastRowFirstColumn="0" w:lastRowLastColumn="0"/>
+            <w:tcW w:w="895" w:type="dxa"/>
+          </w:tcPr>
+          <w:p>
+            <w:r>
+              <w:t>S2-15</w:t>
+            </w:r>
+          </w:p>
+        </w:tc>
+        <w:tc>
+          <w:tcPr>
+            <w:tcW w:w="900" w:type="dxa"/>
+          </w:tcPr>
+          <w:p>
+            <w:pPr>
+              <w:cnfStyle w:val="000000100000" w:firstRow="0" w:lastRow="0" w:firstColumn="0" w:lastColumn="0" w:oddVBand="0" w:evenVBand="0" w:oddHBand="1" w:evenHBand="0" w:firstRowFirstColumn="0" w:firstRowLastColumn="0" w:lastRowFirstColumn="0" w:lastRowLastColumn="0"/>
+            </w:pPr>
+            <w:r>
+              <w:t>P10-5</w:t>
+            </w:r>
+          </w:p>
+        </w:tc>
+        <w:tc>
+          <w:tcPr>
+            <w:tcW w:w="3420" w:type="dxa"/>
+          </w:tcPr>
+          <w:p>
+            <w:pPr>
+              <w:cnfStyle w:val="000000100000" w:firstRow="0" w:lastRow="0" w:firstColumn="0" w:lastColumn="0" w:oddVBand="0" w:evenVBand="0" w:oddHBand="1" w:evenHBand="0" w:firstRowFirstColumn="0" w:firstRowLastColumn="0" w:lastRowFirstColumn="0" w:lastRowLastColumn="0"/>
+            </w:pPr>
+            <w:r>
+              <w:t>Retrieve current database information when RSVP Guest List loads.</w:t>
+            </w:r>
+          </w:p>
+        </w:tc>
+        <w:tc>
+          <w:tcPr>
+            <w:tcW w:w="4135" w:type="dxa"/>
+          </w:tcPr>
+          <w:p>
+            <w:pPr>
+              <w:cnfStyle w:val="000000100000" w:firstRow="0" w:lastRow="0" w:firstColumn="0" w:lastColumn="0" w:oddVBand="0" w:evenVBand="0" w:oddHBand="1" w:evenHBand="0" w:firstRowFirstColumn="0" w:firstRowLastColumn="0" w:lastRowFirstColumn="0" w:lastRowLastColumn="0"/>
+            </w:pPr>
+            <w:r>
+              <w:t>Guest list reflects saved RSVP information.</w:t>
+            </w:r>
+          </w:p>
+        </w:tc>
+      </w:tr>
+      <w:tr>
+        <w:tc>
+          <w:tcPr>
+            <w:cnfStyle w:val="001000000000" w:firstRow="0" w:lastRow="0" w:firstColumn="1" w:lastColumn="0" w:oddVBand="0" w:evenVBand="0" w:oddHBand="0" w:evenHBand="0" w:firstRowFirstColumn="0" w:firstRowLastColumn="0" w:lastRowFirstColumn="0" w:lastRowLastColumn="0"/>
+            <w:tcW w:w="895" w:type="dxa"/>
+          </w:tcPr>
+          <w:p>
+            <w:r>
+              <w:t>S2-16</w:t>
+            </w:r>
+          </w:p>
+        </w:tc>
+        <w:tc>
+          <w:tcPr>
+            <w:tcW w:w="900" w:type="dxa"/>
+          </w:tcPr>
+          <w:p>
+            <w:pPr>
+              <w:cnfStyle w:val="000000000000" w:firstRow="0" w:lastRow="0" w:firstColumn="0" w:lastColumn="0" w:oddVBand="0" w:evenVBand="0" w:oddHBand="0" w:evenHBand="0" w:firstRowFirstColumn="0" w:firstRowLastColumn="0" w:lastRowFirstColumn="0" w:lastRowLastColumn="0"/>
+            </w:pPr>
+            <w:r>
+              <w:t>P11-1</w:t>
+            </w:r>
+          </w:p>
+        </w:tc>
+        <w:tc>
+          <w:tcPr>
+            <w:tcW w:w="3420" w:type="dxa"/>
+          </w:tcPr>
+          <w:p>
+            <w:pPr>
+              <w:cnfStyle w:val="000000000000" w:firstRow="0" w:lastRow="0" w:firstColumn="0" w:lastColumn="0" w:oddVBand="0" w:evenVBand="0" w:oddHBand="0" w:evenHBand="0" w:firstRowFirstColumn="0" w:firstRowLastColumn="0" w:lastRowFirstColumn="0" w:lastRowLastColumn="0"/>
+            </w:pPr>
+            <w:r>
+              <w:t>Create Meal Selection List page, Flask route, and dashboard navigation.</w:t>
+            </w:r>
+          </w:p>
+        </w:tc>
+        <w:tc>
+          <w:tcPr>
+            <w:tcW w:w="4135" w:type="dxa"/>
+          </w:tcPr>
+          <w:p>
+            <w:pPr>
+              <w:cnfStyle w:val="000000000000" w:firstRow="0" w:lastRow="0" w:firstColumn="0" w:lastColumn="0" w:oddVBand="0" w:evenVBand="0" w:oddHBand="0" w:evenHBand="0" w:firstRowFirstColumn="0" w:firstRowLastColumn="0" w:lastRowFirstColumn="0" w:lastRowLastColumn="0"/>
+            </w:pPr>
+            <w:r>
+              <w:t xml:space="preserve">Meal Selection List is </w:t>
+            </w:r>
+            <w:r>
+              <w:t xml:space="preserve">available </w:t>
+            </w:r>
+            <w:r>
+              <w:t>from dashboard.</w:t>
+            </w:r>
+          </w:p>
+        </w:tc>
+      </w:tr>
+      <w:tr>
+        <w:trPr>
+          <w:cnfStyle w:val="000000100000" w:firstRow="0" w:lastRow="0" w:firstColumn="0" w:lastColumn="0" w:oddVBand="0" w:evenVBand="0" w:oddHBand="1" w:evenHBand="0" w:firstRowFirstColumn="0" w:firstRowLastColumn="0" w:lastRowFirstColumn="0" w:lastRowLastColumn="0"/>
+        </w:trPr>
+        <w:tc>
+          <w:tcPr>
+            <w:cnfStyle w:val="001000000000" w:firstRow="0" w:lastRow="0" w:firstColumn="1" w:lastColumn="0" w:oddVBand="0" w:evenVBand="0" w:oddHBand="0" w:evenHBand="0" w:firstRowFirstColumn="0" w:firstRowLastColumn="0" w:lastRowFirstColumn="0" w:lastRowLastColumn="0"/>
+            <w:tcW w:w="895" w:type="dxa"/>
+          </w:tcPr>
+          <w:p>
+            <w:r>
+              <w:t>S2-17</w:t>
+            </w:r>
+          </w:p>
+        </w:tc>
+        <w:tc>
+          <w:tcPr>
+            <w:tcW w:w="900" w:type="dxa"/>
+          </w:tcPr>
+          <w:p>
+            <w:pPr>
+              <w:cnfStyle w:val="000000100000" w:firstRow="0" w:lastRow="0" w:firstColumn="0" w:lastColumn="0" w:oddVBand="0" w:evenVBand="0" w:oddHBand="1" w:evenHBand="0" w:firstRowFirstColumn="0" w:firstRowLastColumn="0" w:lastRowFirstColumn="0" w:lastRowLastColumn="0"/>
+            </w:pPr>
+            <w:r>
+              <w:t>P11-2</w:t>
+            </w:r>
+          </w:p>
+          <w:p>
+            <w:pPr>
+              <w:cnfStyle w:val="000000100000" w:firstRow="0" w:lastRow="0" w:firstColumn="0" w:lastColumn="0" w:oddVBand="0" w:evenVBand="0" w:oddHBand="1" w:evenHBand="0" w:firstRowFirstColumn="0" w:firstRowLastColumn="0" w:lastRowFirstColumn="0" w:lastRowLastColumn="0"/>
+            </w:pPr>
+            <w:r>
+              <w:t>P11-4</w:t>
+            </w:r>
+          </w:p>
+        </w:tc>
+        <w:tc>
+          <w:tcPr>
+            <w:tcW w:w="3420" w:type="dxa"/>
+          </w:tcPr>
+          <w:p>
+            <w:pPr>
+              <w:cnfStyle w:val="000000100000" w:firstRow="0" w:lastRow="0" w:firstColumn="0" w:lastColumn="0" w:oddVBand="0" w:evenVBand="0" w:oddHBand="1" w:evenHBand="0" w:firstRowFirstColumn="0" w:firstRowLastColumn="0" w:lastRowFirstColumn="0" w:lastRowLastColumn="0"/>
+            </w:pPr>
+            <w:r>
+              <w:t>Retrieve attending guests with saved meal selections.</w:t>
+            </w:r>
+          </w:p>
+        </w:tc>
+        <w:tc>
+          <w:tcPr>
+            <w:tcW w:w="4135" w:type="dxa"/>
+          </w:tcPr>
+          <w:p>
+            <w:pPr>
+              <w:cnfStyle w:val="000000100000" w:firstRow="0" w:lastRow="0" w:firstColumn="0" w:lastColumn="0" w:oddVBand="0" w:evenVBand="0" w:oddHBand="1" w:evenHBand="0" w:firstRowFirstColumn="0" w:firstRowLastColumn="0" w:lastRowFirstColumn="0" w:lastRowLastColumn="0"/>
+            </w:pPr>
+            <w:r>
+              <w:t>Only attending guests with saved meals display in list.</w:t>
+            </w:r>
+          </w:p>
+        </w:tc>
+      </w:tr>
+      <w:tr>
+        <w:tc>
+          <w:tcPr>
+            <w:cnfStyle w:val="001000000000" w:firstRow="0" w:lastRow="0" w:firstColumn="1" w:lastColumn="0" w:oddVBand="0" w:evenVBand="0" w:oddHBand="0" w:evenHBand="0" w:firstRowFirstColumn="0" w:firstRowLastColumn="0" w:lastRowFirstColumn="0" w:lastRowLastColumn="0"/>
+            <w:tcW w:w="895" w:type="dxa"/>
+          </w:tcPr>
+          <w:p>
+            <w:r>
+              <w:t>S2-18</w:t>
+            </w:r>
+          </w:p>
+        </w:tc>
+        <w:tc>
+          <w:tcPr>
+            <w:tcW w:w="900" w:type="dxa"/>
+          </w:tcPr>
+          <w:p>
+            <w:pPr>
+              <w:cnfStyle w:val="000000000000" w:firstRow="0" w:lastRow="0" w:firstColumn="0" w:lastColumn="0" w:oddVBand="0" w:evenVBand="0" w:oddHBand="0" w:evenHBand="0" w:firstRowFirstColumn="0" w:firstRowLastColumn="0" w:lastRowFirstColumn="0" w:lastRowLastColumn="0"/>
+            </w:pPr>
+            <w:r>
+              <w:t>P11-3</w:t>
+            </w:r>
+          </w:p>
+        </w:tc>
+        <w:tc>
+          <w:tcPr>
+            <w:tcW w:w="3420" w:type="dxa"/>
+          </w:tcPr>
+          <w:p>
+            <w:pPr>
+              <w:cnfStyle w:val="000000000000" w:firstRow="0" w:lastRow="0" w:firstColumn="0" w:lastColumn="0" w:oddVBand="0" w:evenVBand="0" w:oddHBand="0" w:evenHBand="0" w:firstRowFirstColumn="0" w:firstRowLastColumn="0" w:lastRowFirstColumn="0" w:lastRowLastColumn="0"/>
+            </w:pPr>
+            <w:r>
+              <w:t>Display each attending guest's name and selected meal</w:t>
+            </w:r>
+          </w:p>
+        </w:tc>
+        <w:tc>
+          <w:tcPr>
+            <w:tcW w:w="4135" w:type="dxa"/>
+          </w:tcPr>
+          <w:p>
+            <w:pPr>
+              <w:cnfStyle w:val="000000000000" w:firstRow="0" w:lastRow="0" w:firstColumn="0" w:lastColumn="0" w:oddVBand="0" w:evenVBand="0" w:oddHBand="0" w:evenHBand="0" w:firstRowFirstColumn="0" w:firstRowLastColumn="0" w:lastRowFirstColumn="0" w:lastRowLastColumn="0"/>
+            </w:pPr>
+            <w:r>
+              <w:t>Correct meal displays beside each guest.</w:t>
+            </w:r>
+          </w:p>
+        </w:tc>
+      </w:tr>
+      <w:tr>
+        <w:trPr>
+          <w:cnfStyle w:val="000000100000" w:firstRow="0" w:lastRow="0" w:firstColumn="0" w:lastColumn="0" w:oddVBand="0" w:evenVBand="0" w:oddHBand="1" w:evenHBand="0" w:firstRowFirstColumn="0" w:firstRowLastColumn="0" w:lastRowFirstColumn="0" w:lastRowLastColumn="0"/>
+        </w:trPr>
+        <w:tc>
+          <w:tcPr>
+            <w:cnfStyle w:val="001000000000" w:firstRow="0" w:lastRow="0" w:firstColumn="1" w:lastColumn="0" w:oddVBand="0" w:evenVBand="0" w:oddHBand="0" w:evenHBand="0" w:firstRowFirstColumn="0" w:firstRowLastColumn="0" w:lastRowFirstColumn="0" w:lastRowLastColumn="0"/>
+            <w:tcW w:w="895" w:type="dxa"/>
+          </w:tcPr>
+          <w:p>
+            <w:r>
+              <w:t>S2-19</w:t>
+            </w:r>
+          </w:p>
+        </w:tc>
+        <w:tc>
+          <w:tcPr>
+            <w:tcW w:w="900" w:type="dxa"/>
+          </w:tcPr>
+          <w:p>
+            <w:pPr>
+              <w:cnfStyle w:val="000000100000" w:firstRow="0" w:lastRow="0" w:firstColumn="0" w:lastColumn="0" w:oddVBand="0" w:evenVBand="0" w:oddHBand="1" w:evenHBand="0" w:firstRowFirstColumn="0" w:firstRowLastColumn="0" w:lastRowFirstColumn="0" w:lastRowLastColumn="0"/>
+            </w:pPr>
+            <w:r>
+              <w:t>P11-5</w:t>
+            </w:r>
+          </w:p>
+        </w:tc>
+        <w:tc>
+          <w:tcPr>
+            <w:tcW w:w="3420" w:type="dxa"/>
+          </w:tcPr>
+          <w:p>
+            <w:pPr>
+              <w:cnfStyle w:val="000000100000" w:firstRow="0" w:lastRow="0" w:firstColumn="0" w:lastColumn="0" w:oddVBand="0" w:evenVBand="0" w:oddHBand="1" w:evenHBand="0" w:firstRowFirstColumn="0" w:firstRowLastColumn="0" w:lastRowFirstColumn="0" w:lastRowLastColumn="0"/>
+            </w:pPr>
+            <w:r>
+              <w:t>Test RSVP and Meal Lists with saved changes and different logged in invitations.</w:t>
+            </w:r>
+          </w:p>
+        </w:tc>
+        <w:tc>
+          <w:tcPr>
+            <w:tcW w:w="4135" w:type="dxa"/>
+          </w:tcPr>
+          <w:p>
+            <w:pPr>
+              <w:cnfStyle w:val="000000100000" w:firstRow="0" w:lastRow="0" w:firstColumn="0" w:lastColumn="0" w:oddVBand="0" w:evenVBand="0" w:oddHBand="1" w:evenHBand="0" w:firstRowFirstColumn="0" w:firstRowLastColumn="0" w:lastRowFirstColumn="0" w:lastRowLastColumn="0"/>
+            </w:pPr>
+            <w:r>
+              <w:t xml:space="preserve">Both lists reflect current </w:t>
+            </w:r>
+            <w:proofErr w:type="gramStart"/>
+            <w:r>
+              <w:t>data</w:t>
+            </w:r>
+            <w:proofErr w:type="gramEnd"/>
+            <w:r>
+              <w:t xml:space="preserve"> and correct user's invitation is highlighted.</w:t>
+            </w:r>
+          </w:p>
+        </w:tc>
+      </w:tr>
+    </w:tbl>
+    <w:p/>
+    <w:p/>
+    <w:p/>
+    <w:p/>
+    <w:p/>
+    <w:p/>
+    <w:p/>
+    <w:p/>
+    <w:p/>
+    <w:p/>
+    <w:p/>
+    <w:p/>
+    <w:p/>
+    <w:p>
+      <w:pPr>
+        <w:pStyle w:val="Heading3"/>
+        <w:rPr>
+          <w:rFonts w:ascii="Times New Roman" w:eastAsia="Times New Roman" w:hAnsi="Times New Roman" w:cs="Times New Roman"/>
+          <w:b/>
+          <w:bCs/>
+          <w:color w:val="auto"/>
+          <w:kern w:val="0"/>
+          <w:sz w:val="27"/>
+          <w:szCs w:val="27"/>
+          <w:lang w:eastAsia="en-US"/>
+          <w14:ligatures w14:val="none"/>
+        </w:rPr>
+      </w:pPr>
+    </w:p>
+    <w:p>
+      <w:pPr>
+        <w:rPr>
+          <w:lang w:eastAsia="en-US"/>
+        </w:rPr>
+      </w:pPr>
+    </w:p>
+    <w:p>
+      <w:pPr>
+        <w:rPr>
+          <w:lang w:eastAsia="en-US"/>
+        </w:rPr>
+      </w:pPr>
+    </w:p>
+    <w:p>
+      <w:pPr>
+        <w:rPr>
+          <w:lang w:eastAsia="en-US"/>
+        </w:rPr>
+      </w:pPr>
+    </w:p>
+    <w:tbl>
+      <w:tblPr>
+        <w:tblStyle w:val="PlainTable1"/>
+        <w:tblW w:w="0" w:type="auto"/>
+        <w:tblLook w:val="04A0" w:firstRow="1" w:lastRow="0" w:firstColumn="1" w:lastColumn="0" w:noHBand="0" w:noVBand="1"/>
+      </w:tblPr>
+      <w:tblGrid>
+        <w:gridCol w:w="895"/>
+        <w:gridCol w:w="1388"/>
+        <w:gridCol w:w="6970"/>
+      </w:tblGrid>
+      <w:tr>
+        <w:trPr>
+          <w:cnfStyle w:val="100000000000" w:firstRow="1" w:lastRow="0" w:firstColumn="0" w:lastColumn="0" w:oddVBand="0" w:evenVBand="0" w:oddHBand="0" w:evenHBand="0" w:firstRowFirstColumn="0" w:firstRowLastColumn="0" w:lastRowFirstColumn="0" w:lastRowLastColumn="0"/>
+        </w:trPr>
+        <w:tc>
+          <w:tcPr>
+            <w:cnfStyle w:val="001000000000" w:firstRow="0" w:lastRow="0" w:firstColumn="1" w:lastColumn="0" w:oddVBand="0" w:evenVBand="0" w:oddHBand="0" w:evenHBand="0" w:firstRowFirstColumn="0" w:firstRowLastColumn="0" w:lastRowFirstColumn="0" w:lastRowLastColumn="0"/>
+            <w:tcW w:w="895" w:type="dxa"/>
+            <w:hideMark/>
+          </w:tcPr>
+          <w:p>
+            <w:pPr>
+              <w:jc w:val="center"/>
+              <w:rPr>
+                <w:b w:val="0"/>
+                <w:bCs w:val="0"/>
+              </w:rPr>
+            </w:pPr>
+            <w:r>
+              <w:rPr>
+                <w:b w:val="0"/>
+                <w:bCs w:val="0"/>
+              </w:rPr>
+              <w:t>ID</w:t>
+            </w:r>
+          </w:p>
+        </w:tc>
+        <w:tc>
+          <w:tcPr>
+            <w:tcW w:w="1388" w:type="dxa"/>
+            <w:hideMark/>
+          </w:tcPr>
+          <w:p>
+            <w:pPr>
+              <w:jc w:val="center"/>
+              <w:cnfStyle w:val="100000000000" w:firstRow="1" w:lastRow="0" w:firstColumn="0" w:lastColumn="0" w:oddVBand="0" w:evenVBand="0" w:oddHBand="0" w:evenHBand="0" w:firstRowFirstColumn="0" w:firstRowLastColumn="0" w:lastRowFirstColumn="0" w:lastRowLastColumn="0"/>
+              <w:rPr>
+                <w:b w:val="0"/>
+                <w:bCs w:val="0"/>
+              </w:rPr>
+            </w:pPr>
+            <w:r>
+              <w:rPr>
+                <w:b w:val="0"/>
+                <w:bCs w:val="0"/>
+              </w:rPr>
+              <w:t>Label</w:t>
+            </w:r>
+          </w:p>
+        </w:tc>
+        <w:tc>
+          <w:tcPr>
+            <w:tcW w:w="6970" w:type="dxa"/>
+            <w:hideMark/>
+          </w:tcPr>
+          <w:p>
+            <w:pPr>
+              <w:jc w:val="center"/>
+              <w:cnfStyle w:val="100000000000" w:firstRow="1" w:lastRow="0" w:firstColumn="0" w:lastColumn="0" w:oddVBand="0" w:evenVBand="0" w:oddHBand="0" w:evenHBand="0" w:firstRowFirstColumn="0" w:firstRowLastColumn="0" w:lastRowFirstColumn="0" w:lastRowLastColumn="0"/>
+              <w:rPr>
+                <w:b w:val="0"/>
+                <w:bCs w:val="0"/>
+              </w:rPr>
+            </w:pPr>
+            <w:r>
+              <w:rPr>
+                <w:b w:val="0"/>
+                <w:bCs w:val="0"/>
+              </w:rPr>
+              <w:t>Info</w:t>
+            </w:r>
+          </w:p>
+        </w:tc>
+      </w:tr>
+      <w:tr>
+        <w:trPr>
+          <w:cnfStyle w:val="000000100000" w:firstRow="0" w:lastRow="0" w:firstColumn="0" w:lastColumn="0" w:oddVBand="0" w:evenVBand="0" w:oddHBand="1" w:evenHBand="0" w:firstRowFirstColumn="0" w:firstRowLastColumn="0" w:lastRowFirstColumn="0" w:lastRowLastColumn="0"/>
+        </w:trPr>
+        <w:tc>
+          <w:tcPr>
+            <w:cnfStyle w:val="001000000000" w:firstRow="0" w:lastRow="0" w:firstColumn="1" w:lastColumn="0" w:oddVBand="0" w:evenVBand="0" w:oddHBand="0" w:evenHBand="0" w:firstRowFirstColumn="0" w:firstRowLastColumn="0" w:lastRowFirstColumn="0" w:lastRowLastColumn="0"/>
+            <w:tcW w:w="895" w:type="dxa"/>
+            <w:hideMark/>
+          </w:tcPr>
+          <w:p>
+            <w:pPr>
+              <w:rPr>
+                <w:b w:val="0"/>
+                <w:bCs w:val="0"/>
+              </w:rPr>
+            </w:pPr>
+            <w:r>
+              <w:rPr>
+                <w:b w:val="0"/>
+                <w:bCs w:val="0"/>
+              </w:rPr>
+              <w:t>P13</w:t>
+            </w:r>
+          </w:p>
+        </w:tc>
+        <w:tc>
+          <w:tcPr>
+            <w:tcW w:w="1388" w:type="dxa"/>
+            <w:hideMark/>
+          </w:tcPr>
+          <w:p>
+            <w:pPr>
+              <w:cnfStyle w:val="000000100000" w:firstRow="0" w:lastRow="0" w:firstColumn="0" w:lastColumn="0" w:oddVBand="0" w:evenVBand="0" w:oddHBand="1" w:evenHBand="0" w:firstRowFirstColumn="0" w:firstRowLastColumn="0" w:lastRowFirstColumn="0" w:lastRowLastColumn="0"/>
+            </w:pPr>
+            <w:r>
+              <w:t>User Story</w:t>
+            </w:r>
+          </w:p>
+        </w:tc>
+        <w:tc>
+          <w:tcPr>
+            <w:tcW w:w="6970" w:type="dxa"/>
+            <w:hideMark/>
+          </w:tcPr>
+          <w:p>
+            <w:pPr>
+              <w:cnfStyle w:val="000000100000" w:firstRow="0" w:lastRow="0" w:firstColumn="0" w:lastColumn="0" w:oddVBand="0" w:evenVBand="0" w:oddHBand="1" w:evenHBand="0" w:firstRowFirstColumn="0" w:firstRowLastColumn="0" w:lastRowFirstColumn="0" w:lastRowLastColumn="0"/>
+            </w:pPr>
+            <w:r>
+              <w:t>As a wedding couple, we want to manage our reception meal options through an administration page, so that we can update meal information and control which meals are available for our guests to select.</w:t>
+            </w:r>
+          </w:p>
+        </w:tc>
+      </w:tr>
+      <w:tr>
+        <w:tc>
+          <w:tcPr>
+            <w:cnfStyle w:val="001000000000" w:firstRow="0" w:lastRow="0" w:firstColumn="1" w:lastColumn="0" w:oddVBand="0" w:evenVBand="0" w:oddHBand="0" w:evenHBand="0" w:firstRowFirstColumn="0" w:firstRowLastColumn="0" w:lastRowFirstColumn="0" w:lastRowLastColumn="0"/>
+            <w:tcW w:w="895" w:type="dxa"/>
+            <w:hideMark/>
+          </w:tcPr>
+          <w:p>
+            <w:pPr>
+              <w:rPr>
+                <w:b w:val="0"/>
+                <w:bCs w:val="0"/>
+              </w:rPr>
+            </w:pPr>
+            <w:r>
+              <w:rPr>
+                <w:b w:val="0"/>
+                <w:bCs w:val="0"/>
+              </w:rPr>
+              <w:t>P13-1</w:t>
+            </w:r>
+          </w:p>
+        </w:tc>
+        <w:tc>
+          <w:tcPr>
+            <w:tcW w:w="1388" w:type="dxa"/>
+            <w:hideMark/>
+          </w:tcPr>
+          <w:p>
+            <w:pPr>
+              <w:cnfStyle w:val="000000000000" w:firstRow="0" w:lastRow="0" w:firstColumn="0" w:lastColumn="0" w:oddVBand="0" w:evenVBand="0" w:oddHBand="0" w:evenHBand="0" w:firstRowFirstColumn="0" w:firstRowLastColumn="0" w:lastRowFirstColumn="0" w:lastRowLastColumn="0"/>
+            </w:pPr>
+            <w:r>
+              <w:t>Tangible Needs</w:t>
+            </w:r>
+          </w:p>
+        </w:tc>
+        <w:tc>
+          <w:tcPr>
+            <w:tcW w:w="6970" w:type="dxa"/>
+            <w:hideMark/>
+          </w:tcPr>
+          <w:p>
+            <w:pPr>
+              <w:cnfStyle w:val="000000000000" w:firstRow="0" w:lastRow="0" w:firstColumn="0" w:lastColumn="0" w:oddVBand="0" w:evenVBand="0" w:oddHBand="0" w:evenHBand="0" w:firstRowFirstColumn="0" w:firstRowLastColumn="0" w:lastRowFirstColumn="0" w:lastRowLastColumn="0"/>
+            </w:pPr>
+            <w:r>
+              <w:t>Create an administration page accessible only to the wedding couple.</w:t>
+            </w:r>
+          </w:p>
+        </w:tc>
+      </w:tr>
+      <w:tr>
+        <w:trPr>
+          <w:cnfStyle w:val="000000100000" w:firstRow="0" w:lastRow="0" w:firstColumn="0" w:lastColumn="0" w:oddVBand="0" w:evenVBand="0" w:oddHBand="1" w:evenHBand="0" w:firstRowFirstColumn="0" w:firstRowLastColumn="0" w:lastRowFirstColumn="0" w:lastRowLastColumn="0"/>
+        </w:trPr>
+        <w:tc>
+          <w:tcPr>
+            <w:cnfStyle w:val="001000000000" w:firstRow="0" w:lastRow="0" w:firstColumn="1" w:lastColumn="0" w:oddVBand="0" w:evenVBand="0" w:oddHBand="0" w:evenHBand="0" w:firstRowFirstColumn="0" w:firstRowLastColumn="0" w:lastRowFirstColumn="0" w:lastRowLastColumn="0"/>
+            <w:tcW w:w="895" w:type="dxa"/>
+            <w:hideMark/>
+          </w:tcPr>
+          <w:p>
+            <w:pPr>
+              <w:rPr>
+                <w:b w:val="0"/>
+                <w:bCs w:val="0"/>
+              </w:rPr>
+            </w:pPr>
+            <w:r>
+              <w:rPr>
+                <w:b w:val="0"/>
+                <w:bCs w:val="0"/>
+              </w:rPr>
+              <w:t>P13-2</w:t>
+            </w:r>
+          </w:p>
+        </w:tc>
+        <w:tc>
+          <w:tcPr>
+            <w:tcW w:w="1388" w:type="dxa"/>
+            <w:hideMark/>
+          </w:tcPr>
+          <w:p>
+            <w:pPr>
+              <w:cnfStyle w:val="000000100000" w:firstRow="0" w:lastRow="0" w:firstColumn="0" w:lastColumn="0" w:oddVBand="0" w:evenVBand="0" w:oddHBand="1" w:evenHBand="0" w:firstRowFirstColumn="0" w:firstRowLastColumn="0" w:lastRowFirstColumn="0" w:lastRowLastColumn="0"/>
+            </w:pPr>
+            <w:r>
+              <w:t>Tangible Needs</w:t>
+            </w:r>
+          </w:p>
+        </w:tc>
+        <w:tc>
+          <w:tcPr>
+            <w:tcW w:w="6970" w:type="dxa"/>
+            <w:hideMark/>
+          </w:tcPr>
+          <w:p>
+            <w:pPr>
+              <w:cnfStyle w:val="000000100000" w:firstRow="0" w:lastRow="0" w:firstColumn="0" w:lastColumn="0" w:oddVBand="0" w:evenVBand="0" w:oddHBand="1" w:evenHBand="0" w:firstRowFirstColumn="0" w:firstRowLastColumn="0" w:lastRowFirstColumn="0" w:lastRowLastColumn="0"/>
+            </w:pPr>
+            <w:r>
+              <w:t>Display all existing meal options retrieved from the database.</w:t>
+            </w:r>
+          </w:p>
+        </w:tc>
+      </w:tr>
+      <w:tr>
+        <w:tc>
+          <w:tcPr>
+            <w:cnfStyle w:val="001000000000" w:firstRow="0" w:lastRow="0" w:firstColumn="1" w:lastColumn="0" w:oddVBand="0" w:evenVBand="0" w:oddHBand="0" w:evenHBand="0" w:firstRowFirstColumn="0" w:firstRowLastColumn="0" w:lastRowFirstColumn="0" w:lastRowLastColumn="0"/>
+            <w:tcW w:w="895" w:type="dxa"/>
+            <w:hideMark/>
+          </w:tcPr>
+          <w:p>
+            <w:pPr>
+              <w:rPr>
+                <w:b w:val="0"/>
+                <w:bCs w:val="0"/>
+              </w:rPr>
+            </w:pPr>
+            <w:r>
+              <w:rPr>
+                <w:b w:val="0"/>
+                <w:bCs w:val="0"/>
+              </w:rPr>
+              <w:t>P13-3</w:t>
+            </w:r>
+          </w:p>
+        </w:tc>
+        <w:tc>
+          <w:tcPr>
+            <w:tcW w:w="1388" w:type="dxa"/>
+            <w:hideMark/>
+          </w:tcPr>
+          <w:p>
+            <w:pPr>
+              <w:cnfStyle w:val="000000000000" w:firstRow="0" w:lastRow="0" w:firstColumn="0" w:lastColumn="0" w:oddVBand="0" w:evenVBand="0" w:oddHBand="0" w:evenHBand="0" w:firstRowFirstColumn="0" w:firstRowLastColumn="0" w:lastRowFirstColumn="0" w:lastRowLastColumn="0"/>
+            </w:pPr>
+            <w:r>
+              <w:t>Tangible Needs</w:t>
+            </w:r>
+          </w:p>
+        </w:tc>
+        <w:tc>
+          <w:tcPr>
+            <w:tcW w:w="6970" w:type="dxa"/>
+            <w:hideMark/>
+          </w:tcPr>
+          <w:p>
+            <w:pPr>
+              <w:cnfStyle w:val="000000000000" w:firstRow="0" w:lastRow="0" w:firstColumn="0" w:lastColumn="0" w:oddVBand="0" w:evenVBand="0" w:oddHBand="0" w:evenHBand="0" w:firstRowFirstColumn="0" w:firstRowLastColumn="0" w:lastRowFirstColumn="0" w:lastRowLastColumn="0"/>
+            </w:pPr>
+            <w:r>
+              <w:t xml:space="preserve">Add a description column to the </w:t>
+            </w:r>
+            <w:proofErr w:type="spellStart"/>
+            <w:r>
+              <w:t>meal_options</w:t>
+            </w:r>
+            <w:proofErr w:type="spellEnd"/>
+            <w:r>
+              <w:t xml:space="preserve"> table to provide additional information about each meal.</w:t>
+            </w:r>
+          </w:p>
+        </w:tc>
+      </w:tr>
+      <w:tr>
+        <w:trPr>
+          <w:cnfStyle w:val="000000100000" w:firstRow="0" w:lastRow="0" w:firstColumn="0" w:lastColumn="0" w:oddVBand="0" w:evenVBand="0" w:oddHBand="1" w:evenHBand="0" w:firstRowFirstColumn="0" w:firstRowLastColumn="0" w:lastRowFirstColumn="0" w:lastRowLastColumn="0"/>
+        </w:trPr>
+        <w:tc>
+          <w:tcPr>
+            <w:cnfStyle w:val="001000000000" w:firstRow="0" w:lastRow="0" w:firstColumn="1" w:lastColumn="0" w:oddVBand="0" w:evenVBand="0" w:oddHBand="0" w:evenHBand="0" w:firstRowFirstColumn="0" w:firstRowLastColumn="0" w:lastRowFirstColumn="0" w:lastRowLastColumn="0"/>
+            <w:tcW w:w="895" w:type="dxa"/>
+            <w:hideMark/>
+          </w:tcPr>
+          <w:p>
+            <w:pPr>
+              <w:rPr>
+                <w:b w:val="0"/>
+                <w:bCs w:val="0"/>
+              </w:rPr>
+            </w:pPr>
+            <w:r>
+              <w:rPr>
+                <w:b w:val="0"/>
+                <w:bCs w:val="0"/>
+              </w:rPr>
+              <w:t>P13-4</w:t>
+            </w:r>
+          </w:p>
+        </w:tc>
+        <w:tc>
+          <w:tcPr>
+            <w:tcW w:w="1388" w:type="dxa"/>
+            <w:hideMark/>
+          </w:tcPr>
+          <w:p>
+            <w:pPr>
+              <w:cnfStyle w:val="000000100000" w:firstRow="0" w:lastRow="0" w:firstColumn="0" w:lastColumn="0" w:oddVBand="0" w:evenVBand="0" w:oddHBand="1" w:evenHBand="0" w:firstRowFirstColumn="0" w:firstRowLastColumn="0" w:lastRowFirstColumn="0" w:lastRowLastColumn="0"/>
+            </w:pPr>
+            <w:r>
+              <w:t>Tangible Needs</w:t>
+            </w:r>
+          </w:p>
+        </w:tc>
+        <w:tc>
+          <w:tcPr>
+            <w:tcW w:w="6970" w:type="dxa"/>
+            <w:hideMark/>
+          </w:tcPr>
+          <w:p>
+            <w:pPr>
+              <w:cnfStyle w:val="000000100000" w:firstRow="0" w:lastRow="0" w:firstColumn="0" w:lastColumn="0" w:oddVBand="0" w:evenVBand="0" w:oddHBand="1" w:evenHBand="0" w:firstRowFirstColumn="0" w:firstRowLastColumn="0" w:lastRowFirstColumn="0" w:lastRowLastColumn="0"/>
+            </w:pPr>
+            <w:r>
+              <w:t xml:space="preserve">Add an </w:t>
+            </w:r>
+            <w:proofErr w:type="spellStart"/>
+            <w:r>
+              <w:t>is_active</w:t>
+            </w:r>
+            <w:proofErr w:type="spellEnd"/>
+            <w:r>
+              <w:t xml:space="preserve"> column to identify whether a meal is available for selection.</w:t>
+            </w:r>
+          </w:p>
+        </w:tc>
+      </w:tr>
+      <w:tr>
+        <w:tc>
+          <w:tcPr>
+            <w:cnfStyle w:val="001000000000" w:firstRow="0" w:lastRow="0" w:firstColumn="1" w:lastColumn="0" w:oddVBand="0" w:evenVBand="0" w:oddHBand="0" w:evenHBand="0" w:firstRowFirstColumn="0" w:firstRowLastColumn="0" w:lastRowFirstColumn="0" w:lastRowLastColumn="0"/>
+            <w:tcW w:w="895" w:type="dxa"/>
+            <w:hideMark/>
+          </w:tcPr>
+          <w:p>
+            <w:pPr>
+              <w:rPr>
+                <w:b w:val="0"/>
+                <w:bCs w:val="0"/>
+              </w:rPr>
+            </w:pPr>
+            <w:r>
+              <w:rPr>
+                <w:b w:val="0"/>
+                <w:bCs w:val="0"/>
+              </w:rPr>
+              <w:t>P13-5</w:t>
+            </w:r>
+          </w:p>
+        </w:tc>
+        <w:tc>
+          <w:tcPr>
+            <w:tcW w:w="1388" w:type="dxa"/>
+            <w:hideMark/>
+          </w:tcPr>
+          <w:p>
+            <w:pPr>
+              <w:cnfStyle w:val="000000000000" w:firstRow="0" w:lastRow="0" w:firstColumn="0" w:lastColumn="0" w:oddVBand="0" w:evenVBand="0" w:oddHBand="0" w:evenHBand="0" w:firstRowFirstColumn="0" w:firstRowLastColumn="0" w:lastRowFirstColumn="0" w:lastRowLastColumn="0"/>
+            </w:pPr>
+            <w:r>
+              <w:t>Tangible Needs</w:t>
+            </w:r>
+          </w:p>
+        </w:tc>
+        <w:tc>
+          <w:tcPr>
+            <w:tcW w:w="6970" w:type="dxa"/>
+            <w:hideMark/>
+          </w:tcPr>
+          <w:p>
+            <w:pPr>
+              <w:cnfStyle w:val="000000000000" w:firstRow="0" w:lastRow="0" w:firstColumn="0" w:lastColumn="0" w:oddVBand="0" w:evenVBand="0" w:oddHBand="0" w:evenHBand="0" w:firstRowFirstColumn="0" w:firstRowLastColumn="0" w:lastRowFirstColumn="0" w:lastRowLastColumn="0"/>
+            </w:pPr>
+            <w:r>
+              <w:t>Allow the wedding couple to add new meal options and edit existing meal names and descriptions.</w:t>
+            </w:r>
+          </w:p>
+        </w:tc>
+      </w:tr>
+      <w:tr>
+        <w:trPr>
+          <w:cnfStyle w:val="000000100000" w:firstRow="0" w:lastRow="0" w:firstColumn="0" w:lastColumn="0" w:oddVBand="0" w:evenVBand="0" w:oddHBand="1" w:evenHBand="0" w:firstRowFirstColumn="0" w:firstRowLastColumn="0" w:lastRowFirstColumn="0" w:lastRowLastColumn="0"/>
+        </w:trPr>
+        <w:tc>
+          <w:tcPr>
+            <w:cnfStyle w:val="001000000000" w:firstRow="0" w:lastRow="0" w:firstColumn="1" w:lastColumn="0" w:oddVBand="0" w:evenVBand="0" w:oddHBand="0" w:evenHBand="0" w:firstRowFirstColumn="0" w:firstRowLastColumn="0" w:lastRowFirstColumn="0" w:lastRowLastColumn="0"/>
+            <w:tcW w:w="895" w:type="dxa"/>
+            <w:hideMark/>
+          </w:tcPr>
+          <w:p>
+            <w:pPr>
+              <w:rPr>
+                <w:b w:val="0"/>
+                <w:bCs w:val="0"/>
+              </w:rPr>
+            </w:pPr>
+            <w:r>
+              <w:rPr>
+                <w:b w:val="0"/>
+                <w:bCs w:val="0"/>
+              </w:rPr>
+              <w:t>P13-6</w:t>
+            </w:r>
+          </w:p>
+        </w:tc>
+        <w:tc>
+          <w:tcPr>
+            <w:tcW w:w="1388" w:type="dxa"/>
+            <w:hideMark/>
+          </w:tcPr>
+          <w:p>
+            <w:pPr>
+              <w:cnfStyle w:val="000000100000" w:firstRow="0" w:lastRow="0" w:firstColumn="0" w:lastColumn="0" w:oddVBand="0" w:evenVBand="0" w:oddHBand="1" w:evenHBand="0" w:firstRowFirstColumn="0" w:firstRowLastColumn="0" w:lastRowFirstColumn="0" w:lastRowLastColumn="0"/>
+            </w:pPr>
+            <w:r>
+              <w:t>Tangible Needs</w:t>
+            </w:r>
+          </w:p>
+        </w:tc>
+        <w:tc>
+          <w:tcPr>
+            <w:tcW w:w="6970" w:type="dxa"/>
+            <w:hideMark/>
+          </w:tcPr>
+          <w:p>
+            <w:pPr>
+              <w:cnfStyle w:val="000000100000" w:firstRow="0" w:lastRow="0" w:firstColumn="0" w:lastColumn="0" w:oddVBand="0" w:evenVBand="0" w:oddHBand="1" w:evenHBand="0" w:firstRowFirstColumn="0" w:firstRowLastColumn="0" w:lastRowFirstColumn="0" w:lastRowLastColumn="0"/>
+            </w:pPr>
+            <w:r>
+              <w:t>Allow the wedding couple to activate or deactivate meal options through the administration page.</w:t>
+            </w:r>
+          </w:p>
+        </w:tc>
+      </w:tr>
+      <w:tr>
+        <w:tc>
+          <w:tcPr>
+            <w:cnfStyle w:val="001000000000" w:firstRow="0" w:lastRow="0" w:firstColumn="1" w:lastColumn="0" w:oddVBand="0" w:evenVBand="0" w:oddHBand="0" w:evenHBand="0" w:firstRowFirstColumn="0" w:firstRowLastColumn="0" w:lastRowFirstColumn="0" w:lastRowLastColumn="0"/>
+            <w:tcW w:w="895" w:type="dxa"/>
+            <w:hideMark/>
+          </w:tcPr>
+          <w:p>
+            <w:pPr>
+              <w:rPr>
+                <w:b w:val="0"/>
+                <w:bCs w:val="0"/>
+              </w:rPr>
+            </w:pPr>
+            <w:r>
+              <w:rPr>
+                <w:b w:val="0"/>
+                <w:bCs w:val="0"/>
+              </w:rPr>
+              <w:t>P13-7</w:t>
+            </w:r>
+          </w:p>
+        </w:tc>
+        <w:tc>
+          <w:tcPr>
+            <w:tcW w:w="1388" w:type="dxa"/>
+            <w:hideMark/>
+          </w:tcPr>
+          <w:p>
+            <w:pPr>
+              <w:cnfStyle w:val="000000000000" w:firstRow="0" w:lastRow="0" w:firstColumn="0" w:lastColumn="0" w:oddVBand="0" w:evenVBand="0" w:oddHBand="0" w:evenHBand="0" w:firstRowFirstColumn="0" w:firstRowLastColumn="0" w:lastRowFirstColumn="0" w:lastRowLastColumn="0"/>
+            </w:pPr>
+            <w:r>
+              <w:t>Tangible Needs</w:t>
+            </w:r>
+          </w:p>
+        </w:tc>
+        <w:tc>
+          <w:tcPr>
+            <w:tcW w:w="6970" w:type="dxa"/>
+            <w:hideMark/>
+          </w:tcPr>
+          <w:p>
+            <w:pPr>
+              <w:cnfStyle w:val="000000000000" w:firstRow="0" w:lastRow="0" w:firstColumn="0" w:lastColumn="0" w:oddVBand="0" w:evenVBand="0" w:oddHBand="0" w:evenHBand="0" w:firstRowFirstColumn="0" w:firstRowLastColumn="0" w:lastRowFirstColumn="0" w:lastRowLastColumn="0"/>
+            </w:pPr>
+            <w:r>
+              <w:t>Display only active meal options on the guest Meal Selection Form.</w:t>
+            </w:r>
+          </w:p>
+        </w:tc>
+      </w:tr>
+      <w:tr>
+        <w:trPr>
+          <w:cnfStyle w:val="000000100000" w:firstRow="0" w:lastRow="0" w:firstColumn="0" w:lastColumn="0" w:oddVBand="0" w:evenVBand="0" w:oddHBand="1" w:evenHBand="0" w:firstRowFirstColumn="0" w:firstRowLastColumn="0" w:lastRowFirstColumn="0" w:lastRowLastColumn="0"/>
+        </w:trPr>
+        <w:tc>
+          <w:tcPr>
+            <w:cnfStyle w:val="001000000000" w:firstRow="0" w:lastRow="0" w:firstColumn="1" w:lastColumn="0" w:oddVBand="0" w:evenVBand="0" w:oddHBand="0" w:evenHBand="0" w:firstRowFirstColumn="0" w:firstRowLastColumn="0" w:lastRowFirstColumn="0" w:lastRowLastColumn="0"/>
+            <w:tcW w:w="895" w:type="dxa"/>
+            <w:hideMark/>
+          </w:tcPr>
+          <w:p>
+            <w:pPr>
+              <w:rPr>
+                <w:b w:val="0"/>
+                <w:bCs w:val="0"/>
+              </w:rPr>
+            </w:pPr>
+            <w:r>
+              <w:rPr>
+                <w:b w:val="0"/>
+                <w:bCs w:val="0"/>
+              </w:rPr>
+              <w:t>P13-8</w:t>
+            </w:r>
+          </w:p>
+        </w:tc>
+        <w:tc>
+          <w:tcPr>
+            <w:tcW w:w="1388" w:type="dxa"/>
+            <w:hideMark/>
+          </w:tcPr>
+          <w:p>
+            <w:pPr>
+              <w:cnfStyle w:val="000000100000" w:firstRow="0" w:lastRow="0" w:firstColumn="0" w:lastColumn="0" w:oddVBand="0" w:evenVBand="0" w:oddHBand="1" w:evenHBand="0" w:firstRowFirstColumn="0" w:firstRowLastColumn="0" w:lastRowFirstColumn="0" w:lastRowLastColumn="0"/>
+            </w:pPr>
+            <w:r>
+              <w:t>Tangible Needs</w:t>
+            </w:r>
+          </w:p>
+        </w:tc>
+        <w:tc>
+          <w:tcPr>
+            <w:tcW w:w="6970" w:type="dxa"/>
+            <w:hideMark/>
+          </w:tcPr>
+          <w:p>
+            <w:pPr>
+              <w:cnfStyle w:val="000000100000" w:firstRow="0" w:lastRow="0" w:firstColumn="0" w:lastColumn="0" w:oddVBand="0" w:evenVBand="0" w:oddHBand="1" w:evenHBand="0" w:firstRowFirstColumn="0" w:firstRowLastColumn="0" w:lastRowFirstColumn="0" w:lastRowLastColumn="0"/>
+            </w:pPr>
+            <w:r>
+              <w:t>Preserve previously saved meal selections when a meal option is deactivated.</w:t>
+            </w:r>
+          </w:p>
+        </w:tc>
+      </w:tr>
+      <w:tr>
+        <w:tc>
+          <w:tcPr>
+            <w:cnfStyle w:val="001000000000" w:firstRow="0" w:lastRow="0" w:firstColumn="1" w:lastColumn="0" w:oddVBand="0" w:evenVBand="0" w:oddHBand="0" w:evenHBand="0" w:firstRowFirstColumn="0" w:firstRowLastColumn="0" w:lastRowFirstColumn="0" w:lastRowLastColumn="0"/>
+            <w:tcW w:w="895" w:type="dxa"/>
+            <w:hideMark/>
+          </w:tcPr>
+          <w:p>
+            <w:pPr>
+              <w:rPr>
+                <w:b w:val="0"/>
+                <w:bCs w:val="0"/>
+              </w:rPr>
+            </w:pPr>
+            <w:r>
+              <w:rPr>
+                <w:b w:val="0"/>
+                <w:bCs w:val="0"/>
+              </w:rPr>
+              <w:t>P13-9</w:t>
+            </w:r>
+          </w:p>
+        </w:tc>
+        <w:tc>
+          <w:tcPr>
+            <w:tcW w:w="1388" w:type="dxa"/>
+            <w:hideMark/>
+          </w:tcPr>
+          <w:p>
+            <w:pPr>
+              <w:cnfStyle w:val="000000000000" w:firstRow="0" w:lastRow="0" w:firstColumn="0" w:lastColumn="0" w:oddVBand="0" w:evenVBand="0" w:oddHBand="0" w:evenHBand="0" w:firstRowFirstColumn="0" w:firstRowLastColumn="0" w:lastRowFirstColumn="0" w:lastRowLastColumn="0"/>
+            </w:pPr>
+            <w:r>
+              <w:t>Tangible Needs</w:t>
+            </w:r>
+          </w:p>
+        </w:tc>
+        <w:tc>
+          <w:tcPr>
+            <w:tcW w:w="6970" w:type="dxa"/>
+            <w:hideMark/>
+          </w:tcPr>
+          <w:p>
+            <w:pPr>
+              <w:cnfStyle w:val="000000000000" w:firstRow="0" w:lastRow="0" w:firstColumn="0" w:lastColumn="0" w:oddVBand="0" w:evenVBand="0" w:oddHBand="0" w:evenHBand="0" w:firstRowFirstColumn="0" w:firstRowLastColumn="0" w:lastRowFirstColumn="0" w:lastRowLastColumn="0"/>
+            </w:pPr>
+            <w:r>
+              <w:t xml:space="preserve">Save all administration changes to the database and display </w:t>
+            </w:r>
+            <w:proofErr w:type="gramStart"/>
+            <w:r>
+              <w:t>a confirmation</w:t>
+            </w:r>
+            <w:proofErr w:type="gramEnd"/>
+            <w:r>
+              <w:t xml:space="preserve"> after successful updates.</w:t>
+            </w:r>
+          </w:p>
+        </w:tc>
+      </w:tr>
+    </w:tbl>
     <w:p/>
     <w:sectPr>
       <w:pgSz w:w="12240" w:h="15840"/>
@@ -5146,6 +7343,7 @@
   <w:style w:type="paragraph" w:default="1" w:styleId="Normal">
     <w:name w:val="Normal"/>
     <w:qFormat/>
+    <w:rsid w:val="00CA3CB9"/>
   </w:style>
   <w:style w:type="paragraph" w:styleId="Heading1">
     <w:name w:val="heading 1"/>
@@ -5174,7 +7372,6 @@
     <w:next w:val="Normal"/>
     <w:link w:val="Heading2Char"/>
     <w:uiPriority w:val="9"/>
-    <w:semiHidden/>
     <w:unhideWhenUsed/>
     <w:qFormat/>
     <w:rsid w:val="00CB0B13"/>
@@ -5391,7 +7588,6 @@
     <w:basedOn w:val="DefaultParagraphFont"/>
     <w:link w:val="Heading2"/>
     <w:uiPriority w:val="9"/>
-    <w:semiHidden/>
     <w:rsid w:val="00CB0B13"/>
     <w:rPr>
       <w:rFonts w:asciiTheme="majorHAnsi" w:eastAsiaTheme="majorEastAsia" w:hAnsiTheme="majorHAnsi" w:cstheme="majorBidi"/>
@@ -5726,6 +7922,88 @@
     <w:uiPriority w:val="99"/>
     <w:rsid w:val="00502A1B"/>
   </w:style>
+  <w:style w:type="table" w:styleId="PlainTable1">
+    <w:name w:val="Plain Table 1"/>
+    <w:basedOn w:val="TableNormal"/>
+    <w:uiPriority w:val="41"/>
+    <w:rsid w:val="00A4177E"/>
+    <w:pPr>
+      <w:spacing w:after="0" w:line="240" w:lineRule="auto"/>
+    </w:pPr>
+    <w:tblPr>
+      <w:tblStyleRowBandSize w:val="1"/>
+      <w:tblStyleColBandSize w:val="1"/>
+      <w:tblBorders>
+        <w:top w:val="single" w:sz="4" w:space="0" w:color="BFBFBF" w:themeColor="background1" w:themeShade="BF"/>
+        <w:left w:val="single" w:sz="4" w:space="0" w:color="BFBFBF" w:themeColor="background1" w:themeShade="BF"/>
+        <w:bottom w:val="single" w:sz="4" w:space="0" w:color="BFBFBF" w:themeColor="background1" w:themeShade="BF"/>
+        <w:right w:val="single" w:sz="4" w:space="0" w:color="BFBFBF" w:themeColor="background1" w:themeShade="BF"/>
+        <w:insideH w:val="single" w:sz="4" w:space="0" w:color="BFBFBF" w:themeColor="background1" w:themeShade="BF"/>
+        <w:insideV w:val="single" w:sz="4" w:space="0" w:color="BFBFBF" w:themeColor="background1" w:themeShade="BF"/>
+      </w:tblBorders>
+    </w:tblPr>
+    <w:tblStylePr w:type="firstRow">
+      <w:rPr>
+        <w:b/>
+        <w:bCs/>
+      </w:rPr>
+    </w:tblStylePr>
+    <w:tblStylePr w:type="lastRow">
+      <w:rPr>
+        <w:b/>
+        <w:bCs/>
+      </w:rPr>
+      <w:tblPr/>
+      <w:tcPr>
+        <w:tcBorders>
+          <w:top w:val="double" w:sz="4" w:space="0" w:color="BFBFBF" w:themeColor="background1" w:themeShade="BF"/>
+        </w:tcBorders>
+      </w:tcPr>
+    </w:tblStylePr>
+    <w:tblStylePr w:type="firstCol">
+      <w:rPr>
+        <w:b/>
+        <w:bCs/>
+      </w:rPr>
+    </w:tblStylePr>
+    <w:tblStylePr w:type="lastCol">
+      <w:rPr>
+        <w:b/>
+        <w:bCs/>
+      </w:rPr>
+    </w:tblStylePr>
+    <w:tblStylePr w:type="band1Vert">
+      <w:tblPr/>
+      <w:tcPr>
+        <w:shd w:val="clear" w:color="auto" w:fill="F2F2F2" w:themeFill="background1" w:themeFillShade="F2"/>
+      </w:tcPr>
+    </w:tblStylePr>
+    <w:tblStylePr w:type="band1Horz">
+      <w:tblPr/>
+      <w:tcPr>
+        <w:shd w:val="clear" w:color="auto" w:fill="F2F2F2" w:themeFill="background1" w:themeFillShade="F2"/>
+      </w:tcPr>
+    </w:tblStylePr>
+  </w:style>
+  <w:style w:type="table" w:styleId="TableGridLight">
+    <w:name w:val="Grid Table Light"/>
+    <w:basedOn w:val="TableNormal"/>
+    <w:uiPriority w:val="40"/>
+    <w:rsid w:val="000F7DF0"/>
+    <w:pPr>
+      <w:spacing w:after="0" w:line="240" w:lineRule="auto"/>
+    </w:pPr>
+    <w:tblPr>
+      <w:tblBorders>
+        <w:top w:val="single" w:sz="4" w:space="0" w:color="BFBFBF" w:themeColor="background1" w:themeShade="BF"/>
+        <w:left w:val="single" w:sz="4" w:space="0" w:color="BFBFBF" w:themeColor="background1" w:themeShade="BF"/>
+        <w:bottom w:val="single" w:sz="4" w:space="0" w:color="BFBFBF" w:themeColor="background1" w:themeShade="BF"/>
+        <w:right w:val="single" w:sz="4" w:space="0" w:color="BFBFBF" w:themeColor="background1" w:themeShade="BF"/>
+        <w:insideH w:val="single" w:sz="4" w:space="0" w:color="BFBFBF" w:themeColor="background1" w:themeShade="BF"/>
+        <w:insideV w:val="single" w:sz="4" w:space="0" w:color="BFBFBF" w:themeColor="background1" w:themeShade="BF"/>
+      </w:tblBorders>
+    </w:tblPr>
+  </w:style>
 </w:styles>
 </file>
 
@@ -6042,4 +8320,16 @@
     </a:ext>
   </a:extLst>
 </a:theme>
+</file>
+
+<file path=customXml/item1.xml><?xml version="1.0" encoding="utf-8"?>
+<b:Sources xmlns:b="http://schemas.openxmlformats.org/officeDocument/2006/bibliography" xmlns="http://schemas.openxmlformats.org/officeDocument/2006/bibliography" SelectedStyle="\APASixthEditionOfficeOnline.xsl" StyleName="APA" Version="6"/>
+</file>
+
+<file path=customXml/itemProps1.xml><?xml version="1.0" encoding="utf-8"?>
+<ds:datastoreItem xmlns:ds="http://schemas.openxmlformats.org/officeDocument/2006/customXml" ds:itemID="{3401DDA1-FB42-4744-ABDC-798A0C9C3359}">
+  <ds:schemaRefs>
+    <ds:schemaRef ds:uri="http://schemas.openxmlformats.org/officeDocument/2006/bibliography"/>
+  </ds:schemaRefs>
+</ds:datastoreItem>
 </file>
</xml_diff>

<commit_message>
Color coded & Clear lables
</commit_message>
<xml_diff>
--- a/Product_Backlog_and_Sprints.docx
+++ b/Product_Backlog_and_Sprints.docx
@@ -10,9 +10,37 @@
         <w:t>PRODUCT BACKLOG</w:t>
       </w:r>
     </w:p>
+    <w:p>
+      <w:pPr>
+        <w:jc w:val="center"/>
+      </w:pPr>
+      <w:r>
+        <w:rPr>
+          <w:shd w:val="clear" w:color="auto" w:fill="4EA72E" w:themeFill="accent6"/>
+        </w:rPr>
+        <w:t>Green</w:t>
+      </w:r>
+      <w:r>
+        <w:t xml:space="preserve"> = Completed &amp; Presented</w:t>
+      </w:r>
+    </w:p>
+    <w:p>
+      <w:pPr>
+        <w:jc w:val="center"/>
+      </w:pPr>
+      <w:r>
+        <w:rPr>
+          <w:highlight w:val="yellow"/>
+        </w:rPr>
+        <w:t>Yellow</w:t>
+      </w:r>
+      <w:r>
+        <w:t xml:space="preserve"> = New Log added for semester project goal </w:t>
+      </w:r>
+    </w:p>
     <w:tbl>
       <w:tblPr>
-        <w:tblStyle w:val="TableGrid"/>
+        <w:tblStyle w:val="GridTable4-Accent3"/>
         <w:tblW w:w="0" w:type="auto"/>
         <w:tblLook w:val="04A0" w:firstRow="1" w:lastRow="0" w:firstColumn="1" w:lastColumn="0" w:noHBand="0" w:noVBand="1"/>
       </w:tblPr>
@@ -23,10 +51,12 @@
       </w:tblGrid>
       <w:tr>
         <w:trPr>
+          <w:cnfStyle w:val="100000000000" w:firstRow="1" w:lastRow="0" w:firstColumn="0" w:lastColumn="0" w:oddVBand="0" w:evenVBand="0" w:oddHBand="0" w:evenHBand="0" w:firstRowFirstColumn="0" w:firstRowLastColumn="0" w:lastRowFirstColumn="0" w:lastRowLastColumn="0"/>
           <w:trHeight w:val="288"/>
         </w:trPr>
         <w:tc>
           <w:tcPr>
+            <w:cnfStyle w:val="001000000000" w:firstRow="0" w:lastRow="0" w:firstColumn="1" w:lastColumn="0" w:oddVBand="0" w:evenVBand="0" w:oddHBand="0" w:evenHBand="0" w:firstRowFirstColumn="0" w:firstRowLastColumn="0" w:lastRowFirstColumn="0" w:lastRowLastColumn="0"/>
             <w:tcW w:w="1020" w:type="dxa"/>
           </w:tcPr>
           <w:p>
@@ -40,6 +70,9 @@
             <w:tcW w:w="2125" w:type="dxa"/>
           </w:tcPr>
           <w:p>
+            <w:pPr>
+              <w:cnfStyle w:val="100000000000" w:firstRow="1" w:lastRow="0" w:firstColumn="0" w:lastColumn="0" w:oddVBand="0" w:evenVBand="0" w:oddHBand="0" w:evenHBand="0" w:firstRowFirstColumn="0" w:firstRowLastColumn="0" w:lastRowFirstColumn="0" w:lastRowLastColumn="0"/>
+            </w:pPr>
             <w:r>
               <w:t>Label</w:t>
             </w:r>
@@ -50,6 +83,9 @@
             <w:tcW w:w="6015" w:type="dxa"/>
           </w:tcPr>
           <w:p>
+            <w:pPr>
+              <w:cnfStyle w:val="100000000000" w:firstRow="1" w:lastRow="0" w:firstColumn="0" w:lastColumn="0" w:oddVBand="0" w:evenVBand="0" w:oddHBand="0" w:evenHBand="0" w:firstRowFirstColumn="0" w:firstRowLastColumn="0" w:lastRowFirstColumn="0" w:lastRowLastColumn="0"/>
+            </w:pPr>
             <w:r>
               <w:t>Info</w:t>
             </w:r>
@@ -58,10 +94,12 @@
       </w:tr>
       <w:tr>
         <w:trPr>
+          <w:cnfStyle w:val="000000100000" w:firstRow="0" w:lastRow="0" w:firstColumn="0" w:lastColumn="0" w:oddVBand="0" w:evenVBand="0" w:oddHBand="1" w:evenHBand="0" w:firstRowFirstColumn="0" w:firstRowLastColumn="0" w:lastRowFirstColumn="0" w:lastRowLastColumn="0"/>
           <w:trHeight w:val="299"/>
         </w:trPr>
         <w:tc>
           <w:tcPr>
+            <w:cnfStyle w:val="001000000000" w:firstRow="0" w:lastRow="0" w:firstColumn="1" w:lastColumn="0" w:oddVBand="0" w:evenVBand="0" w:oddHBand="0" w:evenHBand="0" w:firstRowFirstColumn="0" w:firstRowLastColumn="0" w:lastRowFirstColumn="0" w:lastRowLastColumn="0"/>
             <w:tcW w:w="1020" w:type="dxa"/>
           </w:tcPr>
           <w:p>
@@ -75,6 +113,9 @@
             <w:tcW w:w="2125" w:type="dxa"/>
           </w:tcPr>
           <w:p>
+            <w:pPr>
+              <w:cnfStyle w:val="000000100000" w:firstRow="0" w:lastRow="0" w:firstColumn="0" w:lastColumn="0" w:oddVBand="0" w:evenVBand="0" w:oddHBand="1" w:evenHBand="0" w:firstRowFirstColumn="0" w:firstRowLastColumn="0" w:lastRowFirstColumn="0" w:lastRowLastColumn="0"/>
+            </w:pPr>
             <w:r>
               <w:t>User Story</w:t>
             </w:r>
@@ -85,6 +126,9 @@
             <w:tcW w:w="6015" w:type="dxa"/>
           </w:tcPr>
           <w:p>
+            <w:pPr>
+              <w:cnfStyle w:val="000000100000" w:firstRow="0" w:lastRow="0" w:firstColumn="0" w:lastColumn="0" w:oddVBand="0" w:evenVBand="0" w:oddHBand="1" w:evenHBand="0" w:firstRowFirstColumn="0" w:firstRowLastColumn="0" w:lastRowFirstColumn="0" w:lastRowLastColumn="0"/>
+            </w:pPr>
             <w:r>
               <w:t>As a wedding guest, I want to log in using my email, so that I can access my invitation.</w:t>
             </w:r>
@@ -97,6 +141,7 @@
         </w:trPr>
         <w:tc>
           <w:tcPr>
+            <w:cnfStyle w:val="001000000000" w:firstRow="0" w:lastRow="0" w:firstColumn="1" w:lastColumn="0" w:oddVBand="0" w:evenVBand="0" w:oddHBand="0" w:evenHBand="0" w:firstRowFirstColumn="0" w:firstRowLastColumn="0" w:lastRowFirstColumn="0" w:lastRowLastColumn="0"/>
             <w:tcW w:w="1020" w:type="dxa"/>
           </w:tcPr>
           <w:p>
@@ -110,6 +155,9 @@
             <w:tcW w:w="2125" w:type="dxa"/>
           </w:tcPr>
           <w:p>
+            <w:pPr>
+              <w:cnfStyle w:val="000000000000" w:firstRow="0" w:lastRow="0" w:firstColumn="0" w:lastColumn="0" w:oddVBand="0" w:evenVBand="0" w:oddHBand="0" w:evenHBand="0" w:firstRowFirstColumn="0" w:firstRowLastColumn="0" w:lastRowFirstColumn="0" w:lastRowLastColumn="0"/>
+            </w:pPr>
             <w:r>
               <w:t>Tangible Needs</w:t>
             </w:r>
@@ -123,6 +171,9 @@
             <w:tcW w:w="6015" w:type="dxa"/>
           </w:tcPr>
           <w:p>
+            <w:pPr>
+              <w:cnfStyle w:val="000000000000" w:firstRow="0" w:lastRow="0" w:firstColumn="0" w:lastColumn="0" w:oddVBand="0" w:evenVBand="0" w:oddHBand="0" w:evenHBand="0" w:firstRowFirstColumn="0" w:firstRowLastColumn="0" w:lastRowFirstColumn="0" w:lastRowLastColumn="0"/>
+            </w:pPr>
             <w:r>
               <w:t xml:space="preserve">Create </w:t>
             </w:r>
@@ -137,10 +188,12 @@
       </w:tr>
       <w:tr>
         <w:trPr>
+          <w:cnfStyle w:val="000000100000" w:firstRow="0" w:lastRow="0" w:firstColumn="0" w:lastColumn="0" w:oddVBand="0" w:evenVBand="0" w:oddHBand="1" w:evenHBand="0" w:firstRowFirstColumn="0" w:firstRowLastColumn="0" w:lastRowFirstColumn="0" w:lastRowLastColumn="0"/>
           <w:trHeight w:val="288"/>
         </w:trPr>
         <w:tc>
           <w:tcPr>
+            <w:cnfStyle w:val="001000000000" w:firstRow="0" w:lastRow="0" w:firstColumn="1" w:lastColumn="0" w:oddVBand="0" w:evenVBand="0" w:oddHBand="0" w:evenHBand="0" w:firstRowFirstColumn="0" w:firstRowLastColumn="0" w:lastRowFirstColumn="0" w:lastRowLastColumn="0"/>
             <w:tcW w:w="1020" w:type="dxa"/>
           </w:tcPr>
           <w:p>
@@ -154,6 +207,9 @@
             <w:tcW w:w="2125" w:type="dxa"/>
           </w:tcPr>
           <w:p>
+            <w:pPr>
+              <w:cnfStyle w:val="000000100000" w:firstRow="0" w:lastRow="0" w:firstColumn="0" w:lastColumn="0" w:oddVBand="0" w:evenVBand="0" w:oddHBand="1" w:evenHBand="0" w:firstRowFirstColumn="0" w:firstRowLastColumn="0" w:lastRowFirstColumn="0" w:lastRowLastColumn="0"/>
+            </w:pPr>
             <w:r>
               <w:t xml:space="preserve">Tangible Needs </w:t>
             </w:r>
@@ -164,6 +220,9 @@
             <w:tcW w:w="6015" w:type="dxa"/>
           </w:tcPr>
           <w:p>
+            <w:pPr>
+              <w:cnfStyle w:val="000000100000" w:firstRow="0" w:lastRow="0" w:firstColumn="0" w:lastColumn="0" w:oddVBand="0" w:evenVBand="0" w:oddHBand="1" w:evenHBand="0" w:firstRowFirstColumn="0" w:firstRowLastColumn="0" w:lastRowFirstColumn="0" w:lastRowLastColumn="0"/>
+            </w:pPr>
             <w:r>
               <w:t>Validate entered email</w:t>
             </w:r>
@@ -176,6 +235,7 @@
         </w:trPr>
         <w:tc>
           <w:tcPr>
+            <w:cnfStyle w:val="001000000000" w:firstRow="0" w:lastRow="0" w:firstColumn="1" w:lastColumn="0" w:oddVBand="0" w:evenVBand="0" w:oddHBand="0" w:evenHBand="0" w:firstRowFirstColumn="0" w:firstRowLastColumn="0" w:lastRowFirstColumn="0" w:lastRowLastColumn="0"/>
             <w:tcW w:w="1020" w:type="dxa"/>
           </w:tcPr>
           <w:p>
@@ -189,6 +249,9 @@
             <w:tcW w:w="2125" w:type="dxa"/>
           </w:tcPr>
           <w:p>
+            <w:pPr>
+              <w:cnfStyle w:val="000000000000" w:firstRow="0" w:lastRow="0" w:firstColumn="0" w:lastColumn="0" w:oddVBand="0" w:evenVBand="0" w:oddHBand="0" w:evenHBand="0" w:firstRowFirstColumn="0" w:firstRowLastColumn="0" w:lastRowFirstColumn="0" w:lastRowLastColumn="0"/>
+            </w:pPr>
             <w:r>
               <w:t xml:space="preserve">Tangible Needs </w:t>
             </w:r>
@@ -199,6 +262,9 @@
             <w:tcW w:w="6015" w:type="dxa"/>
           </w:tcPr>
           <w:p>
+            <w:pPr>
+              <w:cnfStyle w:val="000000000000" w:firstRow="0" w:lastRow="0" w:firstColumn="0" w:lastColumn="0" w:oddVBand="0" w:evenVBand="0" w:oddHBand="0" w:evenHBand="0" w:firstRowFirstColumn="0" w:firstRowLastColumn="0" w:lastRowFirstColumn="0" w:lastRowLastColumn="0"/>
+            </w:pPr>
             <w:r>
               <w:t xml:space="preserve">Check email for matching invitation in system data. </w:t>
             </w:r>
@@ -207,10 +273,12 @@
       </w:tr>
       <w:tr>
         <w:trPr>
+          <w:cnfStyle w:val="000000100000" w:firstRow="0" w:lastRow="0" w:firstColumn="0" w:lastColumn="0" w:oddVBand="0" w:evenVBand="0" w:oddHBand="1" w:evenHBand="0" w:firstRowFirstColumn="0" w:firstRowLastColumn="0" w:lastRowFirstColumn="0" w:lastRowLastColumn="0"/>
           <w:trHeight w:val="288"/>
         </w:trPr>
         <w:tc>
           <w:tcPr>
+            <w:cnfStyle w:val="001000000000" w:firstRow="0" w:lastRow="0" w:firstColumn="1" w:lastColumn="0" w:oddVBand="0" w:evenVBand="0" w:oddHBand="0" w:evenHBand="0" w:firstRowFirstColumn="0" w:firstRowLastColumn="0" w:lastRowFirstColumn="0" w:lastRowLastColumn="0"/>
             <w:tcW w:w="1020" w:type="dxa"/>
           </w:tcPr>
           <w:p>
@@ -224,6 +292,9 @@
             <w:tcW w:w="2125" w:type="dxa"/>
           </w:tcPr>
           <w:p>
+            <w:pPr>
+              <w:cnfStyle w:val="000000100000" w:firstRow="0" w:lastRow="0" w:firstColumn="0" w:lastColumn="0" w:oddVBand="0" w:evenVBand="0" w:oddHBand="1" w:evenHBand="0" w:firstRowFirstColumn="0" w:firstRowLastColumn="0" w:lastRowFirstColumn="0" w:lastRowLastColumn="0"/>
+            </w:pPr>
             <w:r>
               <w:t xml:space="preserve">Tangible Needs </w:t>
             </w:r>
@@ -234,6 +305,9 @@
             <w:tcW w:w="6015" w:type="dxa"/>
           </w:tcPr>
           <w:p>
+            <w:pPr>
+              <w:cnfStyle w:val="000000100000" w:firstRow="0" w:lastRow="0" w:firstColumn="0" w:lastColumn="0" w:oddVBand="0" w:evenVBand="0" w:oddHBand="1" w:evenHBand="0" w:firstRowFirstColumn="0" w:firstRowLastColumn="0" w:lastRowFirstColumn="0" w:lastRowLastColumn="0"/>
+            </w:pPr>
             <w:r>
               <w:t xml:space="preserve">Display </w:t>
             </w:r>
@@ -262,6 +336,7 @@
         </w:trPr>
         <w:tc>
           <w:tcPr>
+            <w:cnfStyle w:val="001000000000" w:firstRow="0" w:lastRow="0" w:firstColumn="1" w:lastColumn="0" w:oddVBand="0" w:evenVBand="0" w:oddHBand="0" w:evenHBand="0" w:firstRowFirstColumn="0" w:firstRowLastColumn="0" w:lastRowFirstColumn="0" w:lastRowLastColumn="0"/>
             <w:tcW w:w="1020" w:type="dxa"/>
           </w:tcPr>
           <w:p>
@@ -275,6 +350,9 @@
             <w:tcW w:w="2125" w:type="dxa"/>
           </w:tcPr>
           <w:p>
+            <w:pPr>
+              <w:cnfStyle w:val="000000000000" w:firstRow="0" w:lastRow="0" w:firstColumn="0" w:lastColumn="0" w:oddVBand="0" w:evenVBand="0" w:oddHBand="0" w:evenHBand="0" w:firstRowFirstColumn="0" w:firstRowLastColumn="0" w:lastRowFirstColumn="0" w:lastRowLastColumn="0"/>
+            </w:pPr>
             <w:r>
               <w:t xml:space="preserve">Tangible Needs </w:t>
             </w:r>
@@ -285,6 +363,9 @@
             <w:tcW w:w="6015" w:type="dxa"/>
           </w:tcPr>
           <w:p>
+            <w:pPr>
+              <w:cnfStyle w:val="000000000000" w:firstRow="0" w:lastRow="0" w:firstColumn="0" w:lastColumn="0" w:oddVBand="0" w:evenVBand="0" w:oddHBand="0" w:evenHBand="0" w:firstRowFirstColumn="0" w:firstRowLastColumn="0" w:lastRowFirstColumn="0" w:lastRowLastColumn="0"/>
+            </w:pPr>
             <w:r>
               <w:t xml:space="preserve">Valid </w:t>
             </w:r>
@@ -298,7 +379,7 @@
     <w:p/>
     <w:tbl>
       <w:tblPr>
-        <w:tblStyle w:val="TableGrid"/>
+        <w:tblStyle w:val="GridTable4-Accent3"/>
         <w:tblW w:w="0" w:type="auto"/>
         <w:tblLook w:val="04A0" w:firstRow="1" w:lastRow="0" w:firstColumn="1" w:lastColumn="0" w:noHBand="0" w:noVBand="1"/>
       </w:tblPr>
@@ -309,10 +390,12 @@
       </w:tblGrid>
       <w:tr>
         <w:trPr>
+          <w:cnfStyle w:val="100000000000" w:firstRow="1" w:lastRow="0" w:firstColumn="0" w:lastColumn="0" w:oddVBand="0" w:evenVBand="0" w:oddHBand="0" w:evenHBand="0" w:firstRowFirstColumn="0" w:firstRowLastColumn="0" w:lastRowFirstColumn="0" w:lastRowLastColumn="0"/>
           <w:trHeight w:val="288"/>
         </w:trPr>
         <w:tc>
           <w:tcPr>
+            <w:cnfStyle w:val="001000000000" w:firstRow="0" w:lastRow="0" w:firstColumn="1" w:lastColumn="0" w:oddVBand="0" w:evenVBand="0" w:oddHBand="0" w:evenHBand="0" w:firstRowFirstColumn="0" w:firstRowLastColumn="0" w:lastRowFirstColumn="0" w:lastRowLastColumn="0"/>
             <w:tcW w:w="1020" w:type="dxa"/>
           </w:tcPr>
           <w:p>
@@ -326,6 +409,9 @@
             <w:tcW w:w="2125" w:type="dxa"/>
           </w:tcPr>
           <w:p>
+            <w:pPr>
+              <w:cnfStyle w:val="100000000000" w:firstRow="1" w:lastRow="0" w:firstColumn="0" w:lastColumn="0" w:oddVBand="0" w:evenVBand="0" w:oddHBand="0" w:evenHBand="0" w:firstRowFirstColumn="0" w:firstRowLastColumn="0" w:lastRowFirstColumn="0" w:lastRowLastColumn="0"/>
+            </w:pPr>
             <w:r>
               <w:t>Label</w:t>
             </w:r>
@@ -336,6 +422,9 @@
             <w:tcW w:w="6015" w:type="dxa"/>
           </w:tcPr>
           <w:p>
+            <w:pPr>
+              <w:cnfStyle w:val="100000000000" w:firstRow="1" w:lastRow="0" w:firstColumn="0" w:lastColumn="0" w:oddVBand="0" w:evenVBand="0" w:oddHBand="0" w:evenHBand="0" w:firstRowFirstColumn="0" w:firstRowLastColumn="0" w:lastRowFirstColumn="0" w:lastRowLastColumn="0"/>
+            </w:pPr>
             <w:r>
               <w:t>Info</w:t>
             </w:r>
@@ -344,10 +433,12 @@
       </w:tr>
       <w:tr>
         <w:trPr>
+          <w:cnfStyle w:val="000000100000" w:firstRow="0" w:lastRow="0" w:firstColumn="0" w:lastColumn="0" w:oddVBand="0" w:evenVBand="0" w:oddHBand="1" w:evenHBand="0" w:firstRowFirstColumn="0" w:firstRowLastColumn="0" w:lastRowFirstColumn="0" w:lastRowLastColumn="0"/>
           <w:trHeight w:val="299"/>
         </w:trPr>
         <w:tc>
           <w:tcPr>
+            <w:cnfStyle w:val="001000000000" w:firstRow="0" w:lastRow="0" w:firstColumn="1" w:lastColumn="0" w:oddVBand="0" w:evenVBand="0" w:oddHBand="0" w:evenHBand="0" w:firstRowFirstColumn="0" w:firstRowLastColumn="0" w:lastRowFirstColumn="0" w:lastRowLastColumn="0"/>
             <w:tcW w:w="1020" w:type="dxa"/>
           </w:tcPr>
           <w:p>
@@ -361,6 +452,9 @@
             <w:tcW w:w="2125" w:type="dxa"/>
           </w:tcPr>
           <w:p>
+            <w:pPr>
+              <w:cnfStyle w:val="000000100000" w:firstRow="0" w:lastRow="0" w:firstColumn="0" w:lastColumn="0" w:oddVBand="0" w:evenVBand="0" w:oddHBand="1" w:evenHBand="0" w:firstRowFirstColumn="0" w:firstRowLastColumn="0" w:lastRowFirstColumn="0" w:lastRowLastColumn="0"/>
+            </w:pPr>
             <w:r>
               <w:t>User Story</w:t>
             </w:r>
@@ -371,6 +465,9 @@
             <w:tcW w:w="6015" w:type="dxa"/>
           </w:tcPr>
           <w:p>
+            <w:pPr>
+              <w:cnfStyle w:val="000000100000" w:firstRow="0" w:lastRow="0" w:firstColumn="0" w:lastColumn="0" w:oddVBand="0" w:evenVBand="0" w:oddHBand="1" w:evenHBand="0" w:firstRowFirstColumn="0" w:firstRowLastColumn="0" w:lastRowFirstColumn="0" w:lastRowLastColumn="0"/>
+            </w:pPr>
             <w:r>
               <w:t xml:space="preserve">As a wedding guest, I want to see everyone associated with my invitation, so that I </w:t>
             </w:r>
@@ -386,6 +483,7 @@
         </w:trPr>
         <w:tc>
           <w:tcPr>
+            <w:cnfStyle w:val="001000000000" w:firstRow="0" w:lastRow="0" w:firstColumn="1" w:lastColumn="0" w:oddVBand="0" w:evenVBand="0" w:oddHBand="0" w:evenHBand="0" w:firstRowFirstColumn="0" w:firstRowLastColumn="0" w:lastRowFirstColumn="0" w:lastRowLastColumn="0"/>
             <w:tcW w:w="1020" w:type="dxa"/>
           </w:tcPr>
           <w:p>
@@ -399,6 +497,9 @@
             <w:tcW w:w="2125" w:type="dxa"/>
           </w:tcPr>
           <w:p>
+            <w:pPr>
+              <w:cnfStyle w:val="000000000000" w:firstRow="0" w:lastRow="0" w:firstColumn="0" w:lastColumn="0" w:oddVBand="0" w:evenVBand="0" w:oddHBand="0" w:evenHBand="0" w:firstRowFirstColumn="0" w:firstRowLastColumn="0" w:lastRowFirstColumn="0" w:lastRowLastColumn="0"/>
+            </w:pPr>
             <w:r>
               <w:t xml:space="preserve">Tangible Needs </w:t>
             </w:r>
@@ -409,6 +510,9 @@
             <w:tcW w:w="6015" w:type="dxa"/>
           </w:tcPr>
           <w:p>
+            <w:pPr>
+              <w:cnfStyle w:val="000000000000" w:firstRow="0" w:lastRow="0" w:firstColumn="0" w:lastColumn="0" w:oddVBand="0" w:evenVBand="0" w:oddHBand="0" w:evenHBand="0" w:firstRowFirstColumn="0" w:firstRowLastColumn="0" w:lastRowFirstColumn="0" w:lastRowLastColumn="0"/>
+            </w:pPr>
             <w:r>
               <w:t>Retrieve all guest names associated with email from system data.</w:t>
             </w:r>
@@ -417,10 +521,12 @@
       </w:tr>
       <w:tr>
         <w:trPr>
+          <w:cnfStyle w:val="000000100000" w:firstRow="0" w:lastRow="0" w:firstColumn="0" w:lastColumn="0" w:oddVBand="0" w:evenVBand="0" w:oddHBand="1" w:evenHBand="0" w:firstRowFirstColumn="0" w:firstRowLastColumn="0" w:lastRowFirstColumn="0" w:lastRowLastColumn="0"/>
           <w:trHeight w:val="288"/>
         </w:trPr>
         <w:tc>
           <w:tcPr>
+            <w:cnfStyle w:val="001000000000" w:firstRow="0" w:lastRow="0" w:firstColumn="1" w:lastColumn="0" w:oddVBand="0" w:evenVBand="0" w:oddHBand="0" w:evenHBand="0" w:firstRowFirstColumn="0" w:firstRowLastColumn="0" w:lastRowFirstColumn="0" w:lastRowLastColumn="0"/>
             <w:tcW w:w="1020" w:type="dxa"/>
           </w:tcPr>
           <w:p>
@@ -434,6 +540,9 @@
             <w:tcW w:w="2125" w:type="dxa"/>
           </w:tcPr>
           <w:p>
+            <w:pPr>
+              <w:cnfStyle w:val="000000100000" w:firstRow="0" w:lastRow="0" w:firstColumn="0" w:lastColumn="0" w:oddVBand="0" w:evenVBand="0" w:oddHBand="1" w:evenHBand="0" w:firstRowFirstColumn="0" w:firstRowLastColumn="0" w:lastRowFirstColumn="0" w:lastRowLastColumn="0"/>
+            </w:pPr>
             <w:r>
               <w:t xml:space="preserve">Tangible Needs </w:t>
             </w:r>
@@ -444,6 +553,9 @@
             <w:tcW w:w="6015" w:type="dxa"/>
           </w:tcPr>
           <w:p>
+            <w:pPr>
+              <w:cnfStyle w:val="000000100000" w:firstRow="0" w:lastRow="0" w:firstColumn="0" w:lastColumn="0" w:oddVBand="0" w:evenVBand="0" w:oddHBand="1" w:evenHBand="0" w:firstRowFirstColumn="0" w:firstRowLastColumn="0" w:lastRowFirstColumn="0" w:lastRowLastColumn="0"/>
+            </w:pPr>
             <w:r>
               <w:t>Display each associated guest’s name</w:t>
             </w:r>
@@ -456,6 +568,7 @@
         </w:trPr>
         <w:tc>
           <w:tcPr>
+            <w:cnfStyle w:val="001000000000" w:firstRow="0" w:lastRow="0" w:firstColumn="1" w:lastColumn="0" w:oddVBand="0" w:evenVBand="0" w:oddHBand="0" w:evenHBand="0" w:firstRowFirstColumn="0" w:firstRowLastColumn="0" w:lastRowFirstColumn="0" w:lastRowLastColumn="0"/>
             <w:tcW w:w="1020" w:type="dxa"/>
           </w:tcPr>
           <w:p>
@@ -469,6 +582,9 @@
             <w:tcW w:w="2125" w:type="dxa"/>
           </w:tcPr>
           <w:p>
+            <w:pPr>
+              <w:cnfStyle w:val="000000000000" w:firstRow="0" w:lastRow="0" w:firstColumn="0" w:lastColumn="0" w:oddVBand="0" w:evenVBand="0" w:oddHBand="0" w:evenHBand="0" w:firstRowFirstColumn="0" w:firstRowLastColumn="0" w:lastRowFirstColumn="0" w:lastRowLastColumn="0"/>
+            </w:pPr>
             <w:r>
               <w:t xml:space="preserve">Tangible Needs </w:t>
             </w:r>
@@ -479,6 +595,9 @@
             <w:tcW w:w="6015" w:type="dxa"/>
           </w:tcPr>
           <w:p>
+            <w:pPr>
+              <w:cnfStyle w:val="000000000000" w:firstRow="0" w:lastRow="0" w:firstColumn="0" w:lastColumn="0" w:oddVBand="0" w:evenVBand="0" w:oddHBand="0" w:evenHBand="0" w:firstRowFirstColumn="0" w:firstRowLastColumn="0" w:lastRowFirstColumn="0" w:lastRowLastColumn="0"/>
+            </w:pPr>
             <w:r>
               <w:t>Display a selectable checkbox for each guest.</w:t>
             </w:r>
@@ -487,10 +606,12 @@
       </w:tr>
       <w:tr>
         <w:trPr>
+          <w:cnfStyle w:val="000000100000" w:firstRow="0" w:lastRow="0" w:firstColumn="0" w:lastColumn="0" w:oddVBand="0" w:evenVBand="0" w:oddHBand="1" w:evenHBand="0" w:firstRowFirstColumn="0" w:firstRowLastColumn="0" w:lastRowFirstColumn="0" w:lastRowLastColumn="0"/>
           <w:trHeight w:val="288"/>
         </w:trPr>
         <w:tc>
           <w:tcPr>
+            <w:cnfStyle w:val="001000000000" w:firstRow="0" w:lastRow="0" w:firstColumn="1" w:lastColumn="0" w:oddVBand="0" w:evenVBand="0" w:oddHBand="0" w:evenHBand="0" w:firstRowFirstColumn="0" w:firstRowLastColumn="0" w:lastRowFirstColumn="0" w:lastRowLastColumn="0"/>
             <w:tcW w:w="1020" w:type="dxa"/>
           </w:tcPr>
           <w:p>
@@ -504,6 +625,9 @@
             <w:tcW w:w="2125" w:type="dxa"/>
           </w:tcPr>
           <w:p>
+            <w:pPr>
+              <w:cnfStyle w:val="000000100000" w:firstRow="0" w:lastRow="0" w:firstColumn="0" w:lastColumn="0" w:oddVBand="0" w:evenVBand="0" w:oddHBand="1" w:evenHBand="0" w:firstRowFirstColumn="0" w:firstRowLastColumn="0" w:lastRowFirstColumn="0" w:lastRowLastColumn="0"/>
+            </w:pPr>
             <w:r>
               <w:t xml:space="preserve">Tangible Needs </w:t>
             </w:r>
@@ -514,6 +638,9 @@
             <w:tcW w:w="6015" w:type="dxa"/>
           </w:tcPr>
           <w:p>
+            <w:pPr>
+              <w:cnfStyle w:val="000000100000" w:firstRow="0" w:lastRow="0" w:firstColumn="0" w:lastColumn="0" w:oddVBand="0" w:evenVBand="0" w:oddHBand="1" w:evenHBand="0" w:firstRowFirstColumn="0" w:firstRowLastColumn="0" w:lastRowFirstColumn="0" w:lastRowLastColumn="0"/>
+            </w:pPr>
             <w:r>
               <w:t xml:space="preserve">Display a “No one is attending” option. </w:t>
             </w:r>
@@ -524,7 +651,7 @@
     <w:p/>
     <w:tbl>
       <w:tblPr>
-        <w:tblStyle w:val="TableGrid"/>
+        <w:tblStyle w:val="GridTable4-Accent3"/>
         <w:tblW w:w="0" w:type="auto"/>
         <w:tblLook w:val="04A0" w:firstRow="1" w:lastRow="0" w:firstColumn="1" w:lastColumn="0" w:noHBand="0" w:noVBand="1"/>
       </w:tblPr>
@@ -535,10 +662,12 @@
       </w:tblGrid>
       <w:tr>
         <w:trPr>
+          <w:cnfStyle w:val="100000000000" w:firstRow="1" w:lastRow="0" w:firstColumn="0" w:lastColumn="0" w:oddVBand="0" w:evenVBand="0" w:oddHBand="0" w:evenHBand="0" w:firstRowFirstColumn="0" w:firstRowLastColumn="0" w:lastRowFirstColumn="0" w:lastRowLastColumn="0"/>
           <w:trHeight w:val="288"/>
         </w:trPr>
         <w:tc>
           <w:tcPr>
+            <w:cnfStyle w:val="001000000000" w:firstRow="0" w:lastRow="0" w:firstColumn="1" w:lastColumn="0" w:oddVBand="0" w:evenVBand="0" w:oddHBand="0" w:evenHBand="0" w:firstRowFirstColumn="0" w:firstRowLastColumn="0" w:lastRowFirstColumn="0" w:lastRowLastColumn="0"/>
             <w:tcW w:w="1020" w:type="dxa"/>
           </w:tcPr>
           <w:p>
@@ -552,6 +681,9 @@
             <w:tcW w:w="2125" w:type="dxa"/>
           </w:tcPr>
           <w:p>
+            <w:pPr>
+              <w:cnfStyle w:val="100000000000" w:firstRow="1" w:lastRow="0" w:firstColumn="0" w:lastColumn="0" w:oddVBand="0" w:evenVBand="0" w:oddHBand="0" w:evenHBand="0" w:firstRowFirstColumn="0" w:firstRowLastColumn="0" w:lastRowFirstColumn="0" w:lastRowLastColumn="0"/>
+            </w:pPr>
             <w:r>
               <w:t>Label</w:t>
             </w:r>
@@ -562,6 +694,9 @@
             <w:tcW w:w="6015" w:type="dxa"/>
           </w:tcPr>
           <w:p>
+            <w:pPr>
+              <w:cnfStyle w:val="100000000000" w:firstRow="1" w:lastRow="0" w:firstColumn="0" w:lastColumn="0" w:oddVBand="0" w:evenVBand="0" w:oddHBand="0" w:evenHBand="0" w:firstRowFirstColumn="0" w:firstRowLastColumn="0" w:lastRowFirstColumn="0" w:lastRowLastColumn="0"/>
+            </w:pPr>
             <w:r>
               <w:t>Info</w:t>
             </w:r>
@@ -570,10 +705,12 @@
       </w:tr>
       <w:tr>
         <w:trPr>
+          <w:cnfStyle w:val="000000100000" w:firstRow="0" w:lastRow="0" w:firstColumn="0" w:lastColumn="0" w:oddVBand="0" w:evenVBand="0" w:oddHBand="1" w:evenHBand="0" w:firstRowFirstColumn="0" w:firstRowLastColumn="0" w:lastRowFirstColumn="0" w:lastRowLastColumn="0"/>
           <w:trHeight w:val="299"/>
         </w:trPr>
         <w:tc>
           <w:tcPr>
+            <w:cnfStyle w:val="001000000000" w:firstRow="0" w:lastRow="0" w:firstColumn="1" w:lastColumn="0" w:oddVBand="0" w:evenVBand="0" w:oddHBand="0" w:evenHBand="0" w:firstRowFirstColumn="0" w:firstRowLastColumn="0" w:lastRowFirstColumn="0" w:lastRowLastColumn="0"/>
             <w:tcW w:w="1020" w:type="dxa"/>
           </w:tcPr>
           <w:p>
@@ -587,6 +724,9 @@
             <w:tcW w:w="2125" w:type="dxa"/>
           </w:tcPr>
           <w:p>
+            <w:pPr>
+              <w:cnfStyle w:val="000000100000" w:firstRow="0" w:lastRow="0" w:firstColumn="0" w:lastColumn="0" w:oddVBand="0" w:evenVBand="0" w:oddHBand="1" w:evenHBand="0" w:firstRowFirstColumn="0" w:firstRowLastColumn="0" w:lastRowFirstColumn="0" w:lastRowLastColumn="0"/>
+            </w:pPr>
             <w:r>
               <w:t>User Story</w:t>
             </w:r>
@@ -597,6 +737,9 @@
             <w:tcW w:w="6015" w:type="dxa"/>
           </w:tcPr>
           <w:p>
+            <w:pPr>
+              <w:cnfStyle w:val="000000100000" w:firstRow="0" w:lastRow="0" w:firstColumn="0" w:lastColumn="0" w:oddVBand="0" w:evenVBand="0" w:oddHBand="1" w:evenHBand="0" w:firstRowFirstColumn="0" w:firstRowLastColumn="0" w:lastRowFirstColumn="0" w:lastRowLastColumn="0"/>
+            </w:pPr>
             <w:r>
               <w:t>As a wedding guest, I want to submit an RSVP, so that I can tell the couple who is attending the wedding.</w:t>
             </w:r>
@@ -609,6 +752,7 @@
         </w:trPr>
         <w:tc>
           <w:tcPr>
+            <w:cnfStyle w:val="001000000000" w:firstRow="0" w:lastRow="0" w:firstColumn="1" w:lastColumn="0" w:oddVBand="0" w:evenVBand="0" w:oddHBand="0" w:evenHBand="0" w:firstRowFirstColumn="0" w:firstRowLastColumn="0" w:lastRowFirstColumn="0" w:lastRowLastColumn="0"/>
             <w:tcW w:w="1020" w:type="dxa"/>
           </w:tcPr>
           <w:p>
@@ -622,6 +766,9 @@
             <w:tcW w:w="2125" w:type="dxa"/>
           </w:tcPr>
           <w:p>
+            <w:pPr>
+              <w:cnfStyle w:val="000000000000" w:firstRow="0" w:lastRow="0" w:firstColumn="0" w:lastColumn="0" w:oddVBand="0" w:evenVBand="0" w:oddHBand="0" w:evenHBand="0" w:firstRowFirstColumn="0" w:firstRowLastColumn="0" w:lastRowFirstColumn="0" w:lastRowLastColumn="0"/>
+            </w:pPr>
             <w:r>
               <w:t xml:space="preserve">Tangible Needs </w:t>
             </w:r>
@@ -632,6 +779,9 @@
             <w:tcW w:w="6015" w:type="dxa"/>
           </w:tcPr>
           <w:p>
+            <w:pPr>
+              <w:cnfStyle w:val="000000000000" w:firstRow="0" w:lastRow="0" w:firstColumn="0" w:lastColumn="0" w:oddVBand="0" w:evenVBand="0" w:oddHBand="0" w:evenHBand="0" w:firstRowFirstColumn="0" w:firstRowLastColumn="0" w:lastRowFirstColumn="0" w:lastRowLastColumn="0"/>
+            </w:pPr>
             <w:r>
               <w:t>Require at least one RSVP selection before submission.</w:t>
             </w:r>
@@ -640,10 +790,12 @@
       </w:tr>
       <w:tr>
         <w:trPr>
+          <w:cnfStyle w:val="000000100000" w:firstRow="0" w:lastRow="0" w:firstColumn="0" w:lastColumn="0" w:oddVBand="0" w:evenVBand="0" w:oddHBand="1" w:evenHBand="0" w:firstRowFirstColumn="0" w:firstRowLastColumn="0" w:lastRowFirstColumn="0" w:lastRowLastColumn="0"/>
           <w:trHeight w:val="288"/>
         </w:trPr>
         <w:tc>
           <w:tcPr>
+            <w:cnfStyle w:val="001000000000" w:firstRow="0" w:lastRow="0" w:firstColumn="1" w:lastColumn="0" w:oddVBand="0" w:evenVBand="0" w:oddHBand="0" w:evenHBand="0" w:firstRowFirstColumn="0" w:firstRowLastColumn="0" w:lastRowFirstColumn="0" w:lastRowLastColumn="0"/>
             <w:tcW w:w="1020" w:type="dxa"/>
           </w:tcPr>
           <w:p>
@@ -657,6 +809,9 @@
             <w:tcW w:w="2125" w:type="dxa"/>
           </w:tcPr>
           <w:p>
+            <w:pPr>
+              <w:cnfStyle w:val="000000100000" w:firstRow="0" w:lastRow="0" w:firstColumn="0" w:lastColumn="0" w:oddVBand="0" w:evenVBand="0" w:oddHBand="1" w:evenHBand="0" w:firstRowFirstColumn="0" w:firstRowLastColumn="0" w:lastRowFirstColumn="0" w:lastRowLastColumn="0"/>
+            </w:pPr>
             <w:r>
               <w:t xml:space="preserve">Tangible Needs </w:t>
             </w:r>
@@ -667,6 +822,9 @@
             <w:tcW w:w="6015" w:type="dxa"/>
           </w:tcPr>
           <w:p>
+            <w:pPr>
+              <w:cnfStyle w:val="000000100000" w:firstRow="0" w:lastRow="0" w:firstColumn="0" w:lastColumn="0" w:oddVBand="0" w:evenVBand="0" w:oddHBand="1" w:evenHBand="0" w:firstRowFirstColumn="0" w:firstRowLastColumn="0" w:lastRowFirstColumn="0" w:lastRowLastColumn="0"/>
+            </w:pPr>
             <w:r>
               <w:t>Allow multiple invited guests to be selected as attending</w:t>
             </w:r>
@@ -679,6 +837,7 @@
         </w:trPr>
         <w:tc>
           <w:tcPr>
+            <w:cnfStyle w:val="001000000000" w:firstRow="0" w:lastRow="0" w:firstColumn="1" w:lastColumn="0" w:oddVBand="0" w:evenVBand="0" w:oddHBand="0" w:evenHBand="0" w:firstRowFirstColumn="0" w:firstRowLastColumn="0" w:lastRowFirstColumn="0" w:lastRowLastColumn="0"/>
             <w:tcW w:w="1020" w:type="dxa"/>
           </w:tcPr>
           <w:p>
@@ -692,6 +851,9 @@
             <w:tcW w:w="2125" w:type="dxa"/>
           </w:tcPr>
           <w:p>
+            <w:pPr>
+              <w:cnfStyle w:val="000000000000" w:firstRow="0" w:lastRow="0" w:firstColumn="0" w:lastColumn="0" w:oddVBand="0" w:evenVBand="0" w:oddHBand="0" w:evenHBand="0" w:firstRowFirstColumn="0" w:firstRowLastColumn="0" w:lastRowFirstColumn="0" w:lastRowLastColumn="0"/>
+            </w:pPr>
             <w:r>
               <w:t xml:space="preserve">Tangible Needs </w:t>
             </w:r>
@@ -702,6 +864,9 @@
             <w:tcW w:w="6015" w:type="dxa"/>
           </w:tcPr>
           <w:p>
+            <w:pPr>
+              <w:cnfStyle w:val="000000000000" w:firstRow="0" w:lastRow="0" w:firstColumn="0" w:lastColumn="0" w:oddVBand="0" w:evenVBand="0" w:oddHBand="0" w:evenHBand="0" w:firstRowFirstColumn="0" w:firstRowLastColumn="0" w:lastRowFirstColumn="0" w:lastRowLastColumn="0"/>
+            </w:pPr>
             <w:r>
               <w:t>Save all selected guests attending.</w:t>
             </w:r>
@@ -710,10 +875,12 @@
       </w:tr>
       <w:tr>
         <w:trPr>
+          <w:cnfStyle w:val="000000100000" w:firstRow="0" w:lastRow="0" w:firstColumn="0" w:lastColumn="0" w:oddVBand="0" w:evenVBand="0" w:oddHBand="1" w:evenHBand="0" w:firstRowFirstColumn="0" w:firstRowLastColumn="0" w:lastRowFirstColumn="0" w:lastRowLastColumn="0"/>
           <w:trHeight w:val="288"/>
         </w:trPr>
         <w:tc>
           <w:tcPr>
+            <w:cnfStyle w:val="001000000000" w:firstRow="0" w:lastRow="0" w:firstColumn="1" w:lastColumn="0" w:oddVBand="0" w:evenVBand="0" w:oddHBand="0" w:evenHBand="0" w:firstRowFirstColumn="0" w:firstRowLastColumn="0" w:lastRowFirstColumn="0" w:lastRowLastColumn="0"/>
             <w:tcW w:w="1020" w:type="dxa"/>
           </w:tcPr>
           <w:p>
@@ -727,6 +894,9 @@
             <w:tcW w:w="2125" w:type="dxa"/>
           </w:tcPr>
           <w:p>
+            <w:pPr>
+              <w:cnfStyle w:val="000000100000" w:firstRow="0" w:lastRow="0" w:firstColumn="0" w:lastColumn="0" w:oddVBand="0" w:evenVBand="0" w:oddHBand="1" w:evenHBand="0" w:firstRowFirstColumn="0" w:firstRowLastColumn="0" w:lastRowFirstColumn="0" w:lastRowLastColumn="0"/>
+            </w:pPr>
             <w:r>
               <w:t xml:space="preserve">Tangible Needs </w:t>
             </w:r>
@@ -737,6 +907,9 @@
             <w:tcW w:w="6015" w:type="dxa"/>
           </w:tcPr>
           <w:p>
+            <w:pPr>
+              <w:cnfStyle w:val="000000100000" w:firstRow="0" w:lastRow="0" w:firstColumn="0" w:lastColumn="0" w:oddVBand="0" w:evenVBand="0" w:oddHBand="1" w:evenHBand="0" w:firstRowFirstColumn="0" w:firstRowLastColumn="0" w:lastRowFirstColumn="0" w:lastRowLastColumn="0"/>
+            </w:pPr>
             <w:r>
               <w:t>Save all non-selected guests as not attending.</w:t>
             </w:r>
@@ -749,6 +922,7 @@
         </w:trPr>
         <w:tc>
           <w:tcPr>
+            <w:cnfStyle w:val="001000000000" w:firstRow="0" w:lastRow="0" w:firstColumn="1" w:lastColumn="0" w:oddVBand="0" w:evenVBand="0" w:oddHBand="0" w:evenHBand="0" w:firstRowFirstColumn="0" w:firstRowLastColumn="0" w:lastRowFirstColumn="0" w:lastRowLastColumn="0"/>
             <w:tcW w:w="1020" w:type="dxa"/>
           </w:tcPr>
           <w:p>
@@ -762,6 +936,9 @@
             <w:tcW w:w="2125" w:type="dxa"/>
           </w:tcPr>
           <w:p>
+            <w:pPr>
+              <w:cnfStyle w:val="000000000000" w:firstRow="0" w:lastRow="0" w:firstColumn="0" w:lastColumn="0" w:oddVBand="0" w:evenVBand="0" w:oddHBand="0" w:evenHBand="0" w:firstRowFirstColumn="0" w:firstRowLastColumn="0" w:lastRowFirstColumn="0" w:lastRowLastColumn="0"/>
+            </w:pPr>
             <w:r>
               <w:t xml:space="preserve">Tangible Needs </w:t>
             </w:r>
@@ -772,6 +949,9 @@
             <w:tcW w:w="6015" w:type="dxa"/>
           </w:tcPr>
           <w:p>
+            <w:pPr>
+              <w:cnfStyle w:val="000000000000" w:firstRow="0" w:lastRow="0" w:firstColumn="0" w:lastColumn="0" w:oddVBand="0" w:evenVBand="0" w:oddHBand="0" w:evenHBand="0" w:firstRowFirstColumn="0" w:firstRowLastColumn="0" w:lastRowFirstColumn="0" w:lastRowLastColumn="0"/>
+            </w:pPr>
             <w:r>
               <w:t>Display confirmation that RSVP was submitted</w:t>
             </w:r>
@@ -782,7 +962,7 @@
     <w:p/>
     <w:tbl>
       <w:tblPr>
-        <w:tblStyle w:val="TableGrid"/>
+        <w:tblStyle w:val="GridTable4-Accent3"/>
         <w:tblW w:w="0" w:type="auto"/>
         <w:tblLook w:val="04A0" w:firstRow="1" w:lastRow="0" w:firstColumn="1" w:lastColumn="0" w:noHBand="0" w:noVBand="1"/>
       </w:tblPr>
@@ -793,10 +973,12 @@
       </w:tblGrid>
       <w:tr>
         <w:trPr>
+          <w:cnfStyle w:val="100000000000" w:firstRow="1" w:lastRow="0" w:firstColumn="0" w:lastColumn="0" w:oddVBand="0" w:evenVBand="0" w:oddHBand="0" w:evenHBand="0" w:firstRowFirstColumn="0" w:firstRowLastColumn="0" w:lastRowFirstColumn="0" w:lastRowLastColumn="0"/>
           <w:trHeight w:val="288"/>
         </w:trPr>
         <w:tc>
           <w:tcPr>
+            <w:cnfStyle w:val="001000000000" w:firstRow="0" w:lastRow="0" w:firstColumn="1" w:lastColumn="0" w:oddVBand="0" w:evenVBand="0" w:oddHBand="0" w:evenHBand="0" w:firstRowFirstColumn="0" w:firstRowLastColumn="0" w:lastRowFirstColumn="0" w:lastRowLastColumn="0"/>
             <w:tcW w:w="1020" w:type="dxa"/>
           </w:tcPr>
           <w:p>
@@ -810,6 +992,9 @@
             <w:tcW w:w="2125" w:type="dxa"/>
           </w:tcPr>
           <w:p>
+            <w:pPr>
+              <w:cnfStyle w:val="100000000000" w:firstRow="1" w:lastRow="0" w:firstColumn="0" w:lastColumn="0" w:oddVBand="0" w:evenVBand="0" w:oddHBand="0" w:evenHBand="0" w:firstRowFirstColumn="0" w:firstRowLastColumn="0" w:lastRowFirstColumn="0" w:lastRowLastColumn="0"/>
+            </w:pPr>
             <w:r>
               <w:t>Label</w:t>
             </w:r>
@@ -820,6 +1005,9 @@
             <w:tcW w:w="6015" w:type="dxa"/>
           </w:tcPr>
           <w:p>
+            <w:pPr>
+              <w:cnfStyle w:val="100000000000" w:firstRow="1" w:lastRow="0" w:firstColumn="0" w:lastColumn="0" w:oddVBand="0" w:evenVBand="0" w:oddHBand="0" w:evenHBand="0" w:firstRowFirstColumn="0" w:firstRowLastColumn="0" w:lastRowFirstColumn="0" w:lastRowLastColumn="0"/>
+            </w:pPr>
             <w:r>
               <w:t>Info</w:t>
             </w:r>
@@ -828,10 +1016,12 @@
       </w:tr>
       <w:tr>
         <w:trPr>
+          <w:cnfStyle w:val="000000100000" w:firstRow="0" w:lastRow="0" w:firstColumn="0" w:lastColumn="0" w:oddVBand="0" w:evenVBand="0" w:oddHBand="1" w:evenHBand="0" w:firstRowFirstColumn="0" w:firstRowLastColumn="0" w:lastRowFirstColumn="0" w:lastRowLastColumn="0"/>
           <w:trHeight w:val="299"/>
         </w:trPr>
         <w:tc>
           <w:tcPr>
+            <w:cnfStyle w:val="001000000000" w:firstRow="0" w:lastRow="0" w:firstColumn="1" w:lastColumn="0" w:oddVBand="0" w:evenVBand="0" w:oddHBand="0" w:evenHBand="0" w:firstRowFirstColumn="0" w:firstRowLastColumn="0" w:lastRowFirstColumn="0" w:lastRowLastColumn="0"/>
             <w:tcW w:w="1020" w:type="dxa"/>
           </w:tcPr>
           <w:p>
@@ -845,6 +1035,9 @@
             <w:tcW w:w="2125" w:type="dxa"/>
           </w:tcPr>
           <w:p>
+            <w:pPr>
+              <w:cnfStyle w:val="000000100000" w:firstRow="0" w:lastRow="0" w:firstColumn="0" w:lastColumn="0" w:oddVBand="0" w:evenVBand="0" w:oddHBand="1" w:evenHBand="0" w:firstRowFirstColumn="0" w:firstRowLastColumn="0" w:lastRowFirstColumn="0" w:lastRowLastColumn="0"/>
+            </w:pPr>
             <w:r>
               <w:t>User Story</w:t>
             </w:r>
@@ -855,6 +1048,9 @@
             <w:tcW w:w="6015" w:type="dxa"/>
           </w:tcPr>
           <w:p>
+            <w:pPr>
+              <w:cnfStyle w:val="000000100000" w:firstRow="0" w:lastRow="0" w:firstColumn="0" w:lastColumn="0" w:oddVBand="0" w:evenVBand="0" w:oddHBand="1" w:evenHBand="0" w:firstRowFirstColumn="0" w:firstRowLastColumn="0" w:lastRowFirstColumn="0" w:lastRowLastColumn="0"/>
+            </w:pPr>
             <w:r>
               <w:t>As a wedding guest, I want to select</w:t>
             </w:r>
@@ -873,6 +1069,7 @@
         </w:trPr>
         <w:tc>
           <w:tcPr>
+            <w:cnfStyle w:val="001000000000" w:firstRow="0" w:lastRow="0" w:firstColumn="1" w:lastColumn="0" w:oddVBand="0" w:evenVBand="0" w:oddHBand="0" w:evenHBand="0" w:firstRowFirstColumn="0" w:firstRowLastColumn="0" w:lastRowFirstColumn="0" w:lastRowLastColumn="0"/>
             <w:tcW w:w="1020" w:type="dxa"/>
           </w:tcPr>
           <w:p>
@@ -886,6 +1083,9 @@
             <w:tcW w:w="2125" w:type="dxa"/>
           </w:tcPr>
           <w:p>
+            <w:pPr>
+              <w:cnfStyle w:val="000000000000" w:firstRow="0" w:lastRow="0" w:firstColumn="0" w:lastColumn="0" w:oddVBand="0" w:evenVBand="0" w:oddHBand="0" w:evenHBand="0" w:firstRowFirstColumn="0" w:firstRowLastColumn="0" w:lastRowFirstColumn="0" w:lastRowLastColumn="0"/>
+            </w:pPr>
             <w:r>
               <w:t xml:space="preserve">Tangible Needs </w:t>
             </w:r>
@@ -896,6 +1096,9 @@
             <w:tcW w:w="6015" w:type="dxa"/>
           </w:tcPr>
           <w:p>
+            <w:pPr>
+              <w:cnfStyle w:val="000000000000" w:firstRow="0" w:lastRow="0" w:firstColumn="0" w:lastColumn="0" w:oddVBand="0" w:evenVBand="0" w:oddHBand="0" w:evenHBand="0" w:firstRowFirstColumn="0" w:firstRowLastColumn="0" w:lastRowFirstColumn="0" w:lastRowLastColumn="0"/>
+            </w:pPr>
             <w:r>
               <w:t>Selecting this box automatically unchecks all individual guests’ boxes</w:t>
             </w:r>
@@ -904,14 +1107,17 @@
       </w:tr>
       <w:tr>
         <w:trPr>
+          <w:cnfStyle w:val="000000100000" w:firstRow="0" w:lastRow="0" w:firstColumn="0" w:lastColumn="0" w:oddVBand="0" w:evenVBand="0" w:oddHBand="1" w:evenHBand="0" w:firstRowFirstColumn="0" w:firstRowLastColumn="0" w:lastRowFirstColumn="0" w:lastRowLastColumn="0"/>
           <w:trHeight w:val="288"/>
         </w:trPr>
         <w:tc>
           <w:tcPr>
+            <w:cnfStyle w:val="001000000000" w:firstRow="0" w:lastRow="0" w:firstColumn="1" w:lastColumn="0" w:oddVBand="0" w:evenVBand="0" w:oddHBand="0" w:evenHBand="0" w:firstRowFirstColumn="0" w:firstRowLastColumn="0" w:lastRowFirstColumn="0" w:lastRowLastColumn="0"/>
             <w:tcW w:w="1020" w:type="dxa"/>
           </w:tcPr>
           <w:p>
             <w:r>
+              <w:lastRenderedPageBreak/>
               <w:t>P4-2</w:t>
             </w:r>
           </w:p>
@@ -921,6 +1127,9 @@
             <w:tcW w:w="2125" w:type="dxa"/>
           </w:tcPr>
           <w:p>
+            <w:pPr>
+              <w:cnfStyle w:val="000000100000" w:firstRow="0" w:lastRow="0" w:firstColumn="0" w:lastColumn="0" w:oddVBand="0" w:evenVBand="0" w:oddHBand="1" w:evenHBand="0" w:firstRowFirstColumn="0" w:firstRowLastColumn="0" w:lastRowFirstColumn="0" w:lastRowLastColumn="0"/>
+            </w:pPr>
             <w:r>
               <w:t xml:space="preserve">Tangible Needs </w:t>
             </w:r>
@@ -931,6 +1140,9 @@
             <w:tcW w:w="6015" w:type="dxa"/>
           </w:tcPr>
           <w:p>
+            <w:pPr>
+              <w:cnfStyle w:val="000000100000" w:firstRow="0" w:lastRow="0" w:firstColumn="0" w:lastColumn="0" w:oddVBand="0" w:evenVBand="0" w:oddHBand="1" w:evenHBand="0" w:firstRowFirstColumn="0" w:firstRowLastColumn="0" w:lastRowFirstColumn="0" w:lastRowLastColumn="0"/>
+            </w:pPr>
             <w:r>
               <w:t>Disable individual guest checkboxes while this box is selected</w:t>
             </w:r>
@@ -943,6 +1155,7 @@
         </w:trPr>
         <w:tc>
           <w:tcPr>
+            <w:cnfStyle w:val="001000000000" w:firstRow="0" w:lastRow="0" w:firstColumn="1" w:lastColumn="0" w:oddVBand="0" w:evenVBand="0" w:oddHBand="0" w:evenHBand="0" w:firstRowFirstColumn="0" w:firstRowLastColumn="0" w:lastRowFirstColumn="0" w:lastRowLastColumn="0"/>
             <w:tcW w:w="1020" w:type="dxa"/>
           </w:tcPr>
           <w:p>
@@ -956,6 +1169,9 @@
             <w:tcW w:w="2125" w:type="dxa"/>
           </w:tcPr>
           <w:p>
+            <w:pPr>
+              <w:cnfStyle w:val="000000000000" w:firstRow="0" w:lastRow="0" w:firstColumn="0" w:lastColumn="0" w:oddVBand="0" w:evenVBand="0" w:oddHBand="0" w:evenHBand="0" w:firstRowFirstColumn="0" w:firstRowLastColumn="0" w:lastRowFirstColumn="0" w:lastRowLastColumn="0"/>
+            </w:pPr>
             <w:r>
               <w:t xml:space="preserve">Tangible Needs </w:t>
             </w:r>
@@ -966,6 +1182,9 @@
             <w:tcW w:w="6015" w:type="dxa"/>
           </w:tcPr>
           <w:p>
+            <w:pPr>
+              <w:cnfStyle w:val="000000000000" w:firstRow="0" w:lastRow="0" w:firstColumn="0" w:lastColumn="0" w:oddVBand="0" w:evenVBand="0" w:oddHBand="0" w:evenHBand="0" w:firstRowFirstColumn="0" w:firstRowLastColumn="0" w:lastRowFirstColumn="0" w:lastRowLastColumn="0"/>
+            </w:pPr>
             <w:r>
               <w:t xml:space="preserve">Enable individual guest checkboxes when this box is unchecked </w:t>
             </w:r>
@@ -974,15 +1193,16 @@
       </w:tr>
       <w:tr>
         <w:trPr>
+          <w:cnfStyle w:val="000000100000" w:firstRow="0" w:lastRow="0" w:firstColumn="0" w:lastColumn="0" w:oddVBand="0" w:evenVBand="0" w:oddHBand="1" w:evenHBand="0" w:firstRowFirstColumn="0" w:firstRowLastColumn="0" w:lastRowFirstColumn="0" w:lastRowLastColumn="0"/>
           <w:trHeight w:val="288"/>
         </w:trPr>
         <w:tc>
           <w:tcPr>
+            <w:cnfStyle w:val="001000000000" w:firstRow="0" w:lastRow="0" w:firstColumn="1" w:lastColumn="0" w:oddVBand="0" w:evenVBand="0" w:oddHBand="0" w:evenHBand="0" w:firstRowFirstColumn="0" w:firstRowLastColumn="0" w:lastRowFirstColumn="0" w:lastRowLastColumn="0"/>
             <w:tcW w:w="1020" w:type="dxa"/>
           </w:tcPr>
           <w:p>
             <w:r>
-              <w:lastRenderedPageBreak/>
               <w:t>P4-4</w:t>
             </w:r>
           </w:p>
@@ -992,6 +1212,9 @@
             <w:tcW w:w="2125" w:type="dxa"/>
           </w:tcPr>
           <w:p>
+            <w:pPr>
+              <w:cnfStyle w:val="000000100000" w:firstRow="0" w:lastRow="0" w:firstColumn="0" w:lastColumn="0" w:oddVBand="0" w:evenVBand="0" w:oddHBand="1" w:evenHBand="0" w:firstRowFirstColumn="0" w:firstRowLastColumn="0" w:lastRowFirstColumn="0" w:lastRowLastColumn="0"/>
+            </w:pPr>
             <w:r>
               <w:t xml:space="preserve">Tangible Needs </w:t>
             </w:r>
@@ -1002,6 +1225,9 @@
             <w:tcW w:w="6015" w:type="dxa"/>
           </w:tcPr>
           <w:p>
+            <w:pPr>
+              <w:cnfStyle w:val="000000100000" w:firstRow="0" w:lastRow="0" w:firstColumn="0" w:lastColumn="0" w:oddVBand="0" w:evenVBand="0" w:oddHBand="1" w:evenHBand="0" w:firstRowFirstColumn="0" w:firstRowLastColumn="0" w:lastRowFirstColumn="0" w:lastRowLastColumn="0"/>
+            </w:pPr>
             <w:r>
               <w:t xml:space="preserve">Save all </w:t>
             </w:r>
@@ -1020,6 +1246,7 @@
         </w:trPr>
         <w:tc>
           <w:tcPr>
+            <w:cnfStyle w:val="001000000000" w:firstRow="0" w:lastRow="0" w:firstColumn="1" w:lastColumn="0" w:oddVBand="0" w:evenVBand="0" w:oddHBand="0" w:evenHBand="0" w:firstRowFirstColumn="0" w:firstRowLastColumn="0" w:lastRowFirstColumn="0" w:lastRowLastColumn="0"/>
             <w:tcW w:w="1020" w:type="dxa"/>
           </w:tcPr>
           <w:p>
@@ -1033,6 +1260,9 @@
             <w:tcW w:w="2125" w:type="dxa"/>
           </w:tcPr>
           <w:p>
+            <w:pPr>
+              <w:cnfStyle w:val="000000000000" w:firstRow="0" w:lastRow="0" w:firstColumn="0" w:lastColumn="0" w:oddVBand="0" w:evenVBand="0" w:oddHBand="0" w:evenHBand="0" w:firstRowFirstColumn="0" w:firstRowLastColumn="0" w:lastRowFirstColumn="0" w:lastRowLastColumn="0"/>
+            </w:pPr>
             <w:r>
               <w:t xml:space="preserve">Tangible Needs </w:t>
             </w:r>
@@ -1043,6 +1273,9 @@
             <w:tcW w:w="6015" w:type="dxa"/>
           </w:tcPr>
           <w:p>
+            <w:pPr>
+              <w:cnfStyle w:val="000000000000" w:firstRow="0" w:lastRow="0" w:firstColumn="0" w:lastColumn="0" w:oddVBand="0" w:evenVBand="0" w:oddHBand="0" w:evenHBand="0" w:firstRowFirstColumn="0" w:firstRowLastColumn="0" w:lastRowFirstColumn="0" w:lastRowLastColumn="0"/>
+            </w:pPr>
             <w:r>
               <w:t xml:space="preserve">Return user to dashboard after submission. </w:t>
             </w:r>
@@ -1766,6 +1999,7 @@
           </w:tcPr>
           <w:p>
             <w:r>
+              <w:lastRenderedPageBreak/>
               <w:t>P7-1</w:t>
             </w:r>
           </w:p>
@@ -1877,7 +2111,6 @@
           </w:tcPr>
           <w:p>
             <w:r>
-              <w:lastRenderedPageBreak/>
               <w:t>P7-4</w:t>
             </w:r>
           </w:p>
@@ -2676,6 +2909,7 @@
           </w:tcPr>
           <w:p>
             <w:r>
+              <w:lastRenderedPageBreak/>
               <w:t>P</w:t>
             </w:r>
             <w:r>
@@ -2802,7 +3036,6 @@
           </w:tcPr>
           <w:p>
             <w:r>
-              <w:lastRenderedPageBreak/>
               <w:t>P</w:t>
             </w:r>
             <w:r>
@@ -4643,6 +4876,7 @@
           </w:tcPr>
           <w:p>
             <w:r>
+              <w:lastRenderedPageBreak/>
               <w:t>S1-17</w:t>
             </w:r>
           </w:p>
@@ -4703,7 +4937,6 @@
           </w:tcPr>
           <w:p>
             <w:r>
-              <w:lastRenderedPageBreak/>
               <w:t>S1-18</w:t>
             </w:r>
           </w:p>
@@ -5499,6 +5732,7 @@
           </w:tcPr>
           <w:p>
             <w:r>
+              <w:lastRenderedPageBreak/>
               <w:t>S2-10</w:t>
             </w:r>
           </w:p>
@@ -5560,7 +5794,6 @@
           </w:tcPr>
           <w:p>
             <w:r>
-              <w:lastRenderedPageBreak/>
               <w:t>S2-11</w:t>
             </w:r>
           </w:p>
@@ -6113,9 +6346,61 @@
     <w:p>
       <w:pPr>
         <w:rPr>
+          <w:b/>
+          <w:bCs/>
+          <w:i/>
+          <w:iCs/>
+          <w:u w:val="single"/>
           <w:lang w:eastAsia="en-US"/>
         </w:rPr>
       </w:pPr>
+      <w:r>
+        <w:rPr>
+          <w:b/>
+          <w:bCs/>
+          <w:i/>
+          <w:iCs/>
+          <w:highlight w:val="cyan"/>
+          <w:u w:val="single"/>
+          <w:lang w:eastAsia="en-US"/>
+        </w:rPr>
+        <w:t xml:space="preserve">FUTURE DATE STORY </w:t>
+      </w:r>
+      <w:r>
+        <w:rPr>
+          <w:b/>
+          <w:bCs/>
+          <w:i/>
+          <w:iCs/>
+          <w:highlight w:val="cyan"/>
+          <w:u w:val="single"/>
+          <w:lang w:eastAsia="en-US"/>
+        </w:rPr>
+        <w:t>Wants</w:t>
+      </w:r>
+      <w:r>
+        <w:rPr>
+          <w:b/>
+          <w:bCs/>
+          <w:i/>
+          <w:iCs/>
+          <w:highlight w:val="cyan"/>
+          <w:u w:val="single"/>
+          <w:lang w:eastAsia="en-US"/>
+        </w:rPr>
+        <w:t xml:space="preserve"> not associated with semester project.</w:t>
+      </w:r>
+      <w:r>
+        <w:rPr>
+          <w:b/>
+          <w:bCs/>
+          <w:i/>
+          <w:iCs/>
+          <w:u w:val="single"/>
+          <w:lang w:eastAsia="en-US"/>
+        </w:rPr>
+        <w:t xml:space="preserve"> </w:t>
+      </w:r>
     </w:p>
     <w:tbl>
       <w:tblPr>
@@ -8004,6 +8289,215 @@
       </w:tblBorders>
     </w:tblPr>
   </w:style>
+  <w:style w:type="table" w:styleId="GridTable1Light-Accent3">
+    <w:name w:val="Grid Table 1 Light Accent 3"/>
+    <w:basedOn w:val="TableNormal"/>
+    <w:uiPriority w:val="46"/>
+    <w:rsid w:val="0020396A"/>
+    <w:pPr>
+      <w:spacing w:after="0" w:line="240" w:lineRule="auto"/>
+    </w:pPr>
+    <w:tblPr>
+      <w:tblStyleRowBandSize w:val="1"/>
+      <w:tblStyleColBandSize w:val="1"/>
+      <w:tblBorders>
+        <w:top w:val="single" w:sz="4" w:space="0" w:color="84E290" w:themeColor="accent3" w:themeTint="66"/>
+        <w:left w:val="single" w:sz="4" w:space="0" w:color="84E290" w:themeColor="accent3" w:themeTint="66"/>
+        <w:bottom w:val="single" w:sz="4" w:space="0" w:color="84E290" w:themeColor="accent3" w:themeTint="66"/>
+        <w:right w:val="single" w:sz="4" w:space="0" w:color="84E290" w:themeColor="accent3" w:themeTint="66"/>
+        <w:insideH w:val="single" w:sz="4" w:space="0" w:color="84E290" w:themeColor="accent3" w:themeTint="66"/>
+        <w:insideV w:val="single" w:sz="4" w:space="0" w:color="84E290" w:themeColor="accent3" w:themeTint="66"/>
+      </w:tblBorders>
+    </w:tblPr>
+    <w:tblStylePr w:type="firstRow">
+      <w:rPr>
+        <w:b/>
+        <w:bCs/>
+      </w:rPr>
+      <w:tblPr/>
+      <w:tcPr>
+        <w:tcBorders>
+          <w:bottom w:val="single" w:sz="12" w:space="0" w:color="47D459" w:themeColor="accent3" w:themeTint="99"/>
+        </w:tcBorders>
+      </w:tcPr>
+    </w:tblStylePr>
+    <w:tblStylePr w:type="lastRow">
+      <w:rPr>
+        <w:b/>
+        <w:bCs/>
+      </w:rPr>
+      <w:tblPr/>
+      <w:tcPr>
+        <w:tcBorders>
+          <w:top w:val="double" w:sz="2" w:space="0" w:color="47D459" w:themeColor="accent3" w:themeTint="99"/>
+        </w:tcBorders>
+      </w:tcPr>
+    </w:tblStylePr>
+    <w:tblStylePr w:type="firstCol">
+      <w:rPr>
+        <w:b/>
+        <w:bCs/>
+      </w:rPr>
+    </w:tblStylePr>
+    <w:tblStylePr w:type="lastCol">
+      <w:rPr>
+        <w:b/>
+        <w:bCs/>
+      </w:rPr>
+    </w:tblStylePr>
+  </w:style>
+  <w:style w:type="table" w:styleId="GridTable4-Accent3">
+    <w:name w:val="Grid Table 4 Accent 3"/>
+    <w:basedOn w:val="TableNormal"/>
+    <w:uiPriority w:val="49"/>
+    <w:rsid w:val="0020396A"/>
+    <w:pPr>
+      <w:spacing w:after="0" w:line="240" w:lineRule="auto"/>
+    </w:pPr>
+    <w:tblPr>
+      <w:tblStyleRowBandSize w:val="1"/>
+      <w:tblStyleColBandSize w:val="1"/>
+      <w:tblBorders>
+        <w:top w:val="single" w:sz="4" w:space="0" w:color="47D459" w:themeColor="accent3" w:themeTint="99"/>
+        <w:left w:val="single" w:sz="4" w:space="0" w:color="47D459" w:themeColor="accent3" w:themeTint="99"/>
+        <w:bottom w:val="single" w:sz="4" w:space="0" w:color="47D459" w:themeColor="accent3" w:themeTint="99"/>
+        <w:right w:val="single" w:sz="4" w:space="0" w:color="47D459" w:themeColor="accent3" w:themeTint="99"/>
+        <w:insideH w:val="single" w:sz="4" w:space="0" w:color="47D459" w:themeColor="accent3" w:themeTint="99"/>
+        <w:insideV w:val="single" w:sz="4" w:space="0" w:color="47D459" w:themeColor="accent3" w:themeTint="99"/>
+      </w:tblBorders>
+    </w:tblPr>
+    <w:tblStylePr w:type="firstRow">
+      <w:rPr>
+        <w:b/>
+        <w:bCs/>
+        <w:color w:val="FFFFFF" w:themeColor="background1"/>
+      </w:rPr>
+      <w:tblPr/>
+      <w:tcPr>
+        <w:tcBorders>
+          <w:top w:val="single" w:sz="4" w:space="0" w:color="196B24" w:themeColor="accent3"/>
+          <w:left w:val="single" w:sz="4" w:space="0" w:color="196B24" w:themeColor="accent3"/>
+          <w:bottom w:val="single" w:sz="4" w:space="0" w:color="196B24" w:themeColor="accent3"/>
+          <w:right w:val="single" w:sz="4" w:space="0" w:color="196B24" w:themeColor="accent3"/>
+          <w:insideH w:val="nil"/>
+          <w:insideV w:val="nil"/>
+        </w:tcBorders>
+        <w:shd w:val="clear" w:color="auto" w:fill="196B24" w:themeFill="accent3"/>
+      </w:tcPr>
+    </w:tblStylePr>
+    <w:tblStylePr w:type="lastRow">
+      <w:rPr>
+        <w:b/>
+        <w:bCs/>
+      </w:rPr>
+      <w:tblPr/>
+      <w:tcPr>
+        <w:tcBorders>
+          <w:top w:val="double" w:sz="4" w:space="0" w:color="196B24" w:themeColor="accent3"/>
+        </w:tcBorders>
+      </w:tcPr>
+    </w:tblStylePr>
+    <w:tblStylePr w:type="firstCol">
+      <w:rPr>
+        <w:b/>
+        <w:bCs/>
+      </w:rPr>
+    </w:tblStylePr>
+    <w:tblStylePr w:type="lastCol">
+      <w:rPr>
+        <w:b/>
+        <w:bCs/>
+      </w:rPr>
+    </w:tblStylePr>
+    <w:tblStylePr w:type="band1Vert">
+      <w:tblPr/>
+      <w:tcPr>
+        <w:shd w:val="clear" w:color="auto" w:fill="C1F0C7" w:themeFill="accent3" w:themeFillTint="33"/>
+      </w:tcPr>
+    </w:tblStylePr>
+    <w:tblStylePr w:type="band1Horz">
+      <w:tblPr/>
+      <w:tcPr>
+        <w:shd w:val="clear" w:color="auto" w:fill="C1F0C7" w:themeFill="accent3" w:themeFillTint="33"/>
+      </w:tcPr>
+    </w:tblStylePr>
+  </w:style>
+  <w:style w:type="table" w:styleId="GridTable4-Accent6">
+    <w:name w:val="Grid Table 4 Accent 6"/>
+    <w:basedOn w:val="TableNormal"/>
+    <w:uiPriority w:val="49"/>
+    <w:rsid w:val="0020396A"/>
+    <w:pPr>
+      <w:spacing w:after="0" w:line="240" w:lineRule="auto"/>
+    </w:pPr>
+    <w:tblPr>
+      <w:tblStyleRowBandSize w:val="1"/>
+      <w:tblStyleColBandSize w:val="1"/>
+      <w:tblBorders>
+        <w:top w:val="single" w:sz="4" w:space="0" w:color="8DD873" w:themeColor="accent6" w:themeTint="99"/>
+        <w:left w:val="single" w:sz="4" w:space="0" w:color="8DD873" w:themeColor="accent6" w:themeTint="99"/>
+        <w:bottom w:val="single" w:sz="4" w:space="0" w:color="8DD873" w:themeColor="accent6" w:themeTint="99"/>
+        <w:right w:val="single" w:sz="4" w:space="0" w:color="8DD873" w:themeColor="accent6" w:themeTint="99"/>
+        <w:insideH w:val="single" w:sz="4" w:space="0" w:color="8DD873" w:themeColor="accent6" w:themeTint="99"/>
+        <w:insideV w:val="single" w:sz="4" w:space="0" w:color="8DD873" w:themeColor="accent6" w:themeTint="99"/>
+      </w:tblBorders>
+    </w:tblPr>
+    <w:tblStylePr w:type="firstRow">
+      <w:rPr>
+        <w:b/>
+        <w:bCs/>
+        <w:color w:val="FFFFFF" w:themeColor="background1"/>
+      </w:rPr>
+      <w:tblPr/>
+      <w:tcPr>
+        <w:tcBorders>
+          <w:top w:val="single" w:sz="4" w:space="0" w:color="4EA72E" w:themeColor="accent6"/>
+          <w:left w:val="single" w:sz="4" w:space="0" w:color="4EA72E" w:themeColor="accent6"/>
+          <w:bottom w:val="single" w:sz="4" w:space="0" w:color="4EA72E" w:themeColor="accent6"/>
+          <w:right w:val="single" w:sz="4" w:space="0" w:color="4EA72E" w:themeColor="accent6"/>
+          <w:insideH w:val="nil"/>
+          <w:insideV w:val="nil"/>
+        </w:tcBorders>
+        <w:shd w:val="clear" w:color="auto" w:fill="4EA72E" w:themeFill="accent6"/>
+      </w:tcPr>
+    </w:tblStylePr>
+    <w:tblStylePr w:type="lastRow">
+      <w:rPr>
+        <w:b/>
+        <w:bCs/>
+      </w:rPr>
+      <w:tblPr/>
+      <w:tcPr>
+        <w:tcBorders>
+          <w:top w:val="double" w:sz="4" w:space="0" w:color="4EA72E" w:themeColor="accent6"/>
+        </w:tcBorders>
+      </w:tcPr>
+    </w:tblStylePr>
+    <w:tblStylePr w:type="firstCol">
+      <w:rPr>
+        <w:b/>
+        <w:bCs/>
+      </w:rPr>
+    </w:tblStylePr>
+    <w:tblStylePr w:type="lastCol">
+      <w:rPr>
+        <w:b/>
+        <w:bCs/>
+      </w:rPr>
+    </w:tblStylePr>
+    <w:tblStylePr w:type="band1Vert">
+      <w:tblPr/>
+      <w:tcPr>
+        <w:shd w:val="clear" w:color="auto" w:fill="D9F2D0" w:themeFill="accent6" w:themeFillTint="33"/>
+      </w:tcPr>
+    </w:tblStylePr>
+    <w:tblStylePr w:type="band1Horz">
+      <w:tblPr/>
+      <w:tcPr>
+        <w:shd w:val="clear" w:color="auto" w:fill="D9F2D0" w:themeFill="accent6" w:themeFillTint="33"/>
+      </w:tcPr>
+    </w:tblStylePr>
+  </w:style>
 </w:styles>
 </file>
 

</xml_diff>